<commit_message>
Deploying to gh-pages from @ Morrison-Lab/sds@d20f20c4cb3c3d15b2d2dd009e4c18852e1fd22f 🚀
</commit_message>
<xml_diff>
--- a/basic-statistical-methods-handout.docx
+++ b/basic-statistical-methods-handout.docx
@@ -15,7 +15,7 @@
         <w:pStyle w:val="Date"/>
       </w:pPr>
       <w:r>
-        <w:t xml:space="preserve">Last modified: 2026-09-28 03:12:35 (PDT)</w:t>
+        <w:t xml:space="preserve">Last modified: 2026-09-28 03:39:25 (PDT)</w:t>
       </w:r>
     </w:p>
     <w:bookmarkStart w:id="13" w:name="introduction"/>
@@ -4846,7 +4846,7 @@
         <w:t xml:space="preserve"> </w:t>
       </w:r>
       <w:r>
-        <w:t xml:space="preserve">(Hogg et al. 2015)</w:t>
+        <w:t xml:space="preserve">(Hogg et al. 2019, sec. 5.5, pp. 203-205)</w:t>
       </w:r>
       <w:r>
         <w:t xml:space="preserve">:</w:t>
@@ -11433,7 +11433,7 @@
         <w:t xml:space="preserve"> </w:t>
       </w:r>
       <w:r>
-        <w:t xml:space="preserve">(Hogg et al. 2015)</w:t>
+        <w:t xml:space="preserve">(Hogg et al. 2019, sec. 8.2, p. 371)</w:t>
       </w:r>
       <w:r>
         <w:t xml:space="preserve">.</w:t>
@@ -15390,7 +15390,7 @@
         <w:t xml:space="preserve"> </w:t>
       </w:r>
       <w:r>
-        <w:t xml:space="preserve">(Hogg et al. 2015)</w:t>
+        <w:t xml:space="preserve">(Hogg et al. 2019, sec. 9.3, p. 449)</w:t>
       </w:r>
       <w:r>
         <w:t xml:space="preserve">.</w:t>
@@ -17302,7 +17302,7 @@
         <w:pStyle w:val="Bibliography"/>
       </w:pPr>
       <w:r>
-        <w:t xml:space="preserve">Hogg, Robert V., Elliot A. Tanis, and Dale L. Zimmerman. 2015.</w:t>
+        <w:t xml:space="preserve">Hogg, Robert V., Elliot A. Tanis, and Dale L. Zimmerman. 2019.</w:t>
       </w:r>
       <w:r>
         <w:t xml:space="preserve"> </w:t>
@@ -17315,7 +17315,7 @@
         <w:t xml:space="preserve">Probability and Statistical Inference</w:t>
       </w:r>
       <w:r>
-        <w:t xml:space="preserve">. Ninth edition. Pearson.</w:t>
+        <w:t xml:space="preserve">. Tenth edition. Pearson.</w:t>
       </w:r>
     </w:p>
     <w:bookmarkEnd w:id="71"/>

</xml_diff>

<commit_message>
Deploying to gh-pages from @ Morrison-Lab/sds@29e842754281ff169c6f7c260a4699bf630f3916 🚀
</commit_message>
<xml_diff>
--- a/basic-statistical-methods-handout.docx
+++ b/basic-statistical-methods-handout.docx
@@ -15,7 +15,7 @@
         <w:pStyle w:val="Date"/>
       </w:pPr>
       <w:r>
-        <w:t xml:space="preserve">Last modified: 2026-09-28 23:02:22 (PDT)</w:t>
+        <w:t xml:space="preserve">Last modified: 2026-09-28 23:59:25 (PDT)</w:t>
       </w:r>
     </w:p>
     <w:bookmarkStart w:id="13" w:name="introduction"/>
@@ -5918,9 +5918,6 @@
         <w:t xml:space="preserve"> </w:t>
       </w:r>
       <w:r>
-        <w:t xml:space="preserve"> </w:t>
-      </w:r>
-      <w:r>
         <w:t xml:space="preserve">by the</w:t>
       </w:r>
       <w:r>

</xml_diff>

<commit_message>
Deploying to gh-pages from @ Morrison-Lab/sds@96ccd74f4107fa40c7d7312d471e2b9217bfd800 🚀
</commit_message>
<xml_diff>
--- a/basic-statistical-methods-handout.docx
+++ b/basic-statistical-methods-handout.docx
@@ -15,7 +15,7 @@
         <w:pStyle w:val="Date"/>
       </w:pPr>
       <w:r>
-        <w:t xml:space="preserve">Last modified: 2026-10-05 02:17:22 (PDT)</w:t>
+        <w:t xml:space="preserve">Last modified: 2026-10-05 16:04:28 (PDT)</w:t>
       </w:r>
     </w:p>
     <w:bookmarkStart w:id="13" w:name="introduction"/>
@@ -536,6 +536,174 @@
           <w:rStyle w:val="NormalTok"/>
         </w:rPr>
         <w:t xml:space="preserve">()</w:t>
+      </w:r>
+      <w:r>
+        <w:br/>
+      </w:r>
+      <w:r>
+        <w:rPr>
+          <w:rStyle w:val="NormalTok"/>
+        </w:rPr>
+        <w:t xml:space="preserve">hers </w:t>
+      </w:r>
+      <w:r>
+        <w:rPr>
+          <w:rStyle w:val="SpecialCharTok"/>
+        </w:rPr>
+        <w:t xml:space="preserve">|&gt;</w:t>
+      </w:r>
+      <w:r>
+        <w:rPr>
+          <w:rStyle w:val="NormalTok"/>
+        </w:rPr>
+        <w:t xml:space="preserve"> </w:t>
+      </w:r>
+      <w:r>
+        <w:rPr>
+          <w:rStyle w:val="FunctionTok"/>
+        </w:rPr>
+        <w:t xml:space="preserve">head</w:t>
+      </w:r>
+      <w:r>
+        <w:rPr>
+          <w:rStyle w:val="NormalTok"/>
+        </w:rPr>
+        <w:t xml:space="preserve">()</w:t>
+      </w:r>
+      <w:r>
+        <w:br/>
+      </w:r>
+      <w:r>
+        <w:rPr>
+          <w:rStyle w:val="CommentTok"/>
+        </w:rPr>
+        <w:t xml:space="preserve">#&gt; # A tibble: 6 × 37</w:t>
+      </w:r>
+      <w:r>
+        <w:br/>
+      </w:r>
+      <w:r>
+        <w:rPr>
+          <w:rStyle w:val="CommentTok"/>
+        </w:rPr>
+        <w:t xml:space="preserve">#&gt;   HT      age raceth nonwhite smoking drinkany exercise physact globrat poorfair</w:t>
+      </w:r>
+      <w:r>
+        <w:br/>
+      </w:r>
+      <w:r>
+        <w:rPr>
+          <w:rStyle w:val="CommentTok"/>
+        </w:rPr>
+        <w:t xml:space="preserve">#&gt;   &lt;fct&gt; &lt;dbl&gt; &lt;fct&gt;  &lt;fct&gt;    &lt;fct&gt;   &lt;fct&gt;    &lt;fct&gt;    &lt;fct&gt;   &lt;fct&gt;   &lt;fct&gt;   </w:t>
+      </w:r>
+      <w:r>
+        <w:br/>
+      </w:r>
+      <w:r>
+        <w:rPr>
+          <w:rStyle w:val="CommentTok"/>
+        </w:rPr>
+        <w:t xml:space="preserve">#&gt; 1 plac…    70 Afric… yes      no      no       no       much m… good    no      </w:t>
+      </w:r>
+      <w:r>
+        <w:br/>
+      </w:r>
+      <w:r>
+        <w:rPr>
+          <w:rStyle w:val="CommentTok"/>
+        </w:rPr>
+        <w:t xml:space="preserve">#&gt; 2 plac…    62 Afric… yes      no      no       no       much l… good    no      </w:t>
+      </w:r>
+      <w:r>
+        <w:br/>
+      </w:r>
+      <w:r>
+        <w:rPr>
+          <w:rStyle w:val="CommentTok"/>
+        </w:rPr>
+        <w:t xml:space="preserve">#&gt; 3 horm…    69 White  no       no      no       no       about … good    no      </w:t>
+      </w:r>
+      <w:r>
+        <w:br/>
+      </w:r>
+      <w:r>
+        <w:rPr>
+          <w:rStyle w:val="CommentTok"/>
+        </w:rPr>
+        <w:t xml:space="preserve">#&gt; 4 plac…    64 White  no       yes     yes      no       much l… good    no      </w:t>
+      </w:r>
+      <w:r>
+        <w:br/>
+      </w:r>
+      <w:r>
+        <w:rPr>
+          <w:rStyle w:val="CommentTok"/>
+        </w:rPr>
+        <w:t xml:space="preserve">#&gt; 5 plac…    65 White  no       no      no       no       somewh… good    no      </w:t>
+      </w:r>
+      <w:r>
+        <w:br/>
+      </w:r>
+      <w:r>
+        <w:rPr>
+          <w:rStyle w:val="CommentTok"/>
+        </w:rPr>
+        <w:t xml:space="preserve">#&gt; 6 horm…    68 Afric… yes      no      yes      no       about … good    no      </w:t>
+      </w:r>
+      <w:r>
+        <w:br/>
+      </w:r>
+      <w:r>
+        <w:rPr>
+          <w:rStyle w:val="CommentTok"/>
+        </w:rPr>
+        <w:t xml:space="preserve">#&gt; # ℹ 27 more variables: medcond &lt;dbl&gt;, htnmeds &lt;fct&gt;, statins &lt;fct&gt;,</w:t>
+      </w:r>
+      <w:r>
+        <w:br/>
+      </w:r>
+      <w:r>
+        <w:rPr>
+          <w:rStyle w:val="CommentTok"/>
+        </w:rPr>
+        <w:t xml:space="preserve">#&gt; #   diabetes &lt;fct&gt;, dmpills &lt;fct&gt;, insulin &lt;fct&gt;, weight &lt;dbl&gt;, BMI &lt;dbl&gt;,</w:t>
+      </w:r>
+      <w:r>
+        <w:br/>
+      </w:r>
+      <w:r>
+        <w:rPr>
+          <w:rStyle w:val="CommentTok"/>
+        </w:rPr>
+        <w:t xml:space="preserve">#&gt; #   waist &lt;dbl&gt;, WHR &lt;dbl&gt;, glucose &lt;dbl&gt;, weight1 &lt;dbl&gt;, BMI1 &lt;dbl&gt;,</w:t>
+      </w:r>
+      <w:r>
+        <w:br/>
+      </w:r>
+      <w:r>
+        <w:rPr>
+          <w:rStyle w:val="CommentTok"/>
+        </w:rPr>
+        <w:t xml:space="preserve">#&gt; #   waist1 &lt;dbl&gt;, WHR1 &lt;dbl&gt;, glucose1 &lt;dbl&gt;, tchol &lt;dbl&gt;, LDL &lt;dbl&gt;,</w:t>
+      </w:r>
+      <w:r>
+        <w:br/>
+      </w:r>
+      <w:r>
+        <w:rPr>
+          <w:rStyle w:val="CommentTok"/>
+        </w:rPr>
+        <w:t xml:space="preserve">#&gt; #   HDL &lt;dbl&gt;, TG &lt;dbl&gt;, tchol1 &lt;dbl&gt;, LDL1 &lt;dbl&gt;, HDL1 &lt;dbl&gt;, TG1 &lt;dbl&gt;,</w:t>
+      </w:r>
+      <w:r>
+        <w:br/>
+      </w:r>
+      <w:r>
+        <w:rPr>
+          <w:rStyle w:val="CommentTok"/>
+        </w:rPr>
+        <w:t xml:space="preserve">#&gt; #   SBP &lt;dbl&gt;, DBP &lt;dbl&gt;, age10 &lt;dbl&gt;</w:t>
       </w:r>
     </w:p>
     <w:p>

</xml_diff>

<commit_message>
Deploying to gh-pages from @ Morrison-Lab/sds@92af01ee6bc8df58a74d739f8376c532dbfff164 🚀
</commit_message>
<xml_diff>
--- a/basic-statistical-methods-handout.docx
+++ b/basic-statistical-methods-handout.docx
@@ -15,7 +15,7 @@
         <w:pStyle w:val="Date"/>
       </w:pPr>
       <w:r>
-        <w:t xml:space="preserve">Last modified: 2026-10-07 17:50:26 (PDT)</w:t>
+        <w:t xml:space="preserve">Last modified: 2026-10-07 20:21:34 (PDT)</w:t>
       </w:r>
     </w:p>
     <w:bookmarkStart w:id="13" w:name="introduction"/>
@@ -3880,7 +3880,7 @@
     </w:p>
     <w:bookmarkEnd w:id="24"/>
     <w:bookmarkEnd w:id="25"/>
-    <w:bookmarkStart w:id="58" w:name="sec-two-group-continuous"/>
+    <w:bookmarkStart w:id="61" w:name="sec-two-group-continuous"/>
     <w:p>
       <w:pPr>
         <w:pStyle w:val="Heading2"/>
@@ -4179,7 +4179,7 @@
       </w:r>
     </w:p>
     <w:bookmarkEnd w:id="31"/>
-    <w:bookmarkStart w:id="37" w:name="sec-one-sample-t-test"/>
+    <w:bookmarkStart w:id="38" w:name="sec-one-sample-t-test"/>
     <w:p>
       <w:pPr>
         <w:pStyle w:val="Heading3"/>
@@ -6041,10 +6041,21 @@
         </m:oMath>
       </m:oMathPara>
     </w:p>
+    <w:bookmarkStart w:id="37" w:name="rem-t-statistic-nongaussian"/>
     <w:p>
       <w:pPr>
         <w:pStyle w:val="FirstParagraph"/>
       </w:pPr>
+      <w:r>
+        <w:rPr>
+          <w:i/>
+          <w:iCs/>
+        </w:rPr>
+        <w:t xml:space="preserve">Remark 1</w:t>
+      </w:r>
+      <w:r>
+        <w:t xml:space="preserve"> (Non-Gaussian data). </w:t>
+      </w:r>
       <w:r>
         <w:t xml:space="preserve">When the observations are not Gaussian,</w:t>
       </w:r>
@@ -6159,7 +6170,8 @@
       </w:r>
     </w:p>
     <w:bookmarkEnd w:id="37"/>
-    <w:bookmarkStart w:id="40" w:name="sec-paired-t-test"/>
+    <w:bookmarkEnd w:id="38"/>
+    <w:bookmarkStart w:id="41" w:name="sec-paired-t-test"/>
     <w:p>
       <w:pPr>
         <w:pStyle w:val="Heading3"/>
@@ -6168,7 +6180,7 @@
         <w:t xml:space="preserve">4.3 Paired t-test</w:t>
       </w:r>
     </w:p>
-    <w:bookmarkStart w:id="38" w:name="def-paired-t-test"/>
+    <w:bookmarkStart w:id="39" w:name="def-paired-t-test"/>
     <w:p>
       <w:pPr>
         <w:pStyle w:val="FirstParagraph"/>
@@ -6694,8 +6706,8 @@
         <w:t xml:space="preserve">.</w:t>
       </w:r>
     </w:p>
-    <w:bookmarkEnd w:id="38"/>
-    <w:bookmarkStart w:id="39" w:name="exm-hers-paired"/>
+    <w:bookmarkEnd w:id="39"/>
+    <w:bookmarkStart w:id="40" w:name="exm-hers-paired"/>
     <w:p>
       <w:pPr>
         <w:pStyle w:val="BodyText"/>
@@ -7536,9 +7548,9 @@
         <w:t xml:space="preserve">and the p-value is far below 0.05.</w:t>
       </w:r>
     </w:p>
-    <w:bookmarkEnd w:id="39"/>
     <w:bookmarkEnd w:id="40"/>
-    <w:bookmarkStart w:id="53" w:name="sec-two-sample-t-test"/>
+    <w:bookmarkEnd w:id="41"/>
+    <w:bookmarkStart w:id="56" w:name="sec-two-sample-t-test"/>
     <w:p>
       <w:pPr>
         <w:pStyle w:val="Heading3"/>
@@ -7547,7 +7559,7 @@
         <w:t xml:space="preserve">4.4 Two-sample t-tests</w:t>
       </w:r>
     </w:p>
-    <w:bookmarkStart w:id="41" w:name="def-two-sample-t-test"/>
+    <w:bookmarkStart w:id="42" w:name="def-two-sample-t-test"/>
     <w:p>
       <w:pPr>
         <w:pStyle w:val="FirstParagraph"/>
@@ -8534,11 +8546,22 @@
         <w:t xml:space="preserve">).</w:t>
       </w:r>
     </w:p>
-    <w:bookmarkEnd w:id="41"/>
+    <w:bookmarkEnd w:id="42"/>
+    <w:bookmarkStart w:id="44" w:name="rem-welch-test-properties"/>
     <w:p>
       <w:pPr>
         <w:pStyle w:val="BodyText"/>
       </w:pPr>
+      <w:r>
+        <w:rPr>
+          <w:i/>
+          <w:iCs/>
+        </w:rPr>
+        <w:t xml:space="preserve">Remark 2</w:t>
+      </w:r>
+      <w:r>
+        <w:t xml:space="preserve"> (Properties of Welch’s test). </w:t>
+      </w:r>
       <w:r>
         <w:t xml:space="preserve">Welch’s test does not assume that the two groups have equal variances.</w:t>
       </w:r>
@@ -8630,7 +8653,7 @@
       <w:r>
         <w:t xml:space="preserve"> </w:t>
       </w:r>
-      <w:hyperlink r:id="rId42">
+      <w:hyperlink r:id="rId43">
         <w:r>
           <w:rPr>
             <w:rStyle w:val="Hyperlink"/>
@@ -8660,7 +8683,8 @@
         <w:t xml:space="preserve">.</w:t>
       </w:r>
     </w:p>
-    <w:bookmarkStart w:id="47" w:name="exm-hers-ttest"/>
+    <w:bookmarkEnd w:id="44"/>
+    <w:bookmarkStart w:id="49" w:name="exm-hers-ttest"/>
     <w:p>
       <w:pPr>
         <w:pStyle w:val="BodyText"/>
@@ -8906,7 +8930,7 @@
       <w:tr>
         <w:tc>
           <w:tcPr/>
-          <w:bookmarkStart w:id="46" w:name="fig-hers-boxplot"/>
+          <w:bookmarkStart w:id="48" w:name="fig-hers-boxplot"/>
           <w:p>
             <w:pPr>
               <w:pStyle w:val="SourceCode"/>
@@ -9153,18 +9177,18 @@
                 <wp:inline>
                   <wp:extent cx="4620126" cy="3696101"/>
                   <wp:effectExtent b="0" l="0" r="0" t="0"/>
-                  <wp:docPr descr="" title="" id="44" name="Picture"/>
+                  <wp:docPr descr="" title="" id="46" name="Picture"/>
                   <a:graphic>
                     <a:graphicData uri="http://schemas.openxmlformats.org/drawingml/2006/picture">
                       <pic:pic>
                         <pic:nvPicPr>
-                          <pic:cNvPr descr="basic-statistical-methods_files/figure-docx/unnamed-chunk-4-1.png" id="45" name="Picture"/>
+                          <pic:cNvPr descr="basic-statistical-methods_files/figure-docx/unnamed-chunk-4-1.png" id="47" name="Picture"/>
                           <pic:cNvPicPr>
                             <a:picLocks noChangeArrowheads="1" noChangeAspect="1"/>
                           </pic:cNvPicPr>
                         </pic:nvPicPr>
                         <pic:blipFill>
-                          <a:blip r:embed="rId43"/>
+                          <a:blip r:embed="rId45"/>
                           <a:stretch>
                             <a:fillRect/>
                           </a:stretch>
@@ -9204,7 +9228,7 @@
               <w:t xml:space="preserve">Figure 1: Baseline fasting glucose by treatment group in HERS</w:t>
             </w:r>
           </w:p>
-          <w:bookmarkEnd w:id="46"/>
+          <w:bookmarkEnd w:id="48"/>
         </w:tc>
       </w:tr>
     </w:tbl>
@@ -10182,8 +10206,8 @@
         <w:t xml:space="preserve">so the groups’ baseline means differ only by chance.</w:t>
       </w:r>
     </w:p>
-    <w:bookmarkEnd w:id="47"/>
-    <w:bookmarkStart w:id="48" w:name="def-pooled-variance"/>
+    <w:bookmarkEnd w:id="49"/>
+    <w:bookmarkStart w:id="50" w:name="def-pooled-variance"/>
     <w:p>
       <w:pPr>
         <w:pStyle w:val="BodyText"/>
@@ -10531,8 +10555,8 @@
         </m:oMath>
       </m:oMathPara>
     </w:p>
-    <w:bookmarkEnd w:id="48"/>
-    <w:bookmarkStart w:id="49" w:name="exm-pooled-variance"/>
+    <w:bookmarkEnd w:id="50"/>
+    <w:bookmarkStart w:id="51" w:name="exm-pooled-variance"/>
     <w:p>
       <w:pPr>
         <w:pStyle w:val="FirstParagraph"/>
@@ -10948,8 +10972,8 @@
         <w:t xml:space="preserve">, whose sample is larger.</w:t>
       </w:r>
     </w:p>
-    <w:bookmarkEnd w:id="49"/>
-    <w:bookmarkStart w:id="50" w:name="def-pooled-t-test"/>
+    <w:bookmarkEnd w:id="51"/>
+    <w:bookmarkStart w:id="52" w:name="def-pooled-t-test"/>
     <w:p>
       <w:pPr>
         <w:pStyle w:val="BodyText"/>
@@ -11444,8 +11468,8 @@
         <w:t xml:space="preserve">distribution.</w:t>
       </w:r>
     </w:p>
-    <w:bookmarkEnd w:id="50"/>
-    <w:bookmarkStart w:id="51" w:name="thm-pooled-t-null"/>
+    <w:bookmarkEnd w:id="52"/>
+    <w:bookmarkStart w:id="53" w:name="thm-pooled-t-null"/>
     <w:p>
       <w:pPr>
         <w:pStyle w:val="BodyText"/>
@@ -11604,11 +11628,22 @@
         <w:t xml:space="preserve">.</w:t>
       </w:r>
     </w:p>
-    <w:bookmarkEnd w:id="51"/>
+    <w:bookmarkEnd w:id="53"/>
+    <w:bookmarkStart w:id="54" w:name="rem-pooled-t-equal-variances"/>
     <w:p>
       <w:pPr>
         <w:pStyle w:val="BodyText"/>
       </w:pPr>
+      <w:r>
+        <w:rPr>
+          <w:i/>
+          <w:iCs/>
+        </w:rPr>
+        <w:t xml:space="preserve">Remark 3</w:t>
+      </w:r>
+      <w:r>
+        <w:t xml:space="preserve"> (The equal-variance assumption). </w:t>
+      </w:r>
       <w:hyperlink w:anchor="thm-pooled-t-null">
         <w:r>
           <w:rPr>
@@ -11647,7 +11682,8 @@
         <w:t xml:space="preserve">so these notes use Welch’s test by default.</w:t>
       </w:r>
     </w:p>
-    <w:bookmarkStart w:id="52" w:name="exm-hers-pooled-ttest"/>
+    <w:bookmarkEnd w:id="54"/>
+    <w:bookmarkStart w:id="55" w:name="exm-hers-pooled-ttest"/>
     <w:p>
       <w:pPr>
         <w:pStyle w:val="BodyText"/>
@@ -11850,9 +11886,9 @@
         <w:t xml:space="preserve">#&gt;   111.854   112.449</w:t>
       </w:r>
     </w:p>
-    <w:bookmarkEnd w:id="52"/>
-    <w:bookmarkEnd w:id="53"/>
-    <w:bookmarkStart w:id="57" w:name="sec-CI-diff-means"/>
+    <w:bookmarkEnd w:id="55"/>
+    <w:bookmarkEnd w:id="56"/>
+    <w:bookmarkStart w:id="60" w:name="sec-CI-diff-means"/>
     <w:p>
       <w:pPr>
         <w:pStyle w:val="Heading3"/>
@@ -11861,7 +11897,7 @@
         <w:t xml:space="preserve">4.5 Confidence intervals for the difference in means</w:t>
       </w:r>
     </w:p>
-    <w:bookmarkStart w:id="55" w:name="def-ci-diff-means"/>
+    <w:bookmarkStart w:id="58" w:name="def-ci-diff-means"/>
     <w:p>
       <w:pPr>
         <w:pStyle w:val="FirstParagraph"/>
@@ -12376,7 +12412,7 @@
       <w:r>
         <w:t xml:space="preserve"> </w:t>
       </w:r>
-      <w:hyperlink r:id="rId54">
+      <w:hyperlink r:id="rId57">
         <w:r>
           <w:rPr>
             <w:rStyle w:val="Hyperlink"/>
@@ -12388,8 +12424,8 @@
         <w:t xml:space="preserve">.</w:t>
       </w:r>
     </w:p>
-    <w:bookmarkEnd w:id="55"/>
-    <w:bookmarkStart w:id="56" w:name="exm-hers-diff-means-ci"/>
+    <w:bookmarkEnd w:id="58"/>
+    <w:bookmarkStart w:id="59" w:name="exm-hers-diff-means-ci"/>
     <w:p>
       <w:pPr>
         <w:pStyle w:val="BodyText"/>
@@ -12706,10 +12742,10 @@
         <w:t xml:space="preserve">It contains 0, consistent with the large p-value there.</w:t>
       </w:r>
     </w:p>
-    <w:bookmarkEnd w:id="56"/>
-    <w:bookmarkEnd w:id="57"/>
-    <w:bookmarkEnd w:id="58"/>
-    <w:bookmarkStart w:id="70" w:name="sec-anova"/>
+    <w:bookmarkEnd w:id="59"/>
+    <w:bookmarkEnd w:id="60"/>
+    <w:bookmarkEnd w:id="61"/>
+    <w:bookmarkStart w:id="75" w:name="sec-anova"/>
     <w:p>
       <w:pPr>
         <w:pStyle w:val="Heading2"/>
@@ -12718,7 +12754,7 @@
         <w:t xml:space="preserve">5 One-way analysis of variance</w:t>
       </w:r>
     </w:p>
-    <w:bookmarkStart w:id="59" w:name="def-ss-between"/>
+    <w:bookmarkStart w:id="62" w:name="def-ss-between"/>
     <w:p>
       <w:pPr>
         <w:pStyle w:val="FirstParagraph"/>
@@ -13206,8 +13242,8 @@
         </m:oMath>
       </m:oMathPara>
     </w:p>
-    <w:bookmarkEnd w:id="59"/>
-    <w:bookmarkStart w:id="60" w:name="exm-ss-between"/>
+    <w:bookmarkEnd w:id="62"/>
+    <w:bookmarkStart w:id="63" w:name="exm-ss-between"/>
     <w:p>
       <w:pPr>
         <w:pStyle w:val="FirstParagraph"/>
@@ -13653,8 +13689,8 @@
         </m:oMath>
       </m:oMathPara>
     </w:p>
-    <w:bookmarkEnd w:id="60"/>
-    <w:bookmarkStart w:id="61" w:name="def-ss-within"/>
+    <w:bookmarkEnd w:id="63"/>
+    <w:bookmarkStart w:id="64" w:name="def-ss-within"/>
     <w:p>
       <w:pPr>
         <w:pStyle w:val="FirstParagraph"/>
@@ -13894,8 +13930,8 @@
         </m:oMath>
       </m:oMathPara>
     </w:p>
-    <w:bookmarkEnd w:id="61"/>
-    <w:bookmarkStart w:id="62" w:name="exm-ss-within"/>
+    <w:bookmarkEnd w:id="64"/>
+    <w:bookmarkStart w:id="65" w:name="exm-ss-within"/>
     <w:p>
       <w:pPr>
         <w:pStyle w:val="FirstParagraph"/>
@@ -14309,8 +14345,8 @@
         </m:oMath>
       </m:oMathPara>
     </w:p>
-    <w:bookmarkEnd w:id="62"/>
-    <w:bookmarkStart w:id="63" w:name="def-mean-squares"/>
+    <w:bookmarkEnd w:id="65"/>
+    <w:bookmarkStart w:id="66" w:name="def-mean-squares"/>
     <w:p>
       <w:pPr>
         <w:pStyle w:val="FirstParagraph"/>
@@ -14548,8 +14584,8 @@
         <w:t xml:space="preserve">.</w:t>
       </w:r>
     </w:p>
-    <w:bookmarkEnd w:id="63"/>
-    <w:bookmarkStart w:id="64" w:name="exm-mean-squares"/>
+    <w:bookmarkEnd w:id="66"/>
+    <w:bookmarkStart w:id="67" w:name="exm-mean-squares"/>
     <w:p>
       <w:pPr>
         <w:pStyle w:val="BodyText"/>
@@ -14738,8 +14774,8 @@
         <w:t xml:space="preserve">.</w:t>
       </w:r>
     </w:p>
-    <w:bookmarkEnd w:id="64"/>
-    <w:bookmarkStart w:id="66" w:name="def-one-way-anova"/>
+    <w:bookmarkEnd w:id="67"/>
+    <w:bookmarkStart w:id="69" w:name="def-one-way-anova"/>
     <w:p>
       <w:pPr>
         <w:pStyle w:val="BodyText"/>
@@ -15175,7 +15211,7 @@
       <w:r>
         <w:t xml:space="preserve">distribution (</w:t>
       </w:r>
-      <w:hyperlink r:id="rId65">
+      <w:hyperlink r:id="rId68">
         <w:r>
           <w:rPr>
             <w:rStyle w:val="Hyperlink"/>
@@ -15187,11 +15223,22 @@
         <w:t xml:space="preserve">).</w:t>
       </w:r>
     </w:p>
-    <w:bookmarkEnd w:id="66"/>
+    <w:bookmarkEnd w:id="69"/>
+    <w:bookmarkStart w:id="70" w:name="rem-f-statistic-size"/>
     <w:p>
       <w:pPr>
         <w:pStyle w:val="BodyText"/>
       </w:pPr>
+      <w:r>
+        <w:rPr>
+          <w:i/>
+          <w:iCs/>
+        </w:rPr>
+        <w:t xml:space="preserve">Remark 4</w:t>
+      </w:r>
+      <w:r>
+        <w:t xml:space="preserve"> (Interpreting the F statistic). </w:t>
+      </w:r>
       <w:r>
         <w:t xml:space="preserve">Large values of</w:t>
       </w:r>
@@ -15274,7 +15321,8 @@
         <w:t xml:space="preserve">.</w:t>
       </w:r>
     </w:p>
-    <w:bookmarkStart w:id="67" w:name="thm-anova-null"/>
+    <w:bookmarkEnd w:id="70"/>
+    <w:bookmarkStart w:id="71" w:name="thm-anova-null"/>
     <w:p>
       <w:pPr>
         <w:pStyle w:val="BodyText"/>
@@ -15561,8 +15609,8 @@
         <w:t xml:space="preserve">.</w:t>
       </w:r>
     </w:p>
-    <w:bookmarkEnd w:id="67"/>
-    <w:bookmarkStart w:id="68" w:name="exm-hers-anova"/>
+    <w:bookmarkEnd w:id="71"/>
+    <w:bookmarkStart w:id="72" w:name="exm-hers-anova"/>
     <w:p>
       <w:pPr>
         <w:pStyle w:val="BodyText"/>
@@ -16809,11 +16857,22 @@
         <w:t xml:space="preserve">mean fasting glucose differs among the three race/ethnicity groups.</w:t>
       </w:r>
     </w:p>
-    <w:bookmarkEnd w:id="68"/>
+    <w:bookmarkEnd w:id="72"/>
+    <w:bookmarkStart w:id="73" w:name="rem-hers-anova-variances"/>
     <w:p>
       <w:pPr>
         <w:pStyle w:val="BodyText"/>
       </w:pPr>
+      <w:r>
+        <w:rPr>
+          <w:i/>
+          <w:iCs/>
+        </w:rPr>
+        <w:t xml:space="preserve">Remark 5</w:t>
+      </w:r>
+      <w:r>
+        <w:t xml:space="preserve"> (Unequal variances in the HERS glucose groups). </w:t>
+      </w:r>
       <w:r>
         <w:t xml:space="preserve">The group standard deviations differ,</w:t>
       </w:r>
@@ -16966,6 +17025,7 @@
         <w:t xml:space="preserve">#&gt; F = 12.49, num df = 2.0, denom df = 185.7, p-value = 8.17e-06</w:t>
       </w:r>
     </w:p>
+    <w:bookmarkEnd w:id="73"/>
     <w:p>
       <w:pPr>
         <w:pStyle w:val="FirstParagraph"/>
@@ -16997,7 +17057,7 @@
       <w:r>
         <w:t xml:space="preserve">(</w:t>
       </w:r>
-      <w:hyperlink r:id="rId69">
+      <w:hyperlink r:id="rId74">
         <w:r>
           <w:rPr>
             <w:rStyle w:val="Hyperlink"/>
@@ -17450,8 +17510,8 @@
         <w:t xml:space="preserve">#&gt;  0.180281  0.180281</w:t>
       </w:r>
     </w:p>
-    <w:bookmarkEnd w:id="70"/>
-    <w:bookmarkStart w:id="77" w:name="references"/>
+    <w:bookmarkEnd w:id="75"/>
+    <w:bookmarkStart w:id="82" w:name="references"/>
     <w:p>
       <w:pPr>
         <w:pStyle w:val="Heading2"/>
@@ -17460,8 +17520,8 @@
         <w:t xml:space="preserve">References</w:t>
       </w:r>
     </w:p>
-    <w:bookmarkStart w:id="76" w:name="refs"/>
-    <w:bookmarkStart w:id="71" w:name="ref-hoggtanis2015"/>
+    <w:bookmarkStart w:id="81" w:name="refs"/>
+    <w:bookmarkStart w:id="76" w:name="ref-hoggtanis2015"/>
     <w:p>
       <w:pPr>
         <w:pStyle w:val="Bibliography"/>
@@ -17483,8 +17543,8 @@
         <w:t xml:space="preserve">. Tenth edition. Pearson.</w:t>
       </w:r>
     </w:p>
-    <w:bookmarkEnd w:id="71"/>
-    <w:bookmarkStart w:id="73" w:name="ref-HulleyStephen1998RToE"/>
+    <w:bookmarkEnd w:id="76"/>
+    <w:bookmarkStart w:id="78" w:name="ref-HulleyStephen1998RToE"/>
     <w:p>
       <w:pPr>
         <w:pStyle w:val="Bibliography"/>
@@ -17517,7 +17577,7 @@
       <w:r>
         <w:t xml:space="preserve"> </w:t>
       </w:r>
-      <w:hyperlink r:id="rId72">
+      <w:hyperlink r:id="rId77">
         <w:r>
           <w:rPr>
             <w:rStyle w:val="Hyperlink"/>
@@ -17529,8 +17589,8 @@
         <w:t xml:space="preserve">.</w:t>
       </w:r>
     </w:p>
-    <w:bookmarkEnd w:id="73"/>
-    <w:bookmarkStart w:id="75" w:name="ref-vittinghoff2e"/>
+    <w:bookmarkEnd w:id="78"/>
+    <w:bookmarkStart w:id="80" w:name="ref-vittinghoff2e"/>
     <w:p>
       <w:pPr>
         <w:pStyle w:val="Bibliography"/>
@@ -17554,7 +17614,7 @@
       <w:r>
         <w:t xml:space="preserve"> </w:t>
       </w:r>
-      <w:hyperlink r:id="rId74">
+      <w:hyperlink r:id="rId79">
         <w:r>
           <w:rPr>
             <w:rStyle w:val="Hyperlink"/>
@@ -17566,9 +17626,9 @@
         <w:t xml:space="preserve">.</w:t>
       </w:r>
     </w:p>
-    <w:bookmarkEnd w:id="75"/>
-    <w:bookmarkEnd w:id="76"/>
-    <w:bookmarkEnd w:id="77"/>
+    <w:bookmarkEnd w:id="80"/>
+    <w:bookmarkEnd w:id="81"/>
+    <w:bookmarkEnd w:id="82"/>
     <w:sectPr>
       <w:footnotePr>
         <w:numRestart w:val="eachSect"/>

</xml_diff>

<commit_message>
Deploying to gh-pages from @ Morrison-Lab/sds@1c5c7132fafa9dabbfccb77a4e152287c59410c0 🚀
</commit_message>
<xml_diff>
--- a/basic-statistical-methods-handout.docx
+++ b/basic-statistical-methods-handout.docx
@@ -15,7 +15,7 @@
         <w:pStyle w:val="Date"/>
       </w:pPr>
       <w:r>
-        <w:t xml:space="preserve">Last modified: 2026-10-09 10:02:46 (PDT)</w:t>
+        <w:t xml:space="preserve">Last modified: 2026-10-09 10:13:53 (PDT)</w:t>
       </w:r>
     </w:p>
     <w:bookmarkStart w:id="13" w:name="introduction"/>
@@ -16780,72 +16780,333 @@
         <w:t xml:space="preserve">|&gt;</w:t>
       </w:r>
       <w:r>
-        <w:rPr>
-          <w:rStyle w:val="NormalTok"/>
-        </w:rPr>
-        <w:t xml:space="preserve"> </w:t>
+        <w:br/>
+      </w:r>
+      <w:r>
+        <w:rPr>
+          <w:rStyle w:val="NormalTok"/>
+        </w:rPr>
+        <w:t xml:space="preserve">  parameters</w:t>
+      </w:r>
+      <w:r>
+        <w:rPr>
+          <w:rStyle w:val="SpecialCharTok"/>
+        </w:rPr>
+        <w:t xml:space="preserve">::</w:t>
       </w:r>
       <w:r>
         <w:rPr>
           <w:rStyle w:val="FunctionTok"/>
         </w:rPr>
-        <w:t xml:space="preserve">summary</w:t>
-      </w:r>
-      <w:r>
-        <w:rPr>
-          <w:rStyle w:val="NormalTok"/>
-        </w:rPr>
-        <w:t xml:space="preserve">()</w:t>
+        <w:t xml:space="preserve">parameters</w:t>
+      </w:r>
+      <w:r>
+        <w:rPr>
+          <w:rStyle w:val="NormalTok"/>
+        </w:rPr>
+        <w:t xml:space="preserve">() </w:t>
+      </w:r>
+      <w:r>
+        <w:rPr>
+          <w:rStyle w:val="SpecialCharTok"/>
+        </w:rPr>
+        <w:t xml:space="preserve">|&gt;</w:t>
       </w:r>
       <w:r>
         <w:br/>
       </w:r>
       <w:r>
         <w:rPr>
-          <w:rStyle w:val="CommentTok"/>
-        </w:rPr>
-        <w:t xml:space="preserve">#&gt;               Df  Sum Sq Mean Sq F value  Pr(&gt;F)    </w:t>
-      </w:r>
-      <w:r>
-        <w:br/>
-      </w:r>
-      <w:r>
-        <w:rPr>
-          <w:rStyle w:val="CommentTok"/>
-        </w:rPr>
-        <w:t xml:space="preserve">#&gt; raceth         2   45919   22959    17.1 4.1e-08 ***</w:t>
-      </w:r>
-      <w:r>
-        <w:br/>
-      </w:r>
-      <w:r>
-        <w:rPr>
-          <w:rStyle w:val="CommentTok"/>
-        </w:rPr>
-        <w:t xml:space="preserve">#&gt; Residuals   2760 3704543    1342                    </w:t>
-      </w:r>
-      <w:r>
-        <w:br/>
-      </w:r>
-      <w:r>
-        <w:rPr>
-          <w:rStyle w:val="CommentTok"/>
-        </w:rPr>
-        <w:t xml:space="preserve">#&gt; ---</w:t>
-      </w:r>
-      <w:r>
-        <w:br/>
-      </w:r>
-      <w:r>
-        <w:rPr>
-          <w:rStyle w:val="CommentTok"/>
-        </w:rPr>
-        <w:t xml:space="preserve">#&gt; Signif. codes:  0 '***' 0.001 '**' 0.01 '*' 0.05 '.' 0.1 ' ' 1</w:t>
+          <w:rStyle w:val="NormalTok"/>
+        </w:rPr>
+        <w:t xml:space="preserve">  parameters</w:t>
+      </w:r>
+      <w:r>
+        <w:rPr>
+          <w:rStyle w:val="SpecialCharTok"/>
+        </w:rPr>
+        <w:t xml:space="preserve">::</w:t>
+      </w:r>
+      <w:r>
+        <w:rPr>
+          <w:rStyle w:val="FunctionTok"/>
+        </w:rPr>
+        <w:t xml:space="preserve">print_md</w:t>
+      </w:r>
+      <w:r>
+        <w:rPr>
+          <w:rStyle w:val="NormalTok"/>
+        </w:rPr>
+        <w:t xml:space="preserve">(</w:t>
+      </w:r>
+      <w:r>
+        <w:rPr>
+          <w:rStyle w:val="AttributeTok"/>
+        </w:rPr>
+        <w:t xml:space="preserve">digits =</w:t>
+      </w:r>
+      <w:r>
+        <w:rPr>
+          <w:rStyle w:val="NormalTok"/>
+        </w:rPr>
+        <w:t xml:space="preserve"> </w:t>
+      </w:r>
+      <w:r>
+        <w:rPr>
+          <w:rStyle w:val="DecValTok"/>
+        </w:rPr>
+        <w:t xml:space="preserve">3</w:t>
+      </w:r>
+      <w:r>
+        <w:rPr>
+          <w:rStyle w:val="NormalTok"/>
+        </w:rPr>
+        <w:t xml:space="preserve">)</w:t>
+      </w:r>
+    </w:p>
+    <w:tbl>
+      <w:tblPr>
+        <w:tblStyle w:val="Table"/>
+        <w:tblW w:type="auto" w:w="0"/>
+        <w:tblLook w:firstRow="1" w:lastRow="0" w:firstColumn="0" w:lastColumn="0" w:noHBand="0" w:noVBand="0" w:val="0020"/>
+      </w:tblPr>
+      <w:tblGrid>
+        <w:gridCol w:w="1320"/>
+        <w:gridCol w:w="1320"/>
+        <w:gridCol w:w="1320"/>
+        <w:gridCol w:w="1320"/>
+        <w:gridCol w:w="1320"/>
+        <w:gridCol w:w="1320"/>
+      </w:tblGrid>
+      <w:tr>
+        <w:trPr>
+          <w:tblHeader w:val="on"/>
+        </w:trPr>
+        <w:tc>
+          <w:tcPr/>
+          <w:p>
+            <w:pPr>
+              <w:pStyle w:val="Compact"/>
+              <w:jc w:val="left"/>
+            </w:pPr>
+            <w:r>
+              <w:t xml:space="preserve">Parameter</w:t>
+            </w:r>
+          </w:p>
+        </w:tc>
+        <w:tc>
+          <w:tcPr/>
+          <w:p>
+            <w:pPr>
+              <w:pStyle w:val="Compact"/>
+              <w:jc w:val="center"/>
+            </w:pPr>
+            <w:r>
+              <w:t xml:space="preserve">Sum_Squares</w:t>
+            </w:r>
+          </w:p>
+        </w:tc>
+        <w:tc>
+          <w:tcPr/>
+          <w:p>
+            <w:pPr>
+              <w:pStyle w:val="Compact"/>
+              <w:jc w:val="center"/>
+            </w:pPr>
+            <w:r>
+              <w:t xml:space="preserve">df</w:t>
+            </w:r>
+          </w:p>
+        </w:tc>
+        <w:tc>
+          <w:tcPr/>
+          <w:p>
+            <w:pPr>
+              <w:pStyle w:val="Compact"/>
+              <w:jc w:val="center"/>
+            </w:pPr>
+            <w:r>
+              <w:t xml:space="preserve">Mean_Square</w:t>
+            </w:r>
+          </w:p>
+        </w:tc>
+        <w:tc>
+          <w:tcPr/>
+          <w:p>
+            <w:pPr>
+              <w:pStyle w:val="Compact"/>
+              <w:jc w:val="center"/>
+            </w:pPr>
+            <w:r>
+              <w:t xml:space="preserve">F</w:t>
+            </w:r>
+          </w:p>
+        </w:tc>
+        <w:tc>
+          <w:tcPr/>
+          <w:p>
+            <w:pPr>
+              <w:pStyle w:val="Compact"/>
+              <w:jc w:val="center"/>
+            </w:pPr>
+            <w:r>
+              <w:t xml:space="preserve">p</w:t>
+            </w:r>
+          </w:p>
+        </w:tc>
+      </w:tr>
+      <w:tr>
+        <w:tc>
+          <w:tcPr/>
+          <w:p>
+            <w:pPr>
+              <w:pStyle w:val="Compact"/>
+              <w:jc w:val="left"/>
+            </w:pPr>
+            <w:r>
+              <w:t xml:space="preserve">raceth</w:t>
+            </w:r>
+          </w:p>
+        </w:tc>
+        <w:tc>
+          <w:tcPr/>
+          <w:p>
+            <w:pPr>
+              <w:pStyle w:val="Compact"/>
+              <w:jc w:val="center"/>
+            </w:pPr>
+            <w:r>
+              <w:t xml:space="preserve">45918.814</w:t>
+            </w:r>
+          </w:p>
+        </w:tc>
+        <w:tc>
+          <w:tcPr/>
+          <w:p>
+            <w:pPr>
+              <w:pStyle w:val="Compact"/>
+              <w:jc w:val="center"/>
+            </w:pPr>
+            <w:r>
+              <w:t xml:space="preserve">2</w:t>
+            </w:r>
+          </w:p>
+        </w:tc>
+        <w:tc>
+          <w:tcPr/>
+          <w:p>
+            <w:pPr>
+              <w:pStyle w:val="Compact"/>
+              <w:jc w:val="center"/>
+            </w:pPr>
+            <w:r>
+              <w:t xml:space="preserve">22959.407</w:t>
+            </w:r>
+          </w:p>
+        </w:tc>
+        <w:tc>
+          <w:tcPr/>
+          <w:p>
+            <w:pPr>
+              <w:pStyle w:val="Compact"/>
+              <w:jc w:val="center"/>
+            </w:pPr>
+            <w:r>
+              <w:t xml:space="preserve">17.105</w:t>
+            </w:r>
+          </w:p>
+        </w:tc>
+        <w:tc>
+          <w:tcPr/>
+          <w:p>
+            <w:pPr>
+              <w:pStyle w:val="Compact"/>
+              <w:jc w:val="center"/>
+            </w:pPr>
+            <w:r>
+              <w:t xml:space="preserve">&lt; .001</w:t>
+            </w:r>
+          </w:p>
+        </w:tc>
+      </w:tr>
+      <w:tr>
+        <w:tc>
+          <w:tcPr/>
+          <w:p>
+            <w:pPr>
+              <w:pStyle w:val="Compact"/>
+              <w:jc w:val="left"/>
+            </w:pPr>
+            <w:r>
+              <w:t xml:space="preserve">Residuals</w:t>
+            </w:r>
+          </w:p>
+        </w:tc>
+        <w:tc>
+          <w:tcPr/>
+          <w:p>
+            <w:pPr>
+              <w:pStyle w:val="Compact"/>
+              <w:jc w:val="center"/>
+            </w:pPr>
+            <w:r>
+              <w:t xml:space="preserve">3.705e+06</w:t>
+            </w:r>
+          </w:p>
+        </w:tc>
+        <w:tc>
+          <w:tcPr/>
+          <w:p>
+            <w:pPr>
+              <w:pStyle w:val="Compact"/>
+              <w:jc w:val="center"/>
+            </w:pPr>
+            <w:r>
+              <w:t xml:space="preserve">2760</w:t>
+            </w:r>
+          </w:p>
+        </w:tc>
+        <w:tc>
+          <w:tcPr/>
+          <w:p>
+            <w:pPr>
+              <w:pStyle w:val="Compact"/>
+              <w:jc w:val="center"/>
+            </w:pPr>
+            <w:r>
+              <w:t xml:space="preserve">1342.226</w:t>
+            </w:r>
+          </w:p>
+        </w:tc>
+        <w:tc>
+          <w:tcPr/>
+          <w:p>
+            <w:pPr>
+              <w:pStyle w:val="Compact"/>
+            </w:pPr>
+          </w:p>
+        </w:tc>
+        <w:tc>
+          <w:tcPr/>
+          <w:p>
+            <w:pPr>
+              <w:pStyle w:val="Compact"/>
+            </w:pPr>
+          </w:p>
+        </w:tc>
+      </w:tr>
+    </w:tbl>
+    <w:p>
+      <w:pPr>
+        <w:pStyle w:val="BodyText"/>
+      </w:pPr>
+      <w:r>
+        <w:t xml:space="preserve">Anova Table (Type 1 tests)</w:t>
       </w:r>
     </w:p>
     <w:p>
       <w:pPr>
-        <w:pStyle w:val="FirstParagraph"/>
+        <w:pStyle w:val="BodyText"/>
       </w:pPr>
       <w:r>
         <w:t xml:space="preserve">The p-value is far below 0.05:</w:t>
@@ -17143,10 +17404,13 @@
         <w:t xml:space="preserve">|&gt;</w:t>
       </w:r>
       <w:r>
-        <w:rPr>
-          <w:rStyle w:val="NormalTok"/>
-        </w:rPr>
-        <w:t xml:space="preserve"> </w:t>
+        <w:br/>
+      </w:r>
+      <w:r>
+        <w:rPr>
+          <w:rStyle w:val="NormalTok"/>
+        </w:rPr>
+        <w:t xml:space="preserve">  </w:t>
       </w:r>
       <w:r>
         <w:rPr>
@@ -17158,57 +17422,358 @@
         <w:rPr>
           <w:rStyle w:val="NormalTok"/>
         </w:rPr>
-        <w:t xml:space="preserve">()</w:t>
+        <w:t xml:space="preserve">() </w:t>
+      </w:r>
+      <w:r>
+        <w:rPr>
+          <w:rStyle w:val="SpecialCharTok"/>
+        </w:rPr>
+        <w:t xml:space="preserve">|&gt;</w:t>
       </w:r>
       <w:r>
         <w:br/>
       </w:r>
       <w:r>
         <w:rPr>
-          <w:rStyle w:val="CommentTok"/>
-        </w:rPr>
-        <w:t xml:space="preserve">#&gt; # A tibble: 2 × 5</w:t>
+          <w:rStyle w:val="NormalTok"/>
+        </w:rPr>
+        <w:t xml:space="preserve">  parameters</w:t>
+      </w:r>
+      <w:r>
+        <w:rPr>
+          <w:rStyle w:val="SpecialCharTok"/>
+        </w:rPr>
+        <w:t xml:space="preserve">::</w:t>
+      </w:r>
+      <w:r>
+        <w:rPr>
+          <w:rStyle w:val="FunctionTok"/>
+        </w:rPr>
+        <w:t xml:space="preserve">parameters</w:t>
+      </w:r>
+      <w:r>
+        <w:rPr>
+          <w:rStyle w:val="NormalTok"/>
+        </w:rPr>
+        <w:t xml:space="preserve">() </w:t>
+      </w:r>
+      <w:r>
+        <w:rPr>
+          <w:rStyle w:val="SpecialCharTok"/>
+        </w:rPr>
+        <w:t xml:space="preserve">|&gt;</w:t>
       </w:r>
       <w:r>
         <w:br/>
       </w:r>
       <w:r>
         <w:rPr>
-          <w:rStyle w:val="CommentTok"/>
-        </w:rPr>
-        <w:t xml:space="preserve">#&gt;      Df `Sum Sq` `Mean Sq` `F value`      `Pr(&gt;F)`</w:t>
-      </w:r>
-      <w:r>
-        <w:br/>
-      </w:r>
-      <w:r>
-        <w:rPr>
-          <w:rStyle w:val="CommentTok"/>
-        </w:rPr>
-        <w:t xml:space="preserve">#&gt;   &lt;int&gt;    &lt;dbl&gt;     &lt;dbl&gt;     &lt;dbl&gt;         &lt;dbl&gt;</w:t>
-      </w:r>
-      <w:r>
-        <w:br/>
-      </w:r>
-      <w:r>
-        <w:rPr>
-          <w:rStyle w:val="CommentTok"/>
-        </w:rPr>
-        <w:t xml:space="preserve">#&gt; 1     2   45919.    22959.      17.1  0.0000000414</w:t>
-      </w:r>
-      <w:r>
-        <w:br/>
-      </w:r>
-      <w:r>
-        <w:rPr>
-          <w:rStyle w:val="CommentTok"/>
-        </w:rPr>
-        <w:t xml:space="preserve">#&gt; 2  2760 3704543.     1342.      NA   NA</w:t>
+          <w:rStyle w:val="NormalTok"/>
+        </w:rPr>
+        <w:t xml:space="preserve">  parameters</w:t>
+      </w:r>
+      <w:r>
+        <w:rPr>
+          <w:rStyle w:val="SpecialCharTok"/>
+        </w:rPr>
+        <w:t xml:space="preserve">::</w:t>
+      </w:r>
+      <w:r>
+        <w:rPr>
+          <w:rStyle w:val="FunctionTok"/>
+        </w:rPr>
+        <w:t xml:space="preserve">print_md</w:t>
+      </w:r>
+      <w:r>
+        <w:rPr>
+          <w:rStyle w:val="NormalTok"/>
+        </w:rPr>
+        <w:t xml:space="preserve">(</w:t>
+      </w:r>
+      <w:r>
+        <w:rPr>
+          <w:rStyle w:val="AttributeTok"/>
+        </w:rPr>
+        <w:t xml:space="preserve">digits =</w:t>
+      </w:r>
+      <w:r>
+        <w:rPr>
+          <w:rStyle w:val="NormalTok"/>
+        </w:rPr>
+        <w:t xml:space="preserve"> </w:t>
+      </w:r>
+      <w:r>
+        <w:rPr>
+          <w:rStyle w:val="DecValTok"/>
+        </w:rPr>
+        <w:t xml:space="preserve">3</w:t>
+      </w:r>
+      <w:r>
+        <w:rPr>
+          <w:rStyle w:val="NormalTok"/>
+        </w:rPr>
+        <w:t xml:space="preserve">, </w:t>
+      </w:r>
+      <w:r>
+        <w:rPr>
+          <w:rStyle w:val="AttributeTok"/>
+        </w:rPr>
+        <w:t xml:space="preserve">footer =</w:t>
+      </w:r>
+      <w:r>
+        <w:rPr>
+          <w:rStyle w:val="NormalTok"/>
+        </w:rPr>
+        <w:t xml:space="preserve"> </w:t>
+      </w:r>
+      <w:r>
+        <w:rPr>
+          <w:rStyle w:val="StringTok"/>
+        </w:rPr>
+        <w:t xml:space="preserve">""</w:t>
+      </w:r>
+      <w:r>
+        <w:rPr>
+          <w:rStyle w:val="NormalTok"/>
+        </w:rPr>
+        <w:t xml:space="preserve">)</w:t>
       </w:r>
     </w:p>
+    <w:tbl>
+      <w:tblPr>
+        <w:tblStyle w:val="Table"/>
+        <w:tblW w:type="auto" w:w="0"/>
+        <w:tblLook w:firstRow="1" w:lastRow="0" w:firstColumn="0" w:lastColumn="0" w:noHBand="0" w:noVBand="0" w:val="0020"/>
+      </w:tblPr>
+      <w:tblGrid>
+        <w:gridCol w:w="1320"/>
+        <w:gridCol w:w="1320"/>
+        <w:gridCol w:w="1320"/>
+        <w:gridCol w:w="1320"/>
+        <w:gridCol w:w="1320"/>
+        <w:gridCol w:w="1320"/>
+      </w:tblGrid>
+      <w:tr>
+        <w:trPr>
+          <w:tblHeader w:val="on"/>
+        </w:trPr>
+        <w:tc>
+          <w:tcPr/>
+          <w:p>
+            <w:pPr>
+              <w:pStyle w:val="Compact"/>
+              <w:jc w:val="left"/>
+            </w:pPr>
+            <w:r>
+              <w:t xml:space="preserve">Parameter</w:t>
+            </w:r>
+          </w:p>
+        </w:tc>
+        <w:tc>
+          <w:tcPr/>
+          <w:p>
+            <w:pPr>
+              <w:pStyle w:val="Compact"/>
+              <w:jc w:val="center"/>
+            </w:pPr>
+            <w:r>
+              <w:t xml:space="preserve">Sum_Squares</w:t>
+            </w:r>
+          </w:p>
+        </w:tc>
+        <w:tc>
+          <w:tcPr/>
+          <w:p>
+            <w:pPr>
+              <w:pStyle w:val="Compact"/>
+              <w:jc w:val="center"/>
+            </w:pPr>
+            <w:r>
+              <w:t xml:space="preserve">df</w:t>
+            </w:r>
+          </w:p>
+        </w:tc>
+        <w:tc>
+          <w:tcPr/>
+          <w:p>
+            <w:pPr>
+              <w:pStyle w:val="Compact"/>
+              <w:jc w:val="center"/>
+            </w:pPr>
+            <w:r>
+              <w:t xml:space="preserve">Mean_Square</w:t>
+            </w:r>
+          </w:p>
+        </w:tc>
+        <w:tc>
+          <w:tcPr/>
+          <w:p>
+            <w:pPr>
+              <w:pStyle w:val="Compact"/>
+              <w:jc w:val="center"/>
+            </w:pPr>
+            <w:r>
+              <w:t xml:space="preserve">F</w:t>
+            </w:r>
+          </w:p>
+        </w:tc>
+        <w:tc>
+          <w:tcPr/>
+          <w:p>
+            <w:pPr>
+              <w:pStyle w:val="Compact"/>
+              <w:jc w:val="center"/>
+            </w:pPr>
+            <w:r>
+              <w:t xml:space="preserve">p</w:t>
+            </w:r>
+          </w:p>
+        </w:tc>
+      </w:tr>
+      <w:tr>
+        <w:tc>
+          <w:tcPr/>
+          <w:p>
+            <w:pPr>
+              <w:pStyle w:val="Compact"/>
+              <w:jc w:val="left"/>
+            </w:pPr>
+            <w:r>
+              <w:t xml:space="preserve">raceth</w:t>
+            </w:r>
+          </w:p>
+        </w:tc>
+        <w:tc>
+          <w:tcPr/>
+          <w:p>
+            <w:pPr>
+              <w:pStyle w:val="Compact"/>
+              <w:jc w:val="center"/>
+            </w:pPr>
+            <w:r>
+              <w:t xml:space="preserve">45918.814</w:t>
+            </w:r>
+          </w:p>
+        </w:tc>
+        <w:tc>
+          <w:tcPr/>
+          <w:p>
+            <w:pPr>
+              <w:pStyle w:val="Compact"/>
+              <w:jc w:val="center"/>
+            </w:pPr>
+            <w:r>
+              <w:t xml:space="preserve">2</w:t>
+            </w:r>
+          </w:p>
+        </w:tc>
+        <w:tc>
+          <w:tcPr/>
+          <w:p>
+            <w:pPr>
+              <w:pStyle w:val="Compact"/>
+              <w:jc w:val="center"/>
+            </w:pPr>
+            <w:r>
+              <w:t xml:space="preserve">22959.407</w:t>
+            </w:r>
+          </w:p>
+        </w:tc>
+        <w:tc>
+          <w:tcPr/>
+          <w:p>
+            <w:pPr>
+              <w:pStyle w:val="Compact"/>
+              <w:jc w:val="center"/>
+            </w:pPr>
+            <w:r>
+              <w:t xml:space="preserve">17.105</w:t>
+            </w:r>
+          </w:p>
+        </w:tc>
+        <w:tc>
+          <w:tcPr/>
+          <w:p>
+            <w:pPr>
+              <w:pStyle w:val="Compact"/>
+              <w:jc w:val="center"/>
+            </w:pPr>
+            <w:r>
+              <w:t xml:space="preserve">&lt; .001</w:t>
+            </w:r>
+          </w:p>
+        </w:tc>
+      </w:tr>
+      <w:tr>
+        <w:tc>
+          <w:tcPr/>
+          <w:p>
+            <w:pPr>
+              <w:pStyle w:val="Compact"/>
+              <w:jc w:val="left"/>
+            </w:pPr>
+            <w:r>
+              <w:t xml:space="preserve">Residuals</w:t>
+            </w:r>
+          </w:p>
+        </w:tc>
+        <w:tc>
+          <w:tcPr/>
+          <w:p>
+            <w:pPr>
+              <w:pStyle w:val="Compact"/>
+              <w:jc w:val="center"/>
+            </w:pPr>
+            <w:r>
+              <w:t xml:space="preserve">3.705e+06</w:t>
+            </w:r>
+          </w:p>
+        </w:tc>
+        <w:tc>
+          <w:tcPr/>
+          <w:p>
+            <w:pPr>
+              <w:pStyle w:val="Compact"/>
+              <w:jc w:val="center"/>
+            </w:pPr>
+            <w:r>
+              <w:t xml:space="preserve">2760</w:t>
+            </w:r>
+          </w:p>
+        </w:tc>
+        <w:tc>
+          <w:tcPr/>
+          <w:p>
+            <w:pPr>
+              <w:pStyle w:val="Compact"/>
+              <w:jc w:val="center"/>
+            </w:pPr>
+            <w:r>
+              <w:t xml:space="preserve">1342.226</w:t>
+            </w:r>
+          </w:p>
+        </w:tc>
+        <w:tc>
+          <w:tcPr/>
+          <w:p>
+            <w:pPr>
+              <w:pStyle w:val="Compact"/>
+            </w:pPr>
+          </w:p>
+        </w:tc>
+        <w:tc>
+          <w:tcPr/>
+          <w:p>
+            <w:pPr>
+              <w:pStyle w:val="Compact"/>
+            </w:pPr>
+          </w:p>
+        </w:tc>
+      </w:tr>
+    </w:tbl>
     <w:p>
       <w:pPr>
-        <w:pStyle w:val="FirstParagraph"/>
+        <w:pStyle w:val="BodyText"/>
       </w:pPr>
       <w:r>
         <w:t xml:space="preserve">With</w:t>

</xml_diff>

<commit_message>
Deploying to gh-pages from @ Morrison-Lab/sds@af1574e964943c1221c6ebd7bb6d327342371d42 🚀
</commit_message>
<xml_diff>
--- a/basic-statistical-methods-handout.docx
+++ b/basic-statistical-methods-handout.docx
@@ -15,7 +15,7 @@
         <w:pStyle w:val="Date"/>
       </w:pPr>
       <w:r>
-        <w:t xml:space="preserve">Last modified: 2026-10-09 10:13:53 (PDT)</w:t>
+        <w:t xml:space="preserve">Last modified: 2026-10-09 10:25:47 (PDT)</w:t>
       </w:r>
     </w:p>
     <w:bookmarkStart w:id="13" w:name="introduction"/>
@@ -14660,125 +14660,168 @@
       <w:r>
         <w:t xml:space="preserve">, so</w:t>
       </w:r>
-      <w:r>
-        <w:t xml:space="preserve"> </w:t>
-      </w:r>
-      <m:oMath>
-        <m:sSub>
-          <m:e>
-            <m:r>
-              <m:rPr>
-                <m:nor/>
-                <m:sty m:val="p"/>
-              </m:rPr>
-              <m:t>MS</m:t>
-            </m:r>
-          </m:e>
-          <m:sub>
-            <m:r>
-              <m:rPr>
-                <m:nor/>
-                <m:sty m:val="p"/>
-              </m:rPr>
-              <m:t>between</m:t>
-            </m:r>
-          </m:sub>
-        </m:sSub>
-        <m:r>
-          <m:rPr>
-            <m:sty m:val="p"/>
-          </m:rPr>
-          <m:t>=</m:t>
-        </m:r>
-        <m:r>
-          <m:t>13.5</m:t>
-        </m:r>
-        <m:r>
-          <m:rPr>
-            <m:sty m:val="p"/>
-          </m:rPr>
-          <m:t>/</m:t>
-        </m:r>
-        <m:r>
-          <m:t>1</m:t>
-        </m:r>
-        <m:r>
-          <m:rPr>
-            <m:sty m:val="p"/>
-          </m:rPr>
-          <m:t>=</m:t>
-        </m:r>
-        <m:r>
-          <m:t>13.5</m:t>
-        </m:r>
-      </m:oMath>
-      <w:r>
-        <w:t xml:space="preserve"> </w:t>
-      </w:r>
+    </w:p>
+    <w:p>
+      <w:pPr>
+        <w:pStyle w:val="BodyText"/>
+      </w:pPr>
+      <m:oMathPara>
+        <m:oMathParaPr>
+          <m:jc m:val="center"/>
+        </m:oMathParaPr>
+        <m:oMath>
+          <m:eqArr>
+            <m:e>
+              <m:sSub>
+                <m:e>
+                  <m:r>
+                    <m:rPr>
+                      <m:nor/>
+                      <m:sty m:val="p"/>
+                    </m:rPr>
+                    <m:t>MS</m:t>
+                  </m:r>
+                </m:e>
+                <m:sub>
+                  <m:r>
+                    <m:rPr>
+                      <m:nor/>
+                      <m:sty m:val="p"/>
+                    </m:rPr>
+                    <m:t>between</m:t>
+                  </m:r>
+                </m:sub>
+              </m:sSub>
+              <m:r>
+                <m:t>&amp;</m:t>
+              </m:r>
+              <m:r>
+                <m:rPr>
+                  <m:sty m:val="p"/>
+                </m:rPr>
+                <m:t>=</m:t>
+              </m:r>
+              <m:r>
+                <m:t>13.5</m:t>
+              </m:r>
+              <m:r>
+                <m:rPr>
+                  <m:sty m:val="p"/>
+                </m:rPr>
+                <m:t>/</m:t>
+              </m:r>
+              <m:r>
+                <m:t>1</m:t>
+              </m:r>
+            </m:e>
+            <m:e>
+              <m:r>
+                <m:t>&amp;</m:t>
+              </m:r>
+              <m:r>
+                <m:rPr>
+                  <m:sty m:val="p"/>
+                </m:rPr>
+                <m:t>=</m:t>
+              </m:r>
+              <m:r>
+                <m:t>13.5</m:t>
+              </m:r>
+            </m:e>
+          </m:eqArr>
+        </m:oMath>
+      </m:oMathPara>
+    </w:p>
+    <w:p>
+      <w:pPr>
+        <w:pStyle w:val="FirstParagraph"/>
+      </w:pPr>
       <w:r>
         <w:t xml:space="preserve">and</w:t>
       </w:r>
-      <w:r>
-        <w:t xml:space="preserve"> </w:t>
-      </w:r>
-      <m:oMath>
-        <m:sSub>
-          <m:e>
-            <m:r>
-              <m:rPr>
-                <m:nor/>
-                <m:sty m:val="p"/>
-              </m:rPr>
-              <m:t>MS</m:t>
-            </m:r>
-          </m:e>
-          <m:sub>
-            <m:r>
-              <m:rPr>
-                <m:nor/>
-                <m:sty m:val="p"/>
-              </m:rPr>
-              <m:t>within</m:t>
-            </m:r>
-          </m:sub>
-        </m:sSub>
-        <m:r>
-          <m:rPr>
-            <m:sty m:val="p"/>
-          </m:rPr>
-          <m:t>=</m:t>
-        </m:r>
-        <m:r>
-          <m:t>4</m:t>
-        </m:r>
-        <m:r>
-          <m:rPr>
-            <m:sty m:val="p"/>
-          </m:rPr>
-          <m:t>/</m:t>
-        </m:r>
-        <m:r>
-          <m:t>4</m:t>
-        </m:r>
-        <m:r>
-          <m:rPr>
-            <m:sty m:val="p"/>
-          </m:rPr>
-          <m:t>=</m:t>
-        </m:r>
-        <m:r>
-          <m:t>1</m:t>
-        </m:r>
-      </m:oMath>
-      <w:r>
-        <w:t xml:space="preserve">.</w:t>
-      </w:r>
+    </w:p>
+    <w:p>
+      <w:pPr>
+        <w:pStyle w:val="BodyText"/>
+      </w:pPr>
+      <m:oMathPara>
+        <m:oMathParaPr>
+          <m:jc m:val="center"/>
+        </m:oMathParaPr>
+        <m:oMath>
+          <m:eqArr>
+            <m:e>
+              <m:sSub>
+                <m:e>
+                  <m:r>
+                    <m:rPr>
+                      <m:nor/>
+                      <m:sty m:val="p"/>
+                    </m:rPr>
+                    <m:t>MS</m:t>
+                  </m:r>
+                </m:e>
+                <m:sub>
+                  <m:r>
+                    <m:rPr>
+                      <m:nor/>
+                      <m:sty m:val="p"/>
+                    </m:rPr>
+                    <m:t>within</m:t>
+                  </m:r>
+                </m:sub>
+              </m:sSub>
+              <m:r>
+                <m:t>&amp;</m:t>
+              </m:r>
+              <m:r>
+                <m:rPr>
+                  <m:sty m:val="p"/>
+                </m:rPr>
+                <m:t>=</m:t>
+              </m:r>
+              <m:r>
+                <m:t>4</m:t>
+              </m:r>
+              <m:r>
+                <m:rPr>
+                  <m:sty m:val="p"/>
+                </m:rPr>
+                <m:t>/</m:t>
+              </m:r>
+              <m:r>
+                <m:t>4</m:t>
+              </m:r>
+            </m:e>
+            <m:e>
+              <m:r>
+                <m:t>&amp;</m:t>
+              </m:r>
+              <m:r>
+                <m:rPr>
+                  <m:sty m:val="p"/>
+                </m:rPr>
+                <m:t>=</m:t>
+              </m:r>
+              <m:r>
+                <m:t>1</m:t>
+              </m:r>
+              <m:r>
+                <m:rPr>
+                  <m:sty m:val="p"/>
+                </m:rPr>
+                <m:t>.</m:t>
+              </m:r>
+            </m:e>
+          </m:eqArr>
+        </m:oMath>
+      </m:oMathPara>
     </w:p>
     <w:bookmarkEnd w:id="67"/>
     <w:bookmarkStart w:id="69" w:name="def-one-way-anova"/>
     <w:p>
       <w:pPr>
-        <w:pStyle w:val="BodyText"/>
+        <w:pStyle w:val="FirstParagraph"/>
       </w:pPr>
       <w:r>
         <w:rPr>
@@ -14884,92 +14927,118 @@
       <w:r>
         <w:t xml:space="preserve">F-test of</w:t>
       </w:r>
-      <w:r>
-        <w:t xml:space="preserve"> </w:t>
-      </w:r>
-      <m:oMath>
-        <m:sSub>
-          <m:e>
-            <m:r>
-              <m:t>H</m:t>
-            </m:r>
-          </m:e>
-          <m:sub>
-            <m:r>
-              <m:t>0</m:t>
-            </m:r>
-          </m:sub>
-        </m:sSub>
-        <m:r>
-          <m:rPr>
-            <m:sty m:val="p"/>
-          </m:rPr>
-          <m:t>:</m:t>
-        </m:r>
-        <m:sSub>
-          <m:e>
-            <m:r>
-              <m:t>μ</m:t>
-            </m:r>
-          </m:e>
-          <m:sub>
-            <m:r>
-              <m:t>1</m:t>
-            </m:r>
-          </m:sub>
-        </m:sSub>
-        <m:r>
-          <m:rPr>
-            <m:sty m:val="p"/>
-          </m:rPr>
-          <m:t>=</m:t>
-        </m:r>
-        <m:sSub>
-          <m:e>
-            <m:r>
-              <m:t>μ</m:t>
-            </m:r>
-          </m:e>
-          <m:sub>
-            <m:r>
-              <m:t>2</m:t>
-            </m:r>
-          </m:sub>
-        </m:sSub>
-        <m:r>
-          <m:rPr>
-            <m:sty m:val="p"/>
-          </m:rPr>
-          <m:t>=</m:t>
-        </m:r>
-        <m:r>
-          <m:rPr>
-            <m:sty m:val="p"/>
-          </m:rPr>
-          <m:t>⋯</m:t>
-        </m:r>
-        <m:r>
-          <m:rPr>
-            <m:sty m:val="p"/>
-          </m:rPr>
-          <m:t>=</m:t>
-        </m:r>
-        <m:sSub>
-          <m:e>
-            <m:r>
-              <m:t>μ</m:t>
-            </m:r>
-          </m:e>
-          <m:sub>
-            <m:r>
-              <m:t>k</m:t>
-            </m:r>
-          </m:sub>
-        </m:sSub>
-      </m:oMath>
-      <w:r>
-        <w:t xml:space="preserve"> </w:t>
-      </w:r>
+    </w:p>
+    <w:p>
+      <w:pPr>
+        <w:pStyle w:val="BodyText"/>
+      </w:pPr>
+      <m:oMathPara>
+        <m:oMathParaPr>
+          <m:jc m:val="center"/>
+        </m:oMathParaPr>
+        <m:oMath>
+          <m:eqArr>
+            <m:e>
+              <m:sSub>
+                <m:e>
+                  <m:r>
+                    <m:t>H</m:t>
+                  </m:r>
+                </m:e>
+                <m:sub>
+                  <m:r>
+                    <m:t>0</m:t>
+                  </m:r>
+                </m:sub>
+              </m:sSub>
+              <m:r>
+                <m:rPr>
+                  <m:sty m:val="p"/>
+                </m:rPr>
+                <m:t>:</m:t>
+              </m:r>
+              <m:sSub>
+                <m:e>
+                  <m:r>
+                    <m:t>μ</m:t>
+                  </m:r>
+                </m:e>
+                <m:sub>
+                  <m:r>
+                    <m:t>1</m:t>
+                  </m:r>
+                </m:sub>
+              </m:sSub>
+              <m:r>
+                <m:t>&amp;</m:t>
+              </m:r>
+              <m:r>
+                <m:rPr>
+                  <m:sty m:val="p"/>
+                </m:rPr>
+                <m:t>=</m:t>
+              </m:r>
+              <m:sSub>
+                <m:e>
+                  <m:r>
+                    <m:t>μ</m:t>
+                  </m:r>
+                </m:e>
+                <m:sub>
+                  <m:r>
+                    <m:t>2</m:t>
+                  </m:r>
+                </m:sub>
+              </m:sSub>
+            </m:e>
+            <m:e>
+              <m:r>
+                <m:t>&amp;</m:t>
+              </m:r>
+              <m:r>
+                <m:rPr>
+                  <m:sty m:val="p"/>
+                </m:rPr>
+                <m:t>=</m:t>
+              </m:r>
+              <m:r>
+                <m:rPr>
+                  <m:sty m:val="p"/>
+                </m:rPr>
+                <m:t>⋯</m:t>
+              </m:r>
+            </m:e>
+            <m:e>
+              <m:r>
+                <m:t>&amp;</m:t>
+              </m:r>
+              <m:r>
+                <m:rPr>
+                  <m:sty m:val="p"/>
+                </m:rPr>
+                <m:t>=</m:t>
+              </m:r>
+              <m:sSub>
+                <m:e>
+                  <m:r>
+                    <m:t>μ</m:t>
+                  </m:r>
+                </m:e>
+                <m:sub>
+                  <m:r>
+                    <m:t>k</m:t>
+                  </m:r>
+                </m:sub>
+              </m:sSub>
+            </m:e>
+          </m:eqArr>
+        </m:oMath>
+      </m:oMathPara>
+    </w:p>
+    <w:p>
+      <w:pPr>
+        <w:pStyle w:val="FirstParagraph"/>
+      </w:pPr>
       <w:r>
         <w:t xml:space="preserve">against the alternative that at least two group means differ</w:t>
       </w:r>
@@ -15282,50 +15351,72 @@
       <w:r>
         <w:t xml:space="preserve">,</w:t>
       </w:r>
-      <w:r>
-        <w:t xml:space="preserve"> </w:t>
-      </w:r>
-      <m:oMath>
-        <m:r>
-          <m:t>F</m:t>
-        </m:r>
-        <m:r>
-          <m:rPr>
-            <m:sty m:val="p"/>
-          </m:rPr>
-          <m:t>=</m:t>
-        </m:r>
-        <m:r>
-          <m:t>13.5</m:t>
-        </m:r>
-        <m:r>
-          <m:rPr>
-            <m:sty m:val="p"/>
-          </m:rPr>
-          <m:t>/</m:t>
-        </m:r>
-        <m:r>
-          <m:t>1</m:t>
-        </m:r>
-        <m:r>
-          <m:rPr>
-            <m:sty m:val="p"/>
-          </m:rPr>
-          <m:t>=</m:t>
-        </m:r>
-        <m:r>
-          <m:t>13.5</m:t>
-        </m:r>
-      </m:oMath>
-      <w:r>
-        <w:t xml:space="preserve">.</w:t>
-      </w:r>
+    </w:p>
+    <w:p>
+      <w:pPr>
+        <w:pStyle w:val="BodyText"/>
+      </w:pPr>
+      <m:oMathPara>
+        <m:oMathParaPr>
+          <m:jc m:val="center"/>
+        </m:oMathParaPr>
+        <m:oMath>
+          <m:eqArr>
+            <m:e>
+              <m:r>
+                <m:t>F</m:t>
+              </m:r>
+              <m:r>
+                <m:t>&amp;</m:t>
+              </m:r>
+              <m:r>
+                <m:rPr>
+                  <m:sty m:val="p"/>
+                </m:rPr>
+                <m:t>=</m:t>
+              </m:r>
+              <m:r>
+                <m:t>13.5</m:t>
+              </m:r>
+              <m:r>
+                <m:rPr>
+                  <m:sty m:val="p"/>
+                </m:rPr>
+                <m:t>/</m:t>
+              </m:r>
+              <m:r>
+                <m:t>1</m:t>
+              </m:r>
+            </m:e>
+            <m:e>
+              <m:r>
+                <m:t>&amp;</m:t>
+              </m:r>
+              <m:r>
+                <m:rPr>
+                  <m:sty m:val="p"/>
+                </m:rPr>
+                <m:t>=</m:t>
+              </m:r>
+              <m:r>
+                <m:t>13.5</m:t>
+              </m:r>
+              <m:r>
+                <m:rPr>
+                  <m:sty m:val="p"/>
+                </m:rPr>
+                <m:t>.</m:t>
+              </m:r>
+            </m:e>
+          </m:eqArr>
+        </m:oMath>
+      </m:oMathPara>
     </w:p>
     <w:bookmarkEnd w:id="70"/>
     <w:bookmarkStart w:id="71" w:name="thm-anova-null"/>
     <w:p>
       <w:pPr>
-        <w:pStyle w:val="BodyText"/>
+        <w:pStyle w:val="FirstParagraph"/>
       </w:pPr>
       <w:r>
         <w:rPr>
@@ -15438,74 +15529,95 @@
       <w:r>
         <w:t xml:space="preserve">If</w:t>
       </w:r>
-      <w:r>
-        <w:t xml:space="preserve"> </w:t>
-      </w:r>
-      <m:oMath>
-        <m:sSub>
-          <m:e>
-            <m:r>
-              <m:t>H</m:t>
-            </m:r>
-          </m:e>
-          <m:sub>
-            <m:r>
-              <m:t>0</m:t>
-            </m:r>
-          </m:sub>
-        </m:sSub>
-        <m:r>
-          <m:rPr>
-            <m:sty m:val="p"/>
-          </m:rPr>
-          <m:t>:</m:t>
-        </m:r>
-        <m:sSub>
-          <m:e>
-            <m:r>
-              <m:t>μ</m:t>
-            </m:r>
-          </m:e>
-          <m:sub>
-            <m:r>
-              <m:t>1</m:t>
-            </m:r>
-          </m:sub>
-        </m:sSub>
-        <m:r>
-          <m:rPr>
-            <m:sty m:val="p"/>
-          </m:rPr>
-          <m:t>=</m:t>
-        </m:r>
-        <m:r>
-          <m:rPr>
-            <m:sty m:val="p"/>
-          </m:rPr>
-          <m:t>⋯</m:t>
-        </m:r>
-        <m:r>
-          <m:rPr>
-            <m:sty m:val="p"/>
-          </m:rPr>
-          <m:t>=</m:t>
-        </m:r>
-        <m:sSub>
-          <m:e>
-            <m:r>
-              <m:t>μ</m:t>
-            </m:r>
-          </m:e>
-          <m:sub>
-            <m:r>
-              <m:t>k</m:t>
-            </m:r>
-          </m:sub>
-        </m:sSub>
-      </m:oMath>
-      <w:r>
-        <w:t xml:space="preserve"> </w:t>
-      </w:r>
+    </w:p>
+    <w:p>
+      <w:pPr>
+        <w:pStyle w:val="BodyText"/>
+      </w:pPr>
+      <m:oMathPara>
+        <m:oMathParaPr>
+          <m:jc m:val="center"/>
+        </m:oMathParaPr>
+        <m:oMath>
+          <m:eqArr>
+            <m:e>
+              <m:sSub>
+                <m:e>
+                  <m:r>
+                    <m:t>H</m:t>
+                  </m:r>
+                </m:e>
+                <m:sub>
+                  <m:r>
+                    <m:t>0</m:t>
+                  </m:r>
+                </m:sub>
+              </m:sSub>
+              <m:r>
+                <m:rPr>
+                  <m:sty m:val="p"/>
+                </m:rPr>
+                <m:t>:</m:t>
+              </m:r>
+              <m:sSub>
+                <m:e>
+                  <m:r>
+                    <m:t>μ</m:t>
+                  </m:r>
+                </m:e>
+                <m:sub>
+                  <m:r>
+                    <m:t>1</m:t>
+                  </m:r>
+                </m:sub>
+              </m:sSub>
+              <m:r>
+                <m:t>&amp;</m:t>
+              </m:r>
+              <m:r>
+                <m:rPr>
+                  <m:sty m:val="p"/>
+                </m:rPr>
+                <m:t>=</m:t>
+              </m:r>
+              <m:r>
+                <m:rPr>
+                  <m:sty m:val="p"/>
+                </m:rPr>
+                <m:t>⋯</m:t>
+              </m:r>
+            </m:e>
+            <m:e>
+              <m:r>
+                <m:t>&amp;</m:t>
+              </m:r>
+              <m:r>
+                <m:rPr>
+                  <m:sty m:val="p"/>
+                </m:rPr>
+                <m:t>=</m:t>
+              </m:r>
+              <m:sSub>
+                <m:e>
+                  <m:r>
+                    <m:t>μ</m:t>
+                  </m:r>
+                </m:e>
+                <m:sub>
+                  <m:r>
+                    <m:t>k</m:t>
+                  </m:r>
+                </m:sub>
+              </m:sSub>
+            </m:e>
+          </m:eqArr>
+        </m:oMath>
+      </m:oMathPara>
+    </w:p>
+    <w:p>
+      <w:pPr>
+        <w:pStyle w:val="FirstParagraph"/>
+      </w:pPr>
       <w:r>
         <w:t xml:space="preserve">holds,</w:t>
       </w:r>

</xml_diff>

<commit_message>
Deploying to gh-pages from @ Morrison-Lab/sds@a49439b2053ae3043cef2676491f8271585e5504 🚀
</commit_message>
<xml_diff>
--- a/basic-statistical-methods-handout.docx
+++ b/basic-statistical-methods-handout.docx
@@ -15,7 +15,7 @@
         <w:pStyle w:val="Date"/>
       </w:pPr>
       <w:r>
-        <w:t xml:space="preserve">Last modified: 2026-10-12 20:54:41 (PDT)</w:t>
+        <w:t xml:space="preserve">Last modified: 2026-10-12 22:10:07 (PDT)</w:t>
       </w:r>
     </w:p>
     <w:bookmarkStart w:id="13" w:name="introduction"/>
@@ -10555,11 +10555,45 @@
         </m:oMath>
       </m:oMathPara>
     </w:p>
+    <w:p>
+      <w:pPr>
+        <w:pStyle w:val="FirstParagraph"/>
+      </w:pPr>
+      <w:r>
+        <w:t xml:space="preserve">When the two populations share one variance</w:t>
+      </w:r>
+      <w:r>
+        <w:t xml:space="preserve"> </w:t>
+      </w:r>
+      <m:oMath>
+        <m:sSup>
+          <m:e>
+            <m:r>
+              <m:t>σ</m:t>
+            </m:r>
+          </m:e>
+          <m:sup>
+            <m:r>
+              <m:t>2</m:t>
+            </m:r>
+          </m:sup>
+        </m:sSup>
+      </m:oMath>
+      <w:r>
+        <w:t xml:space="preserve">,</w:t>
+      </w:r>
+      <w:r>
+        <w:t xml:space="preserve"> </w:t>
+      </w:r>
+      <w:r>
+        <w:t xml:space="preserve">the pooled variance estimates it.</w:t>
+      </w:r>
+    </w:p>
     <w:bookmarkEnd w:id="50"/>
     <w:bookmarkStart w:id="51" w:name="exm-pooled-variance"/>
     <w:p>
       <w:pPr>
-        <w:pStyle w:val="FirstParagraph"/>
+        <w:pStyle w:val="BodyText"/>
       </w:pPr>
       <w:r>
         <w:rPr>
@@ -14582,6 +14616,77 @@
       </m:oMath>
       <w:r>
         <w:t xml:space="preserve">.</w:t>
+      </w:r>
+      <w:r>
+        <w:t xml:space="preserve"> </w:t>
+      </w:r>
+      <w:r>
+        <w:t xml:space="preserve">When the</w:t>
+      </w:r>
+      <w:r>
+        <w:t xml:space="preserve"> </w:t>
+      </w:r>
+      <m:oMath>
+        <m:r>
+          <m:t>k</m:t>
+        </m:r>
+      </m:oMath>
+      <w:r>
+        <w:t xml:space="preserve"> </w:t>
+      </w:r>
+      <w:r>
+        <w:t xml:space="preserve">groups share one variance</w:t>
+      </w:r>
+      <w:r>
+        <w:t xml:space="preserve"> </w:t>
+      </w:r>
+      <m:oMath>
+        <m:sSup>
+          <m:e>
+            <m:r>
+              <m:t>σ</m:t>
+            </m:r>
+          </m:e>
+          <m:sup>
+            <m:r>
+              <m:t>2</m:t>
+            </m:r>
+          </m:sup>
+        </m:sSup>
+      </m:oMath>
+      <w:r>
+        <w:t xml:space="preserve">,</w:t>
+      </w:r>
+      <w:r>
+        <w:t xml:space="preserve"> </w:t>
+      </w:r>
+      <m:oMath>
+        <m:sSub>
+          <m:e>
+            <m:r>
+              <m:rPr>
+                <m:nor/>
+                <m:sty m:val="p"/>
+              </m:rPr>
+              <m:t>MS</m:t>
+            </m:r>
+          </m:e>
+          <m:sub>
+            <m:r>
+              <m:rPr>
+                <m:nor/>
+                <m:sty m:val="p"/>
+              </m:rPr>
+              <m:t>within</m:t>
+            </m:r>
+          </m:sub>
+        </m:sSub>
+      </m:oMath>
+      <w:r>
+        <w:t xml:space="preserve"> </w:t>
+      </w:r>
+      <w:r>
+        <w:t xml:space="preserve">estimates it.</w:t>
       </w:r>
     </w:p>
     <w:bookmarkEnd w:id="66"/>

</xml_diff>

<commit_message>
Deploying to gh-pages from @ Morrison-Lab/sds@b83305dfe1ca0555177a9099a3257412280f48c9 🚀
</commit_message>
<xml_diff>
--- a/basic-statistical-methods-handout.docx
+++ b/basic-statistical-methods-handout.docx
@@ -15,7 +15,7 @@
         <w:pStyle w:val="Date"/>
       </w:pPr>
       <w:r>
-        <w:t xml:space="preserve">Last modified: 2026-10-13 19:33:04 (PDT)</w:t>
+        <w:t xml:space="preserve">Last modified: 2026-10-13 22:24:25 (PDT)</w:t>
       </w:r>
     </w:p>
     <w:bookmarkStart w:id="13" w:name="introduction"/>
@@ -3880,7 +3880,7 @@
     </w:p>
     <w:bookmarkEnd w:id="24"/>
     <w:bookmarkEnd w:id="25"/>
-    <w:bookmarkStart w:id="61" w:name="sec-two-group-continuous"/>
+    <w:bookmarkStart w:id="62" w:name="sec-two-group-continuous"/>
     <w:p>
       <w:pPr>
         <w:pStyle w:val="Heading2"/>
@@ -7550,7 +7550,7 @@
     </w:p>
     <w:bookmarkEnd w:id="40"/>
     <w:bookmarkEnd w:id="41"/>
-    <w:bookmarkStart w:id="56" w:name="sec-two-sample-t-test"/>
+    <w:bookmarkStart w:id="57" w:name="sec-two-sample-t-test"/>
     <w:p>
       <w:pPr>
         <w:pStyle w:val="Heading3"/>
@@ -10555,45 +10555,11 @@
         </m:oMath>
       </m:oMathPara>
     </w:p>
-    <w:p>
-      <w:pPr>
-        <w:pStyle w:val="FirstParagraph"/>
-      </w:pPr>
-      <w:r>
-        <w:t xml:space="preserve">When the two populations share one variance</w:t>
-      </w:r>
-      <w:r>
-        <w:t xml:space="preserve"> </w:t>
-      </w:r>
-      <m:oMath>
-        <m:sSup>
-          <m:e>
-            <m:r>
-              <m:t>σ</m:t>
-            </m:r>
-          </m:e>
-          <m:sup>
-            <m:r>
-              <m:t>2</m:t>
-            </m:r>
-          </m:sup>
-        </m:sSup>
-      </m:oMath>
-      <w:r>
-        <w:t xml:space="preserve">,</w:t>
-      </w:r>
-      <w:r>
-        <w:t xml:space="preserve"> </w:t>
-      </w:r>
-      <w:r>
-        <w:t xml:space="preserve">the pooled variance estimates it.</w:t>
-      </w:r>
-    </w:p>
     <w:bookmarkEnd w:id="50"/>
     <w:bookmarkStart w:id="51" w:name="exm-pooled-variance"/>
     <w:p>
       <w:pPr>
-        <w:pStyle w:val="BodyText"/>
+        <w:pStyle w:val="FirstParagraph"/>
       </w:pPr>
       <w:r>
         <w:rPr>
@@ -11007,7 +10973,53 @@
       </w:r>
     </w:p>
     <w:bookmarkEnd w:id="51"/>
-    <w:bookmarkStart w:id="52" w:name="def-pooled-t-test"/>
+    <w:bookmarkStart w:id="52" w:name="rem-pooled-variance-estimates"/>
+    <w:p>
+      <w:pPr>
+        <w:pStyle w:val="BodyText"/>
+      </w:pPr>
+      <w:r>
+        <w:rPr>
+          <w:i/>
+          <w:iCs/>
+        </w:rPr>
+        <w:t xml:space="preserve">Remark 3</w:t>
+      </w:r>
+      <w:r>
+        <w:t xml:space="preserve"> (What the pooled variance estimates). </w:t>
+      </w:r>
+      <w:r>
+        <w:t xml:space="preserve">When the two populations share one variance</w:t>
+      </w:r>
+      <w:r>
+        <w:t xml:space="preserve"> </w:t>
+      </w:r>
+      <m:oMath>
+        <m:sSup>
+          <m:e>
+            <m:r>
+              <m:t>σ</m:t>
+            </m:r>
+          </m:e>
+          <m:sup>
+            <m:r>
+              <m:t>2</m:t>
+            </m:r>
+          </m:sup>
+        </m:sSup>
+      </m:oMath>
+      <w:r>
+        <w:t xml:space="preserve">,</w:t>
+      </w:r>
+      <w:r>
+        <w:t xml:space="preserve"> </w:t>
+      </w:r>
+      <w:r>
+        <w:t xml:space="preserve">the pooled variance estimates it.</w:t>
+      </w:r>
+    </w:p>
+    <w:bookmarkEnd w:id="52"/>
+    <w:bookmarkStart w:id="53" w:name="def-pooled-t-test"/>
     <w:p>
       <w:pPr>
         <w:pStyle w:val="BodyText"/>
@@ -11502,8 +11514,8 @@
         <w:t xml:space="preserve">distribution.</w:t>
       </w:r>
     </w:p>
-    <w:bookmarkEnd w:id="52"/>
-    <w:bookmarkStart w:id="53" w:name="thm-pooled-t-null"/>
+    <w:bookmarkEnd w:id="53"/>
+    <w:bookmarkStart w:id="54" w:name="thm-pooled-t-null"/>
     <w:p>
       <w:pPr>
         <w:pStyle w:val="BodyText"/>
@@ -11662,8 +11674,8 @@
         <w:t xml:space="preserve">.</w:t>
       </w:r>
     </w:p>
-    <w:bookmarkEnd w:id="53"/>
-    <w:bookmarkStart w:id="54" w:name="rem-pooled-t-equal-variances"/>
+    <w:bookmarkEnd w:id="54"/>
+    <w:bookmarkStart w:id="55" w:name="rem-pooled-t-equal-variances"/>
     <w:p>
       <w:pPr>
         <w:pStyle w:val="BodyText"/>
@@ -11673,7 +11685,7 @@
           <w:i/>
           <w:iCs/>
         </w:rPr>
-        <w:t xml:space="preserve">Remark 3</w:t>
+        <w:t xml:space="preserve">Remark 4</w:t>
       </w:r>
       <w:r>
         <w:t xml:space="preserve"> (The equal-variance assumption). </w:t>
@@ -11716,8 +11728,8 @@
         <w:t xml:space="preserve">so these notes use Welch’s test by default.</w:t>
       </w:r>
     </w:p>
-    <w:bookmarkEnd w:id="54"/>
-    <w:bookmarkStart w:id="55" w:name="exm-hers-pooled-ttest"/>
+    <w:bookmarkEnd w:id="55"/>
+    <w:bookmarkStart w:id="56" w:name="exm-hers-pooled-ttest"/>
     <w:p>
       <w:pPr>
         <w:pStyle w:val="BodyText"/>
@@ -11920,9 +11932,9 @@
         <w:t xml:space="preserve">#&gt;   111.854   112.449</w:t>
       </w:r>
     </w:p>
-    <w:bookmarkEnd w:id="55"/>
     <w:bookmarkEnd w:id="56"/>
-    <w:bookmarkStart w:id="60" w:name="sec-CI-diff-means"/>
+    <w:bookmarkEnd w:id="57"/>
+    <w:bookmarkStart w:id="61" w:name="sec-CI-diff-means"/>
     <w:p>
       <w:pPr>
         <w:pStyle w:val="Heading3"/>
@@ -11931,7 +11943,7 @@
         <w:t xml:space="preserve">4.5 Confidence intervals for the difference in means</w:t>
       </w:r>
     </w:p>
-    <w:bookmarkStart w:id="58" w:name="def-ci-diff-means"/>
+    <w:bookmarkStart w:id="59" w:name="def-ci-diff-means"/>
     <w:p>
       <w:pPr>
         <w:pStyle w:val="FirstParagraph"/>
@@ -12446,7 +12458,7 @@
       <w:r>
         <w:t xml:space="preserve"> </w:t>
       </w:r>
-      <w:hyperlink r:id="rId57">
+      <w:hyperlink r:id="rId58">
         <w:r>
           <w:rPr>
             <w:rStyle w:val="Hyperlink"/>
@@ -12458,8 +12470,8 @@
         <w:t xml:space="preserve">.</w:t>
       </w:r>
     </w:p>
-    <w:bookmarkEnd w:id="58"/>
-    <w:bookmarkStart w:id="59" w:name="exm-hers-diff-means-ci"/>
+    <w:bookmarkEnd w:id="59"/>
+    <w:bookmarkStart w:id="60" w:name="exm-hers-diff-means-ci"/>
     <w:p>
       <w:pPr>
         <w:pStyle w:val="BodyText"/>
@@ -12776,10 +12788,10 @@
         <w:t xml:space="preserve">It contains 0, consistent with the large p-value there.</w:t>
       </w:r>
     </w:p>
-    <w:bookmarkEnd w:id="59"/>
     <w:bookmarkEnd w:id="60"/>
     <w:bookmarkEnd w:id="61"/>
-    <w:bookmarkStart w:id="75" w:name="sec-anova"/>
+    <w:bookmarkEnd w:id="62"/>
+    <w:bookmarkStart w:id="76" w:name="sec-anova"/>
     <w:p>
       <w:pPr>
         <w:pStyle w:val="Heading2"/>
@@ -12788,7 +12800,7 @@
         <w:t xml:space="preserve">5 One-way analysis of variance</w:t>
       </w:r>
     </w:p>
-    <w:bookmarkStart w:id="62" w:name="def-ss-between"/>
+    <w:bookmarkStart w:id="63" w:name="def-ss-between"/>
     <w:p>
       <w:pPr>
         <w:pStyle w:val="FirstParagraph"/>
@@ -13276,8 +13288,8 @@
         </m:oMath>
       </m:oMathPara>
     </w:p>
-    <w:bookmarkEnd w:id="62"/>
-    <w:bookmarkStart w:id="63" w:name="exm-ss-between"/>
+    <w:bookmarkEnd w:id="63"/>
+    <w:bookmarkStart w:id="64" w:name="exm-ss-between"/>
     <w:p>
       <w:pPr>
         <w:pStyle w:val="FirstParagraph"/>
@@ -13723,8 +13735,8 @@
         </m:oMath>
       </m:oMathPara>
     </w:p>
-    <w:bookmarkEnd w:id="63"/>
-    <w:bookmarkStart w:id="64" w:name="def-ss-within"/>
+    <w:bookmarkEnd w:id="64"/>
+    <w:bookmarkStart w:id="65" w:name="def-ss-within"/>
     <w:p>
       <w:pPr>
         <w:pStyle w:val="FirstParagraph"/>
@@ -13964,8 +13976,8 @@
         </m:oMath>
       </m:oMathPara>
     </w:p>
-    <w:bookmarkEnd w:id="64"/>
-    <w:bookmarkStart w:id="65" w:name="exm-ss-within"/>
+    <w:bookmarkEnd w:id="65"/>
+    <w:bookmarkStart w:id="66" w:name="exm-ss-within"/>
     <w:p>
       <w:pPr>
         <w:pStyle w:val="FirstParagraph"/>
@@ -14379,8 +14391,8 @@
         </m:oMath>
       </m:oMathPara>
     </w:p>
-    <w:bookmarkEnd w:id="65"/>
-    <w:bookmarkStart w:id="66" w:name="def-mean-squares"/>
+    <w:bookmarkEnd w:id="66"/>
+    <w:bookmarkStart w:id="67" w:name="def-mean-squares"/>
     <w:p>
       <w:pPr>
         <w:pStyle w:val="FirstParagraph"/>
@@ -14689,8 +14701,8 @@
         <w:t xml:space="preserve">estimates it.</w:t>
       </w:r>
     </w:p>
-    <w:bookmarkEnd w:id="66"/>
-    <w:bookmarkStart w:id="67" w:name="exm-mean-squares"/>
+    <w:bookmarkEnd w:id="67"/>
+    <w:bookmarkStart w:id="68" w:name="exm-mean-squares"/>
     <w:p>
       <w:pPr>
         <w:pStyle w:val="BodyText"/>
@@ -14922,8 +14934,8 @@
         </m:oMath>
       </m:oMathPara>
     </w:p>
-    <w:bookmarkEnd w:id="67"/>
-    <w:bookmarkStart w:id="69" w:name="def-one-way-anova"/>
+    <w:bookmarkEnd w:id="68"/>
+    <w:bookmarkStart w:id="70" w:name="def-one-way-anova"/>
     <w:p>
       <w:pPr>
         <w:pStyle w:val="FirstParagraph"/>
@@ -15385,7 +15397,7 @@
       <w:r>
         <w:t xml:space="preserve">distribution (</w:t>
       </w:r>
-      <w:hyperlink r:id="rId68">
+      <w:hyperlink r:id="rId69">
         <w:r>
           <w:rPr>
             <w:rStyle w:val="Hyperlink"/>
@@ -15397,8 +15409,8 @@
         <w:t xml:space="preserve">).</w:t>
       </w:r>
     </w:p>
-    <w:bookmarkEnd w:id="69"/>
-    <w:bookmarkStart w:id="70" w:name="rem-f-statistic-size"/>
+    <w:bookmarkEnd w:id="70"/>
+    <w:bookmarkStart w:id="71" w:name="rem-f-statistic-size"/>
     <w:p>
       <w:pPr>
         <w:pStyle w:val="BodyText"/>
@@ -15408,7 +15420,7 @@
           <w:i/>
           <w:iCs/>
         </w:rPr>
-        <w:t xml:space="preserve">Remark 4</w:t>
+        <w:t xml:space="preserve">Remark 5</w:t>
       </w:r>
       <w:r>
         <w:t xml:space="preserve"> (Interpreting the F statistic). </w:t>
@@ -15517,8 +15529,8 @@
         </m:oMath>
       </m:oMathPara>
     </w:p>
-    <w:bookmarkEnd w:id="70"/>
-    <w:bookmarkStart w:id="71" w:name="thm-anova-null"/>
+    <w:bookmarkEnd w:id="71"/>
+    <w:bookmarkStart w:id="72" w:name="thm-anova-null"/>
     <w:p>
       <w:pPr>
         <w:pStyle w:val="FirstParagraph"/>
@@ -15826,8 +15838,8 @@
         <w:t xml:space="preserve">.</w:t>
       </w:r>
     </w:p>
-    <w:bookmarkEnd w:id="71"/>
-    <w:bookmarkStart w:id="72" w:name="exm-hers-anova"/>
+    <w:bookmarkEnd w:id="72"/>
+    <w:bookmarkStart w:id="73" w:name="exm-hers-anova"/>
     <w:p>
       <w:pPr>
         <w:pStyle w:val="BodyText"/>
@@ -17335,8 +17347,8 @@
         <w:t xml:space="preserve">mean fasting glucose differs among the three race/ethnicity groups.</w:t>
       </w:r>
     </w:p>
-    <w:bookmarkEnd w:id="72"/>
-    <w:bookmarkStart w:id="73" w:name="rem-hers-anova-variances"/>
+    <w:bookmarkEnd w:id="73"/>
+    <w:bookmarkStart w:id="74" w:name="rem-hers-anova-variances"/>
     <w:p>
       <w:pPr>
         <w:pStyle w:val="BodyText"/>
@@ -17346,7 +17358,7 @@
           <w:i/>
           <w:iCs/>
         </w:rPr>
-        <w:t xml:space="preserve">Remark 5</w:t>
+        <w:t xml:space="preserve">Remark 6</w:t>
       </w:r>
       <w:r>
         <w:t xml:space="preserve"> (Unequal variances in the HERS glucose groups). </w:t>
@@ -17503,7 +17515,7 @@
         <w:t xml:space="preserve">#&gt; F = 12.49, num df = 2.0, denom df = 185.7, p-value = 8.17e-06</w:t>
       </w:r>
     </w:p>
-    <w:bookmarkEnd w:id="73"/>
+    <w:bookmarkEnd w:id="74"/>
     <w:p>
       <w:pPr>
         <w:pStyle w:val="FirstParagraph"/>
@@ -17535,7 +17547,7 @@
       <w:r>
         <w:t xml:space="preserve">(</w:t>
       </w:r>
-      <w:hyperlink r:id="rId74">
+      <w:hyperlink r:id="rId75">
         <w:r>
           <w:rPr>
             <w:rStyle w:val="Hyperlink"/>
@@ -18292,8 +18304,8 @@
         <w:t xml:space="preserve">#&gt;  0.180281  0.180281</w:t>
       </w:r>
     </w:p>
-    <w:bookmarkEnd w:id="75"/>
-    <w:bookmarkStart w:id="82" w:name="references"/>
+    <w:bookmarkEnd w:id="76"/>
+    <w:bookmarkStart w:id="83" w:name="references"/>
     <w:p>
       <w:pPr>
         <w:pStyle w:val="Heading2"/>
@@ -18302,8 +18314,8 @@
         <w:t xml:space="preserve">References</w:t>
       </w:r>
     </w:p>
-    <w:bookmarkStart w:id="81" w:name="refs"/>
-    <w:bookmarkStart w:id="76" w:name="ref-hoggtanis2015"/>
+    <w:bookmarkStart w:id="82" w:name="refs"/>
+    <w:bookmarkStart w:id="77" w:name="ref-hoggtanis2015"/>
     <w:p>
       <w:pPr>
         <w:pStyle w:val="Bibliography"/>
@@ -18325,8 +18337,8 @@
         <w:t xml:space="preserve">. Tenth edition. Pearson.</w:t>
       </w:r>
     </w:p>
-    <w:bookmarkEnd w:id="76"/>
-    <w:bookmarkStart w:id="78" w:name="ref-HulleyStephen1998RToE"/>
+    <w:bookmarkEnd w:id="77"/>
+    <w:bookmarkStart w:id="79" w:name="ref-HulleyStephen1998RToE"/>
     <w:p>
       <w:pPr>
         <w:pStyle w:val="Bibliography"/>
@@ -18359,7 +18371,7 @@
       <w:r>
         <w:t xml:space="preserve"> </w:t>
       </w:r>
-      <w:hyperlink r:id="rId77">
+      <w:hyperlink r:id="rId78">
         <w:r>
           <w:rPr>
             <w:rStyle w:val="Hyperlink"/>
@@ -18371,8 +18383,8 @@
         <w:t xml:space="preserve">.</w:t>
       </w:r>
     </w:p>
-    <w:bookmarkEnd w:id="78"/>
-    <w:bookmarkStart w:id="80" w:name="ref-vittinghoff2e"/>
+    <w:bookmarkEnd w:id="79"/>
+    <w:bookmarkStart w:id="81" w:name="ref-vittinghoff2e"/>
     <w:p>
       <w:pPr>
         <w:pStyle w:val="Bibliography"/>
@@ -18396,7 +18408,7 @@
       <w:r>
         <w:t xml:space="preserve"> </w:t>
       </w:r>
-      <w:hyperlink r:id="rId79">
+      <w:hyperlink r:id="rId80">
         <w:r>
           <w:rPr>
             <w:rStyle w:val="Hyperlink"/>
@@ -18408,9 +18420,9 @@
         <w:t xml:space="preserve">.</w:t>
       </w:r>
     </w:p>
-    <w:bookmarkEnd w:id="80"/>
     <w:bookmarkEnd w:id="81"/>
     <w:bookmarkEnd w:id="82"/>
+    <w:bookmarkEnd w:id="83"/>
     <w:sectPr>
       <w:footnotePr>
         <w:numRestart w:val="eachSect"/>

</xml_diff>

<commit_message>
Deploying to gh-pages from @ Morrison-Lab/sds@edfa494871eb2d944f18ca58e7f1eb34f85fdd31 🚀
</commit_message>
<xml_diff>
--- a/basic-statistical-methods-handout.docx
+++ b/basic-statistical-methods-handout.docx
@@ -15,7 +15,7 @@
         <w:pStyle w:val="Date"/>
       </w:pPr>
       <w:r>
-        <w:t xml:space="preserve">Last modified: 2026-10-15 13:11:03 (PDT)</w:t>
+        <w:t xml:space="preserve">Last modified: 2026-10-15 13:27:16 (PDT)</w:t>
       </w:r>
     </w:p>
     <w:bookmarkStart w:id="13" w:name="introduction"/>
@@ -11933,6 +11933,60 @@
       </w:r>
     </w:p>
     <w:bookmarkEnd w:id="56"/>
+    <w:p>
+      <w:pPr>
+        <w:pStyle w:val="Compact"/>
+        <w:numPr>
+          <w:ilvl w:val="0"/>
+          <w:numId w:val="1003"/>
+        </w:numPr>
+      </w:pPr>
+      <w:r>
+        <w:t xml:space="preserve">Hogg et al. (2019, sec. 8.2, pp. 369–377)</w:t>
+      </w:r>
+      <w:r>
+        <w:t xml:space="preserve"> </w:t>
+      </w:r>
+      <w:r>
+        <w:t xml:space="preserve">covers tests of the equality of two means.</w:t>
+      </w:r>
+    </w:p>
+    <w:p>
+      <w:pPr>
+        <w:pStyle w:val="Compact"/>
+        <w:numPr>
+          <w:ilvl w:val="0"/>
+          <w:numId w:val="1003"/>
+        </w:numPr>
+      </w:pPr>
+      <w:r>
+        <w:t xml:space="preserve">Rice (2007, sec. 11.2.1, pp. 421–432)</w:t>
+      </w:r>
+      <w:r>
+        <w:t xml:space="preserve"> </w:t>
+      </w:r>
+      <w:r>
+        <w:t xml:space="preserve">covers normal-theory methods for two independent samples.</w:t>
+      </w:r>
+    </w:p>
+    <w:p>
+      <w:pPr>
+        <w:pStyle w:val="Compact"/>
+        <w:numPr>
+          <w:ilvl w:val="0"/>
+          <w:numId w:val="1003"/>
+        </w:numPr>
+      </w:pPr>
+      <w:r>
+        <w:t xml:space="preserve">Rice (2007, sec. 11.3.1, pp. 446–447)</w:t>
+      </w:r>
+      <w:r>
+        <w:t xml:space="preserve"> </w:t>
+      </w:r>
+      <w:r>
+        <w:t xml:space="preserve">covers normal-theory methods for paired samples.</w:t>
+      </w:r>
+    </w:p>
     <w:bookmarkEnd w:id="57"/>
     <w:bookmarkStart w:id="61" w:name="sec-CI-diff-means"/>
     <w:p>
@@ -12789,6 +12843,20 @@
       </w:r>
     </w:p>
     <w:bookmarkEnd w:id="60"/>
+    <w:p>
+      <w:pPr>
+        <w:pStyle w:val="BodyText"/>
+      </w:pPr>
+      <w:r>
+        <w:t xml:space="preserve">Hogg et al. (2019, sec. 7.2, pp. 314–322)</w:t>
+      </w:r>
+      <w:r>
+        <w:t xml:space="preserve"> </w:t>
+      </w:r>
+      <w:r>
+        <w:t xml:space="preserve">covers confidence intervals for the difference of two means.</w:t>
+      </w:r>
+    </w:p>
     <w:bookmarkEnd w:id="61"/>
     <w:bookmarkEnd w:id="62"/>
     <w:bookmarkStart w:id="76" w:name="sec-anova"/>
@@ -18304,8 +18372,62 @@
         <w:t xml:space="preserve">#&gt;  0.180281  0.180281</w:t>
       </w:r>
     </w:p>
+    <w:p>
+      <w:pPr>
+        <w:pStyle w:val="Compact"/>
+        <w:numPr>
+          <w:ilvl w:val="0"/>
+          <w:numId w:val="1004"/>
+        </w:numPr>
+      </w:pPr>
+      <w:r>
+        <w:t xml:space="preserve">Hogg et al. (2019, sec. 9.3, pp. 446–455)</w:t>
+      </w:r>
+      <w:r>
+        <w:t xml:space="preserve"> </w:t>
+      </w:r>
+      <w:r>
+        <w:t xml:space="preserve">covers one-factor analysis of variance.</w:t>
+      </w:r>
+    </w:p>
+    <w:p>
+      <w:pPr>
+        <w:pStyle w:val="Compact"/>
+        <w:numPr>
+          <w:ilvl w:val="0"/>
+          <w:numId w:val="1004"/>
+        </w:numPr>
+      </w:pPr>
+      <w:r>
+        <w:t xml:space="preserve">Casella and Berger (2002, sec. 11.2, pp. 522–538)</w:t>
+      </w:r>
+      <w:r>
+        <w:t xml:space="preserve"> </w:t>
+      </w:r>
+      <w:r>
+        <w:t xml:space="preserve">covers oneway analysis of variance.</w:t>
+      </w:r>
+    </w:p>
+    <w:p>
+      <w:pPr>
+        <w:pStyle w:val="Compact"/>
+        <w:numPr>
+          <w:ilvl w:val="0"/>
+          <w:numId w:val="1004"/>
+        </w:numPr>
+      </w:pPr>
+      <w:r>
+        <w:t xml:space="preserve">Rice (2007, sec. 12.2, pp. 477–488)</w:t>
+      </w:r>
+      <w:r>
+        <w:t xml:space="preserve"> </w:t>
+      </w:r>
+      <w:r>
+        <w:t xml:space="preserve">covers the one-way layout.</w:t>
+      </w:r>
+    </w:p>
     <w:bookmarkEnd w:id="76"/>
-    <w:bookmarkStart w:id="83" w:name="references"/>
+    <w:bookmarkStart w:id="86" w:name="references"/>
     <w:p>
       <w:pPr>
         <w:pStyle w:val="Heading2"/>
@@ -18314,14 +18436,14 @@
         <w:t xml:space="preserve">References</w:t>
       </w:r>
     </w:p>
-    <w:bookmarkStart w:id="82" w:name="refs"/>
-    <w:bookmarkStart w:id="77" w:name="ref-hoggtanis2015"/>
+    <w:bookmarkStart w:id="85" w:name="refs"/>
+    <w:bookmarkStart w:id="78" w:name="ref-CaseBerg01"/>
     <w:p>
       <w:pPr>
         <w:pStyle w:val="Bibliography"/>
       </w:pPr>
       <w:r>
-        <w:t xml:space="preserve">Hogg, Robert V., Elliot A. Tanis, and Dale L. Zimmerman. 2019.</w:t>
+        <w:t xml:space="preserve">Casella, George, and Roger Berger. 2002.</w:t>
       </w:r>
       <w:r>
         <w:t xml:space="preserve"> </w:t>
@@ -18331,26 +18453,34 @@
           <w:i/>
           <w:iCs/>
         </w:rPr>
-        <w:t xml:space="preserve">Probability and Statistical Inference</w:t>
-      </w:r>
-      <w:r>
-        <w:t xml:space="preserve">. Tenth edition. Pearson.</w:t>
+        <w:t xml:space="preserve">Statistical Inference</w:t>
+      </w:r>
+      <w:r>
+        <w:t xml:space="preserve">. 2nd ed. Cengage Learning.</w:t>
+      </w:r>
+      <w:r>
+        <w:t xml:space="preserve"> </w:t>
+      </w:r>
+      <w:hyperlink r:id="rId77">
+        <w:r>
+          <w:rPr>
+            <w:rStyle w:val="Hyperlink"/>
+          </w:rPr>
+          <w:t xml:space="preserve">https://www.cengage.com/c/statistical-inference-2e-casella-berger/9780534243128/</w:t>
+        </w:r>
+      </w:hyperlink>
+      <w:r>
+        <w:t xml:space="preserve">.</w:t>
       </w:r>
     </w:p>
-    <w:bookmarkEnd w:id="77"/>
-    <w:bookmarkStart w:id="79" w:name="ref-HulleyStephen1998RToE"/>
+    <w:bookmarkEnd w:id="78"/>
+    <w:bookmarkStart w:id="79" w:name="ref-hoggtanis2015"/>
     <w:p>
       <w:pPr>
         <w:pStyle w:val="Bibliography"/>
       </w:pPr>
       <w:r>
-        <w:t xml:space="preserve">Hulley, Stephen, Deborah Grady, Trudy Bush, et al. 1998.</w:t>
-      </w:r>
-      <w:r>
-        <w:t xml:space="preserve"> </w:t>
-      </w:r>
-      <w:r>
-        <w:t xml:space="preserve">“Randomized Trial of Estrogen Plus Progestin for Secondary Prevention of Coronary Heart Disease in Postmenopausal Women.”</w:t>
+        <w:t xml:space="preserve">Hogg, Robert V., Elliot A. Tanis, and Dale L. Zimmerman. 2019.</w:t>
       </w:r>
       <w:r>
         <w:t xml:space="preserve"> </w:t>
@@ -18360,6 +18490,35 @@
           <w:i/>
           <w:iCs/>
         </w:rPr>
+        <w:t xml:space="preserve">Probability and Statistical Inference</w:t>
+      </w:r>
+      <w:r>
+        <w:t xml:space="preserve">. Tenth edition. Pearson.</w:t>
+      </w:r>
+    </w:p>
+    <w:bookmarkEnd w:id="79"/>
+    <w:bookmarkStart w:id="81" w:name="ref-HulleyStephen1998RToE"/>
+    <w:p>
+      <w:pPr>
+        <w:pStyle w:val="Bibliography"/>
+      </w:pPr>
+      <w:r>
+        <w:t xml:space="preserve">Hulley, Stephen, Deborah Grady, Trudy Bush, et al. 1998.</w:t>
+      </w:r>
+      <w:r>
+        <w:t xml:space="preserve"> </w:t>
+      </w:r>
+      <w:r>
+        <w:t xml:space="preserve">“Randomized Trial of Estrogen Plus Progestin for Secondary Prevention of Coronary Heart Disease in Postmenopausal Women.”</w:t>
+      </w:r>
+      <w:r>
+        <w:t xml:space="preserve"> </w:t>
+      </w:r>
+      <w:r>
+        <w:rPr>
+          <w:i/>
+          <w:iCs/>
+        </w:rPr>
         <w:t xml:space="preserve">JAMA : The Journal of the American Medical Association</w:t>
       </w:r>
       <w:r>
@@ -18371,7 +18530,7 @@
       <w:r>
         <w:t xml:space="preserve"> </w:t>
       </w:r>
-      <w:hyperlink r:id="rId78">
+      <w:hyperlink r:id="rId80">
         <w:r>
           <w:rPr>
             <w:rStyle w:val="Hyperlink"/>
@@ -18383,14 +18542,14 @@
         <w:t xml:space="preserve">.</w:t>
       </w:r>
     </w:p>
-    <w:bookmarkEnd w:id="79"/>
-    <w:bookmarkStart w:id="81" w:name="ref-vittinghoff2e"/>
+    <w:bookmarkEnd w:id="81"/>
+    <w:bookmarkStart w:id="82" w:name="ref-rice2007mathematical"/>
     <w:p>
       <w:pPr>
         <w:pStyle w:val="Bibliography"/>
       </w:pPr>
       <w:r>
-        <w:t xml:space="preserve">Vittinghoff, Eric, David V Glidden, Stephen C Shiboski, and Charles E McCulloch. 2012.</w:t>
+        <w:t xml:space="preserve">Rice, John A. 2007.</w:t>
       </w:r>
       <w:r>
         <w:t xml:space="preserve"> </w:t>
@@ -18400,6 +18559,29 @@
           <w:i/>
           <w:iCs/>
         </w:rPr>
+        <w:t xml:space="preserve">Mathematical Statistics and Data Analysis</w:t>
+      </w:r>
+      <w:r>
+        <w:t xml:space="preserve">. 3rd ed. Cengage Learning.</w:t>
+      </w:r>
+    </w:p>
+    <w:bookmarkEnd w:id="82"/>
+    <w:bookmarkStart w:id="84" w:name="ref-vittinghoff2e"/>
+    <w:p>
+      <w:pPr>
+        <w:pStyle w:val="Bibliography"/>
+      </w:pPr>
+      <w:r>
+        <w:t xml:space="preserve">Vittinghoff, Eric, David V Glidden, Stephen C Shiboski, and Charles E McCulloch. 2012.</w:t>
+      </w:r>
+      <w:r>
+        <w:t xml:space="preserve"> </w:t>
+      </w:r>
+      <w:r>
+        <w:rPr>
+          <w:i/>
+          <w:iCs/>
+        </w:rPr>
         <w:t xml:space="preserve">Regression Methods in Biostatistics: Linear, Logistic, Survival, and Repeated Measures Models</w:t>
       </w:r>
       <w:r>
@@ -18408,7 +18590,7 @@
       <w:r>
         <w:t xml:space="preserve"> </w:t>
       </w:r>
-      <w:hyperlink r:id="rId80">
+      <w:hyperlink r:id="rId83">
         <w:r>
           <w:rPr>
             <w:rStyle w:val="Hyperlink"/>
@@ -18420,9 +18602,9 @@
         <w:t xml:space="preserve">.</w:t>
       </w:r>
     </w:p>
-    <w:bookmarkEnd w:id="81"/>
-    <w:bookmarkEnd w:id="82"/>
-    <w:bookmarkEnd w:id="83"/>
+    <w:bookmarkEnd w:id="84"/>
+    <w:bookmarkEnd w:id="85"/>
+    <w:bookmarkEnd w:id="86"/>
     <w:sectPr>
       <w:footnotePr>
         <w:numRestart w:val="eachSect"/>
@@ -18643,6 +18825,12 @@
     <w:abstractNumId w:val="991"/>
   </w:num>
   <w:num w:numId="1002">
+    <w:abstractNumId w:val="991"/>
+  </w:num>
+  <w:num w:numId="1003">
+    <w:abstractNumId w:val="991"/>
+  </w:num>
+  <w:num w:numId="1004">
     <w:abstractNumId w:val="991"/>
   </w:num>
 </w:numbering>

</xml_diff>

<commit_message>
Deploying to gh-pages from @ Morrison-Lab/sds@844d0a63366f29c0f177cb393d800d6e7e1da4af 🚀
</commit_message>
<xml_diff>
--- a/basic-statistical-methods-handout.docx
+++ b/basic-statistical-methods-handout.docx
@@ -15,7 +15,7 @@
         <w:pStyle w:val="Date"/>
       </w:pPr>
       <w:r>
-        <w:t xml:space="preserve">Last modified: 2026-10-16 05:21:29 (PDT)</w:t>
+        <w:t xml:space="preserve">Last modified: 2026-10-16 05:36:08 (PDT)</w:t>
       </w:r>
     </w:p>
     <w:bookmarkStart w:id="13" w:name="introduction"/>
@@ -1425,7 +1425,7 @@
         <w:t xml:space="preserve"> </w:t>
       </w:r>
       <w:r>
-        <w:t xml:space="preserve">Continuous variables are summarized by mean (standard deviation),</w:t>
+        <w:t xml:space="preserve">Continuous variables are summarized by sample mean (standard deviation),</w:t>
       </w:r>
       <w:r>
         <w:t xml:space="preserve"> </w:t>
@@ -8891,7 +8891,7 @@
         <w:t xml:space="preserve"> </w:t>
       </w:r>
       <w:r>
-        <w:t xml:space="preserve">are the mean baseline fasting glucose levels</w:t>
+        <w:t xml:space="preserve">are the population mean baseline fasting glucose levels</w:t>
       </w:r>
       <w:r>
         <w:t xml:space="preserve"> </w:t>
@@ -10203,7 +10203,7 @@
         <w:t xml:space="preserve"> </w:t>
       </w:r>
       <w:r>
-        <w:t xml:space="preserve">so the groups’ baseline means differ only by chance.</w:t>
+        <w:t xml:space="preserve">so the groups’ baseline sample means differ only by chance.</w:t>
       </w:r>
     </w:p>
     <w:bookmarkEnd w:id="49"/>
@@ -15923,7 +15923,7 @@
         <w:t xml:space="preserve"> </w:t>
       </w:r>
       <w:r>
-        <w:t xml:space="preserve">The group sizes, means, and standard deviations</w:t>
+        <w:t xml:space="preserve">The group sizes, sample means, and sample standard deviations</w:t>
       </w:r>
       <w:r>
         <w:t xml:space="preserve"> </w:t>
@@ -17412,7 +17412,7 @@
         <w:t xml:space="preserve"> </w:t>
       </w:r>
       <w:r>
-        <w:t xml:space="preserve">mean fasting glucose differs among the three race/ethnicity groups.</w:t>
+        <w:t xml:space="preserve">population mean fasting glucose differs among the three race/ethnicity groups.</w:t>
       </w:r>
     </w:p>
     <w:bookmarkEnd w:id="73"/>

</xml_diff>

<commit_message>
Deploying to gh-pages from @ Morrison-Lab/sds@6bfbe4f938000b5f7b8070f2619f11b6e4797569 🚀
</commit_message>
<xml_diff>
--- a/basic-statistical-methods-handout.docx
+++ b/basic-statistical-methods-handout.docx
@@ -15,7 +15,7 @@
         <w:pStyle w:val="Date"/>
       </w:pPr>
       <w:r>
-        <w:t xml:space="preserve">Last modified: 2026-10-18 01:13:21 (PDT)</w:t>
+        <w:t xml:space="preserve">Last modified: 2026-10-18 11:21:26 (PDT)</w:t>
       </w:r>
     </w:p>
     <w:bookmarkStart w:id="13" w:name="introduction"/>
@@ -184,7 +184,7 @@
         <w:t xml:space="preserve"> </w:t>
       </w:r>
       <w:r>
-        <w:t xml:space="preserve">Vittinghoff et al. (2012)</w:t>
+        <w:t xml:space="preserve">Vittinghoff et al. [1]</w:t>
       </w:r>
       <w:r>
         <w:t xml:space="preserve">, Chapter 3.</w:t>
@@ -241,7 +241,7 @@
         <w:t xml:space="preserve"> </w:t>
       </w:r>
       <w:r>
-        <w:t xml:space="preserve">(Hulley et al. 1998)</w:t>
+        <w:t xml:space="preserve">[2]</w:t>
       </w:r>
       <w:r>
         <w:t xml:space="preserve">.</w:t>
@@ -276,7 +276,7 @@
         <w:t xml:space="preserve"> </w:t>
       </w:r>
       <w:r>
-        <w:t xml:space="preserve">(Hulley et al. 1998)</w:t>
+        <w:t xml:space="preserve">[2]</w:t>
       </w:r>
       <w:r>
         <w:t xml:space="preserve">.</w:t>
@@ -291,7 +291,7 @@
         <w:t xml:space="preserve"> </w:t>
       </w:r>
       <w:r>
-        <w:t xml:space="preserve">(Hulley et al. 1998)</w:t>
+        <w:t xml:space="preserve">[2]</w:t>
       </w:r>
       <w:r>
         <w:t xml:space="preserve">.</w:t>
@@ -308,7 +308,7 @@
         <w:t xml:space="preserve"> </w:t>
       </w:r>
       <w:r>
-        <w:t xml:space="preserve">(Hulley et al. 1998)</w:t>
+        <w:t xml:space="preserve">[2]</w:t>
       </w:r>
       <w:r>
         <w:t xml:space="preserve">.</w:t>
@@ -325,7 +325,7 @@
         <w:t xml:space="preserve"> </w:t>
       </w:r>
       <w:r>
-        <w:t xml:space="preserve">Vittinghoff et al. (2012)</w:t>
+        <w:t xml:space="preserve">Vittinghoff et al. [1]</w:t>
       </w:r>
       <w:r>
         <w:t xml:space="preserve"> </w:t>
@@ -4686,7 +4686,7 @@
         <w:t xml:space="preserve"> </w:t>
       </w:r>
       <w:r>
-        <w:t xml:space="preserve">Wikipedia contributors (2026e)</w:t>
+        <w:t xml:space="preserve">Wikipedia contributors [3]</w:t>
       </w:r>
       <w:r>
         <w:t xml:space="preserve">.</w:t>
@@ -5031,7 +5031,7 @@
         <w:t xml:space="preserve"> </w:t>
       </w:r>
       <w:r>
-        <w:t xml:space="preserve">(Hogg et al. 2019, sec. 5.5, pp. 203-205)</w:t>
+        <w:t xml:space="preserve">[4, Sec. 5.5], pp. 203-205</w:t>
       </w:r>
       <w:r>
         <w:t xml:space="preserve">:</w:t>
@@ -6734,7 +6734,7 @@
         <w:t xml:space="preserve"> </w:t>
       </w:r>
       <w:r>
-        <w:t xml:space="preserve">Wikipedia contributors (2026e)</w:t>
+        <w:t xml:space="preserve">Wikipedia contributors [3]</w:t>
       </w:r>
       <w:r>
         <w:t xml:space="preserve">.</w:t>
@@ -8591,7 +8591,7 @@
         <w:t xml:space="preserve"> </w:t>
       </w:r>
       <w:r>
-        <w:t xml:space="preserve">Wikipedia contributors (2026f)</w:t>
+        <w:t xml:space="preserve">Wikipedia contributors [5]</w:t>
       </w:r>
       <w:r>
         <w:t xml:space="preserve">.</w:t>
@@ -10617,7 +10617,7 @@
         <w:t xml:space="preserve"> </w:t>
       </w:r>
       <w:r>
-        <w:t xml:space="preserve">Wikipedia contributors (2026d)</w:t>
+        <w:t xml:space="preserve">Wikipedia contributors [6]</w:t>
       </w:r>
       <w:r>
         <w:t xml:space="preserve">.</w:t>
@@ -11593,7 +11593,7 @@
         <w:t xml:space="preserve"> </w:t>
       </w:r>
       <w:r>
-        <w:t xml:space="preserve">Wikipedia contributors (2026e)</w:t>
+        <w:t xml:space="preserve">Wikipedia contributors [3]</w:t>
       </w:r>
       <w:r>
         <w:t xml:space="preserve">.</w:t>
@@ -11753,7 +11753,7 @@
         <w:t xml:space="preserve"> </w:t>
       </w:r>
       <w:r>
-        <w:t xml:space="preserve">(Hogg et al. 2019, sec. 8.2, p. 371)</w:t>
+        <w:t xml:space="preserve">[4, Sec. 8.2], p. 371</w:t>
       </w:r>
       <w:r>
         <w:t xml:space="preserve">.</w:t>
@@ -12027,7 +12027,7 @@
         </w:numPr>
       </w:pPr>
       <w:r>
-        <w:t xml:space="preserve">Hogg et al. (2019, sec. 8.2, pp. 369–377)</w:t>
+        <w:t xml:space="preserve">Hogg et al. [4, Sec. 8.2], pp. 369–377</w:t>
       </w:r>
       <w:r>
         <w:t xml:space="preserve"> </w:t>
@@ -12045,7 +12045,7 @@
         </w:numPr>
       </w:pPr>
       <w:r>
-        <w:t xml:space="preserve">Rice (2007, sec. 11.2.1, pp. 421–432)</w:t>
+        <w:t xml:space="preserve">Rice [7, Sec. 11.2.1], pp. 421–432</w:t>
       </w:r>
       <w:r>
         <w:t xml:space="preserve"> </w:t>
@@ -12063,7 +12063,7 @@
         </w:numPr>
       </w:pPr>
       <w:r>
-        <w:t xml:space="preserve">Rice (2007, sec. 11.3.1, pp. 446–447)</w:t>
+        <w:t xml:space="preserve">Rice [7, Sec. 11.3.1], pp. 446–447</w:t>
       </w:r>
       <w:r>
         <w:t xml:space="preserve"> </w:t>
@@ -12933,7 +12933,7 @@
         <w:pStyle w:val="BodyText"/>
       </w:pPr>
       <w:r>
-        <w:t xml:space="preserve">Hogg et al. (2019, sec. 7.2, pp. 314–322)</w:t>
+        <w:t xml:space="preserve">Hogg et al. [4, Sec. 7.2], pp. 314–322</w:t>
       </w:r>
       <w:r>
         <w:t xml:space="preserve"> </w:t>
@@ -13452,7 +13452,7 @@
         <w:t xml:space="preserve"> </w:t>
       </w:r>
       <w:r>
-        <w:t xml:space="preserve">Wikipedia contributors (2026c)</w:t>
+        <w:t xml:space="preserve">Wikipedia contributors [8]</w:t>
       </w:r>
       <w:r>
         <w:t xml:space="preserve">.</w:t>
@@ -14157,7 +14157,7 @@
         <w:t xml:space="preserve"> </w:t>
       </w:r>
       <w:r>
-        <w:t xml:space="preserve">Wikipedia contributors (2026c)</w:t>
+        <w:t xml:space="preserve">Wikipedia contributors [8]</w:t>
       </w:r>
       <w:r>
         <w:t xml:space="preserve">.</w:t>
@@ -15607,7 +15607,7 @@
         <w:t xml:space="preserve"> </w:t>
       </w:r>
       <w:r>
-        <w:t xml:space="preserve">Wikipedia contributors (2026a)</w:t>
+        <w:t xml:space="preserve">Wikipedia contributors [9]</w:t>
       </w:r>
       <w:r>
         <w:t xml:space="preserve">.</w:t>
@@ -16036,7 +16036,7 @@
         <w:t xml:space="preserve"> </w:t>
       </w:r>
       <w:r>
-        <w:t xml:space="preserve">(Hogg et al. 2019, sec. 9.3, p. 449)</w:t>
+        <w:t xml:space="preserve">[4, Sec. 9.3], p. 449</w:t>
       </w:r>
       <w:r>
         <w:t xml:space="preserve">.</w:t>
@@ -18517,7 +18517,7 @@
         </w:numPr>
       </w:pPr>
       <w:r>
-        <w:t xml:space="preserve">Hogg et al. (2019, sec. 9.3, pp. 446–455)</w:t>
+        <w:t xml:space="preserve">Hogg et al. [4, Sec. 9.3], pp. 446–455</w:t>
       </w:r>
       <w:r>
         <w:t xml:space="preserve"> </w:t>
@@ -18535,7 +18535,7 @@
         </w:numPr>
       </w:pPr>
       <w:r>
-        <w:t xml:space="preserve">Casella and Berger (2002, sec. 11.2, pp. 522–538)</w:t>
+        <w:t xml:space="preserve">Casella and Berger [10, Sec. 11.2], pp. 522–538</w:t>
       </w:r>
       <w:r>
         <w:t xml:space="preserve"> </w:t>
@@ -18553,7 +18553,7 @@
         </w:numPr>
       </w:pPr>
       <w:r>
-        <w:t xml:space="preserve">Rice (2007, sec. 12.2, pp. 477–488)</w:t>
+        <w:t xml:space="preserve">Rice [7, Sec. 12.2], pp. 477–488</w:t>
       </w:r>
       <w:r>
         <w:t xml:space="preserve"> </w:t>
@@ -18580,7 +18580,7 @@
         </w:numPr>
       </w:pPr>
       <w:r>
-        <w:t xml:space="preserve">Wikipedia contributors (2026e)</w:t>
+        <w:t xml:space="preserve">Wikipedia contributors [3]</w:t>
       </w:r>
       <w:r>
         <w:t xml:space="preserve"> </w:t>
@@ -18597,7 +18597,7 @@
         </w:numPr>
       </w:pPr>
       <w:r>
-        <w:t xml:space="preserve">Wikipedia contributors (2026f)</w:t>
+        <w:t xml:space="preserve">Wikipedia contributors [5]</w:t>
       </w:r>
       <w:r>
         <w:t xml:space="preserve"> </w:t>
@@ -18614,7 +18614,7 @@
         </w:numPr>
       </w:pPr>
       <w:r>
-        <w:t xml:space="preserve">Wikipedia contributors (2026a)</w:t>
+        <w:t xml:space="preserve">Wikipedia contributors [9]</w:t>
       </w:r>
       <w:r>
         <w:t xml:space="preserve"> </w:t>
@@ -18631,7 +18631,7 @@
         </w:numPr>
       </w:pPr>
       <w:r>
-        <w:t xml:space="preserve">Wikipedia contributors (2026b)</w:t>
+        <w:t xml:space="preserve">Wikipedia contributors [11]</w:t>
       </w:r>
       <w:r>
         <w:t xml:space="preserve"> </w:t>
@@ -18648,7 +18648,7 @@
         </w:numPr>
       </w:pPr>
       <w:r>
-        <w:t xml:space="preserve">Wikipedia contributors (2026d)</w:t>
+        <w:t xml:space="preserve">Wikipedia contributors [6]</w:t>
       </w:r>
       <w:r>
         <w:t xml:space="preserve"> </w:t>
@@ -18668,13 +18668,22 @@
       </w:r>
     </w:p>
     <w:bookmarkStart w:id="98" w:name="refs"/>
-    <w:bookmarkStart w:id="79" w:name="ref-CaseBerg01"/>
+    <w:bookmarkStart w:id="79" w:name="ref-vittinghoff2e"/>
     <w:p>
       <w:pPr>
         <w:pStyle w:val="Bibliography"/>
       </w:pPr>
       <w:r>
-        <w:t xml:space="preserve">Casella, George, and Roger Berger. 2002.</w:t>
+        <w:t xml:space="preserve">[1]</w:t>
+      </w:r>
+      <w:r>
+        <w:t xml:space="preserve"> </w:t>
+      </w:r>
+      <w:r>
+        <w:t xml:space="preserve">	</w:t>
+      </w:r>
+      <w:r>
+        <w:t xml:space="preserve">E. Vittinghoff, D. V. Glidden, S. C. Shiboski, and C. E. McCulloch,</w:t>
       </w:r>
       <w:r>
         <w:t xml:space="preserve"> </w:t>
@@ -18684,10 +18693,10 @@
           <w:i/>
           <w:iCs/>
         </w:rPr>
-        <w:t xml:space="preserve">Statistical Inference</w:t>
-      </w:r>
-      <w:r>
-        <w:t xml:space="preserve">. 2nd ed. Cengage Learning.</w:t>
+        <w:t xml:space="preserve">Regression methods in biostatistics: Linear, logistic, survival, and repeated measures models</w:t>
+      </w:r>
+      <w:r>
+        <w:t xml:space="preserve">, 2nd ed. Springer, 2012. doi:</w:t>
       </w:r>
       <w:r>
         <w:t xml:space="preserve"> </w:t>
@@ -18697,7 +18706,7 @@
           <w:rPr>
             <w:rStyle w:val="Hyperlink"/>
           </w:rPr>
-          <w:t xml:space="preserve">https://www.cengage.com/c/statistical-inference-2e-casella-berger/9780534243128/</w:t>
+          <w:t xml:space="preserve">10.1007/978-1-4614-1353-0</w:t>
         </w:r>
       </w:hyperlink>
       <w:r>
@@ -18705,13 +18714,22 @@
       </w:r>
     </w:p>
     <w:bookmarkEnd w:id="79"/>
-    <w:bookmarkStart w:id="80" w:name="ref-hoggtanis2015"/>
+    <w:bookmarkStart w:id="81" w:name="ref-HulleyStephen1998RToE"/>
     <w:p>
       <w:pPr>
         <w:pStyle w:val="Bibliography"/>
       </w:pPr>
       <w:r>
-        <w:t xml:space="preserve">Hogg, Robert V., Elliot A. Tanis, and Dale L. Zimmerman. 2019.</w:t>
+        <w:t xml:space="preserve">[2]</w:t>
+      </w:r>
+      <w:r>
+        <w:t xml:space="preserve"> </w:t>
+      </w:r>
+      <w:r>
+        <w:t xml:space="preserve">	</w:t>
+      </w:r>
+      <w:r>
+        <w:t xml:space="preserve">S. Hulley</w:t>
       </w:r>
       <w:r>
         <w:t xml:space="preserve"> </w:t>
@@ -18721,66 +18739,119 @@
           <w:i/>
           <w:iCs/>
         </w:rPr>
-        <w:t xml:space="preserve">Probability and Statistical Inference</w:t>
-      </w:r>
-      <w:r>
-        <w:t xml:space="preserve">. Tenth edition. Pearson.</w:t>
+        <w:t xml:space="preserve">et al.</w:t>
+      </w:r>
+      <w:r>
+        <w:t xml:space="preserve">,</w:t>
+      </w:r>
+      <w:r>
+        <w:t xml:space="preserve"> </w:t>
+      </w:r>
+      <w:r>
+        <w:t xml:space="preserve">“Randomized trial of estrogen plus progestin for secondary prevention of coronary heart disease in postmenopausal women,”</w:t>
+      </w:r>
+      <w:r>
+        <w:t xml:space="preserve"> </w:t>
+      </w:r>
+      <w:r>
+        <w:rPr>
+          <w:i/>
+          <w:iCs/>
+        </w:rPr>
+        <w:t xml:space="preserve">JAMA : the journal of the American Medical Association</w:t>
+      </w:r>
+      <w:r>
+        <w:t xml:space="preserve">, vol. 280, no. 7, pp. 605–613, 1998, doi:</w:t>
+      </w:r>
+      <w:r>
+        <w:t xml:space="preserve"> </w:t>
+      </w:r>
+      <w:hyperlink r:id="rId80">
+        <w:r>
+          <w:rPr>
+            <w:rStyle w:val="Hyperlink"/>
+          </w:rPr>
+          <w:t xml:space="preserve">10.1001/jama.280.7.605</w:t>
+        </w:r>
+      </w:hyperlink>
+      <w:r>
+        <w:t xml:space="preserve">.</w:t>
       </w:r>
     </w:p>
-    <w:bookmarkEnd w:id="80"/>
-    <w:bookmarkStart w:id="82" w:name="ref-HulleyStephen1998RToE"/>
+    <w:bookmarkEnd w:id="81"/>
+    <w:bookmarkStart w:id="83" w:name="ref-wikipedia_students_t_test"/>
     <w:p>
       <w:pPr>
         <w:pStyle w:val="Bibliography"/>
       </w:pPr>
       <w:r>
-        <w:t xml:space="preserve">Hulley, Stephen, Deborah Grady, Trudy Bush, et al. 1998.</w:t>
-      </w:r>
-      <w:r>
-        <w:t xml:space="preserve"> </w:t>
-      </w:r>
-      <w:r>
-        <w:t xml:space="preserve">“Randomized Trial of Estrogen Plus Progestin for Secondary Prevention of Coronary Heart Disease in Postmenopausal Women.”</w:t>
-      </w:r>
-      <w:r>
-        <w:t xml:space="preserve"> </w:t>
-      </w:r>
-      <w:r>
-        <w:rPr>
-          <w:i/>
-          <w:iCs/>
-        </w:rPr>
-        <w:t xml:space="preserve">JAMA : The Journal of the American Medical Association</w:t>
-      </w:r>
-      <w:r>
-        <w:t xml:space="preserve"> </w:t>
-      </w:r>
-      <w:r>
-        <w:t xml:space="preserve">(Chicago, IL) 280 (7): 605–13.</w:t>
-      </w:r>
-      <w:r>
-        <w:t xml:space="preserve"> </w:t>
-      </w:r>
-      <w:hyperlink r:id="rId81">
+        <w:t xml:space="preserve">[3]</w:t>
+      </w:r>
+      <w:r>
+        <w:t xml:space="preserve"> </w:t>
+      </w:r>
+      <w:r>
+        <w:t xml:space="preserve">	</w:t>
+      </w:r>
+      <w:r>
+        <w:t xml:space="preserve">Wikipedia contributors,</w:t>
+      </w:r>
+      <w:r>
+        <w:t xml:space="preserve"> </w:t>
+      </w:r>
+      <w:r>
+        <w:t xml:space="preserve">“Student’s t-test —</w:t>
+      </w:r>
+      <w:r>
+        <w:t xml:space="preserve"> </w:t>
+      </w:r>
+      <w:r>
+        <w:t xml:space="preserve">Wikipedia</w:t>
+      </w:r>
+      <w:r>
+        <w:t xml:space="preserve">,</w:t>
+      </w:r>
+      <w:r>
+        <w:t xml:space="preserve"> </w:t>
+      </w:r>
+      <w:r>
+        <w:t xml:space="preserve">the free encyclopedia.”</w:t>
+      </w:r>
+      <w:r>
+        <w:t xml:space="preserve"> </w:t>
+      </w:r>
+      <w:r>
+        <w:t xml:space="preserve">2026. Available:</w:t>
+      </w:r>
+      <w:r>
+        <w:t xml:space="preserve"> </w:t>
+      </w:r>
+      <w:hyperlink r:id="rId82">
         <w:r>
           <w:rPr>
             <w:rStyle w:val="Hyperlink"/>
           </w:rPr>
-          <w:t xml:space="preserve">https://doi.org/10.1001/jama.280.7.605</w:t>
+          <w:t xml:space="preserve">https://en.wikipedia.org/wiki/Student%27s_t-test</w:t>
         </w:r>
       </w:hyperlink>
-      <w:r>
-        <w:t xml:space="preserve">.</w:t>
-      </w:r>
     </w:p>
-    <w:bookmarkEnd w:id="82"/>
-    <w:bookmarkStart w:id="83" w:name="ref-rice2007mathematical"/>
+    <w:bookmarkEnd w:id="83"/>
+    <w:bookmarkStart w:id="84" w:name="ref-hoggtanis2015"/>
     <w:p>
       <w:pPr>
         <w:pStyle w:val="Bibliography"/>
       </w:pPr>
       <w:r>
-        <w:t xml:space="preserve">Rice, John A. 2007.</w:t>
+        <w:t xml:space="preserve">[4]</w:t>
+      </w:r>
+      <w:r>
+        <w:t xml:space="preserve"> </w:t>
+      </w:r>
+      <w:r>
+        <w:t xml:space="preserve">	</w:t>
+      </w:r>
+      <w:r>
+        <w:t xml:space="preserve">R. V. Hogg, E. A. Tanis, and D. L. Zimmerman,</w:t>
       </w:r>
       <w:r>
         <w:t xml:space="preserve"> </w:t>
@@ -18790,129 +18861,143 @@
           <w:i/>
           <w:iCs/>
         </w:rPr>
-        <w:t xml:space="preserve">Mathematical Statistics and Data Analysis</w:t>
-      </w:r>
-      <w:r>
-        <w:t xml:space="preserve">. 3rd ed. Cengage Learning.</w:t>
+        <w:t xml:space="preserve">Probability and statistical inference</w:t>
+      </w:r>
+      <w:r>
+        <w:t xml:space="preserve">, Tenth edition. Boston: Pearson, 2019.</w:t>
       </w:r>
     </w:p>
-    <w:bookmarkEnd w:id="83"/>
-    <w:bookmarkStart w:id="85" w:name="ref-vittinghoff2e"/>
+    <w:bookmarkEnd w:id="84"/>
+    <w:bookmarkStart w:id="86" w:name="ref-wikipedia_welchs_t_test"/>
     <w:p>
       <w:pPr>
         <w:pStyle w:val="Bibliography"/>
       </w:pPr>
       <w:r>
-        <w:t xml:space="preserve">Vittinghoff, Eric, David V Glidden, Stephen C Shiboski, and Charles E McCulloch. 2012.</w:t>
-      </w:r>
-      <w:r>
-        <w:t xml:space="preserve"> </w:t>
-      </w:r>
-      <w:r>
-        <w:rPr>
-          <w:i/>
-          <w:iCs/>
-        </w:rPr>
-        <w:t xml:space="preserve">Regression Methods in Biostatistics: Linear, Logistic, Survival, and Repeated Measures Models</w:t>
-      </w:r>
-      <w:r>
-        <w:t xml:space="preserve">. 2nd ed. Springer.</w:t>
-      </w:r>
-      <w:r>
-        <w:t xml:space="preserve"> </w:t>
-      </w:r>
-      <w:hyperlink r:id="rId84">
+        <w:t xml:space="preserve">[5]</w:t>
+      </w:r>
+      <w:r>
+        <w:t xml:space="preserve"> </w:t>
+      </w:r>
+      <w:r>
+        <w:t xml:space="preserve">	</w:t>
+      </w:r>
+      <w:r>
+        <w:t xml:space="preserve">Wikipedia contributors,</w:t>
+      </w:r>
+      <w:r>
+        <w:t xml:space="preserve"> </w:t>
+      </w:r>
+      <w:r>
+        <w:t xml:space="preserve">“Welch’s t-test —</w:t>
+      </w:r>
+      <w:r>
+        <w:t xml:space="preserve"> </w:t>
+      </w:r>
+      <w:r>
+        <w:t xml:space="preserve">Wikipedia</w:t>
+      </w:r>
+      <w:r>
+        <w:t xml:space="preserve">,</w:t>
+      </w:r>
+      <w:r>
+        <w:t xml:space="preserve"> </w:t>
+      </w:r>
+      <w:r>
+        <w:t xml:space="preserve">the free encyclopedia.”</w:t>
+      </w:r>
+      <w:r>
+        <w:t xml:space="preserve"> </w:t>
+      </w:r>
+      <w:r>
+        <w:t xml:space="preserve">2026. Available:</w:t>
+      </w:r>
+      <w:r>
+        <w:t xml:space="preserve"> </w:t>
+      </w:r>
+      <w:hyperlink r:id="rId85">
         <w:r>
           <w:rPr>
             <w:rStyle w:val="Hyperlink"/>
           </w:rPr>
-          <w:t xml:space="preserve">https://doi.org/10.1007/978-1-4614-1353-0</w:t>
+          <w:t xml:space="preserve">https://en.wikipedia.org/wiki/Welch%27s_t-test</w:t>
         </w:r>
       </w:hyperlink>
-      <w:r>
-        <w:t xml:space="preserve">.</w:t>
-      </w:r>
     </w:p>
-    <w:bookmarkEnd w:id="85"/>
-    <w:bookmarkStart w:id="87" w:name="ref-wikipedia_analysis_of_variance"/>
+    <w:bookmarkEnd w:id="86"/>
+    <w:bookmarkStart w:id="88" w:name="ref-wikipedia_pooled_variance"/>
     <w:p>
       <w:pPr>
         <w:pStyle w:val="Bibliography"/>
       </w:pPr>
       <w:r>
-        <w:t xml:space="preserve">Wikipedia contributors. 2026a.</w:t>
-      </w:r>
-      <w:r>
-        <w:t xml:space="preserve"> </w:t>
-      </w:r>
-      <w:r>
-        <w:rPr>
-          <w:i/>
-          <w:iCs/>
-        </w:rPr>
-        <w:t xml:space="preserve">Analysis of Variance —</w:t>
-      </w:r>
-      <w:r>
-        <w:rPr>
-          <w:i/>
-          <w:iCs/>
-        </w:rPr>
-        <w:t xml:space="preserve"> </w:t>
-      </w:r>
-      <w:r>
-        <w:rPr>
-          <w:i/>
-          <w:iCs/>
-        </w:rPr>
+        <w:t xml:space="preserve">[6]</w:t>
+      </w:r>
+      <w:r>
+        <w:t xml:space="preserve"> </w:t>
+      </w:r>
+      <w:r>
+        <w:t xml:space="preserve">	</w:t>
+      </w:r>
+      <w:r>
+        <w:t xml:space="preserve">Wikipedia contributors,</w:t>
+      </w:r>
+      <w:r>
+        <w:t xml:space="preserve"> </w:t>
+      </w:r>
+      <w:r>
+        <w:t xml:space="preserve">“Pooled variance —</w:t>
+      </w:r>
+      <w:r>
+        <w:t xml:space="preserve"> </w:t>
+      </w:r>
+      <w:r>
         <w:t xml:space="preserve">Wikipedia</w:t>
       </w:r>
       <w:r>
-        <w:rPr>
-          <w:i/>
-          <w:iCs/>
-        </w:rPr>
         <w:t xml:space="preserve">,</w:t>
       </w:r>
       <w:r>
-        <w:rPr>
-          <w:i/>
-          <w:iCs/>
-        </w:rPr>
-        <w:t xml:space="preserve"> </w:t>
-      </w:r>
-      <w:r>
-        <w:rPr>
-          <w:i/>
-          <w:iCs/>
-        </w:rPr>
-        <w:t xml:space="preserve">the Free Encyclopedia</w:t>
-      </w:r>
-      <w:r>
-        <w:t xml:space="preserve">.</w:t>
-      </w:r>
-      <w:r>
-        <w:t xml:space="preserve"> </w:t>
-      </w:r>
-      <w:hyperlink r:id="rId86">
+        <w:t xml:space="preserve"> </w:t>
+      </w:r>
+      <w:r>
+        <w:t xml:space="preserve">the free encyclopedia.”</w:t>
+      </w:r>
+      <w:r>
+        <w:t xml:space="preserve"> </w:t>
+      </w:r>
+      <w:r>
+        <w:t xml:space="preserve">2026. Available:</w:t>
+      </w:r>
+      <w:r>
+        <w:t xml:space="preserve"> </w:t>
+      </w:r>
+      <w:hyperlink r:id="rId87">
         <w:r>
           <w:rPr>
             <w:rStyle w:val="Hyperlink"/>
           </w:rPr>
-          <w:t xml:space="preserve">https://en.wikipedia.org/wiki/Analysis_of_variance</w:t>
+          <w:t xml:space="preserve">https://en.wikipedia.org/wiki/Pooled_variance</w:t>
         </w:r>
       </w:hyperlink>
-      <w:r>
-        <w:t xml:space="preserve">.</w:t>
-      </w:r>
     </w:p>
-    <w:bookmarkEnd w:id="87"/>
-    <w:bookmarkStart w:id="89" w:name="ref-wikipedia_f_test"/>
+    <w:bookmarkEnd w:id="88"/>
+    <w:bookmarkStart w:id="89" w:name="ref-rice2007mathematical"/>
     <w:p>
       <w:pPr>
         <w:pStyle w:val="Bibliography"/>
       </w:pPr>
       <w:r>
-        <w:t xml:space="preserve">Wikipedia contributors. 2026b.</w:t>
+        <w:t xml:space="preserve">[7]</w:t>
+      </w:r>
+      <w:r>
+        <w:t xml:space="preserve"> </w:t>
+      </w:r>
+      <w:r>
+        <w:t xml:space="preserve">	</w:t>
+      </w:r>
+      <w:r>
+        <w:t xml:space="preserve">J. A. Rice,</w:t>
       </w:r>
       <w:r>
         <w:t xml:space="preserve"> </w:t>
@@ -18922,59 +19007,10 @@
           <w:i/>
           <w:iCs/>
         </w:rPr>
-        <w:t xml:space="preserve">F-Test —</w:t>
-      </w:r>
-      <w:r>
-        <w:rPr>
-          <w:i/>
-          <w:iCs/>
-        </w:rPr>
-        <w:t xml:space="preserve"> </w:t>
-      </w:r>
-      <w:r>
-        <w:rPr>
-          <w:i/>
-          <w:iCs/>
-        </w:rPr>
-        <w:t xml:space="preserve">Wikipedia</w:t>
-      </w:r>
-      <w:r>
-        <w:rPr>
-          <w:i/>
-          <w:iCs/>
-        </w:rPr>
-        <w:t xml:space="preserve">,</w:t>
-      </w:r>
-      <w:r>
-        <w:rPr>
-          <w:i/>
-          <w:iCs/>
-        </w:rPr>
-        <w:t xml:space="preserve"> </w:t>
-      </w:r>
-      <w:r>
-        <w:rPr>
-          <w:i/>
-          <w:iCs/>
-        </w:rPr>
-        <w:t xml:space="preserve">the Free Encyclopedia</w:t>
-      </w:r>
-      <w:r>
-        <w:t xml:space="preserve">.</w:t>
-      </w:r>
-      <w:r>
-        <w:t xml:space="preserve"> </w:t>
-      </w:r>
-      <w:hyperlink r:id="rId88">
-        <w:r>
-          <w:rPr>
-            <w:rStyle w:val="Hyperlink"/>
-          </w:rPr>
-          <w:t xml:space="preserve">https://en.wikipedia.org/wiki/F-test</w:t>
-        </w:r>
-      </w:hyperlink>
-      <w:r>
-        <w:t xml:space="preserve">.</w:t>
+        <w:t xml:space="preserve">Mathematical statistics and data analysis</w:t>
+      </w:r>
+      <w:r>
+        <w:t xml:space="preserve">, 3rd ed. Belmont, CA: Cengage Learning, 2007.</w:t>
       </w:r>
     </w:p>
     <w:bookmarkEnd w:id="89"/>
@@ -18984,55 +19020,43 @@
         <w:pStyle w:val="Bibliography"/>
       </w:pPr>
       <w:r>
-        <w:t xml:space="preserve">Wikipedia contributors. 2026c.</w:t>
-      </w:r>
-      <w:r>
-        <w:t xml:space="preserve"> </w:t>
-      </w:r>
-      <w:r>
-        <w:rPr>
-          <w:i/>
-          <w:iCs/>
-        </w:rPr>
-        <w:t xml:space="preserve">Partition of Sums of Squares —</w:t>
-      </w:r>
-      <w:r>
-        <w:rPr>
-          <w:i/>
-          <w:iCs/>
-        </w:rPr>
-        <w:t xml:space="preserve"> </w:t>
-      </w:r>
-      <w:r>
-        <w:rPr>
-          <w:i/>
-          <w:iCs/>
-        </w:rPr>
+        <w:t xml:space="preserve">[8]</w:t>
+      </w:r>
+      <w:r>
+        <w:t xml:space="preserve"> </w:t>
+      </w:r>
+      <w:r>
+        <w:t xml:space="preserve">	</w:t>
+      </w:r>
+      <w:r>
+        <w:t xml:space="preserve">Wikipedia contributors,</w:t>
+      </w:r>
+      <w:r>
+        <w:t xml:space="preserve"> </w:t>
+      </w:r>
+      <w:r>
+        <w:t xml:space="preserve">“Partition of sums of squares —</w:t>
+      </w:r>
+      <w:r>
+        <w:t xml:space="preserve"> </w:t>
+      </w:r>
+      <w:r>
         <w:t xml:space="preserve">Wikipedia</w:t>
       </w:r>
       <w:r>
-        <w:rPr>
-          <w:i/>
-          <w:iCs/>
-        </w:rPr>
         <w:t xml:space="preserve">,</w:t>
       </w:r>
       <w:r>
-        <w:rPr>
-          <w:i/>
-          <w:iCs/>
-        </w:rPr>
-        <w:t xml:space="preserve"> </w:t>
-      </w:r>
-      <w:r>
-        <w:rPr>
-          <w:i/>
-          <w:iCs/>
-        </w:rPr>
-        <w:t xml:space="preserve">the Free Encyclopedia</w:t>
-      </w:r>
-      <w:r>
-        <w:t xml:space="preserve">.</w:t>
+        <w:t xml:space="preserve"> </w:t>
+      </w:r>
+      <w:r>
+        <w:t xml:space="preserve">the free encyclopedia.”</w:t>
+      </w:r>
+      <w:r>
+        <w:t xml:space="preserve"> </w:t>
+      </w:r>
+      <w:r>
+        <w:t xml:space="preserve">2026. Available:</w:t>
       </w:r>
       <w:r>
         <w:t xml:space="preserve"> </w:t>
@@ -19045,66 +19069,51 @@
           <w:t xml:space="preserve">https://en.wikipedia.org/wiki/Partition_of_sums_of_squares</w:t>
         </w:r>
       </w:hyperlink>
-      <w:r>
-        <w:t xml:space="preserve">.</w:t>
-      </w:r>
     </w:p>
     <w:bookmarkEnd w:id="91"/>
-    <w:bookmarkStart w:id="93" w:name="ref-wikipedia_pooled_variance"/>
+    <w:bookmarkStart w:id="93" w:name="ref-wikipedia_analysis_of_variance"/>
     <w:p>
       <w:pPr>
         <w:pStyle w:val="Bibliography"/>
       </w:pPr>
       <w:r>
-        <w:t xml:space="preserve">Wikipedia contributors. 2026d.</w:t>
-      </w:r>
-      <w:r>
-        <w:t xml:space="preserve"> </w:t>
-      </w:r>
-      <w:r>
-        <w:rPr>
-          <w:i/>
-          <w:iCs/>
-        </w:rPr>
-        <w:t xml:space="preserve">Pooled Variance —</w:t>
-      </w:r>
-      <w:r>
-        <w:rPr>
-          <w:i/>
-          <w:iCs/>
-        </w:rPr>
-        <w:t xml:space="preserve"> </w:t>
-      </w:r>
-      <w:r>
-        <w:rPr>
-          <w:i/>
-          <w:iCs/>
-        </w:rPr>
+        <w:t xml:space="preserve">[9]</w:t>
+      </w:r>
+      <w:r>
+        <w:t xml:space="preserve"> </w:t>
+      </w:r>
+      <w:r>
+        <w:t xml:space="preserve">	</w:t>
+      </w:r>
+      <w:r>
+        <w:t xml:space="preserve">Wikipedia contributors,</w:t>
+      </w:r>
+      <w:r>
+        <w:t xml:space="preserve"> </w:t>
+      </w:r>
+      <w:r>
+        <w:t xml:space="preserve">“Analysis of variance —</w:t>
+      </w:r>
+      <w:r>
+        <w:t xml:space="preserve"> </w:t>
+      </w:r>
+      <w:r>
         <w:t xml:space="preserve">Wikipedia</w:t>
       </w:r>
       <w:r>
-        <w:rPr>
-          <w:i/>
-          <w:iCs/>
-        </w:rPr>
         <w:t xml:space="preserve">,</w:t>
       </w:r>
       <w:r>
-        <w:rPr>
-          <w:i/>
-          <w:iCs/>
-        </w:rPr>
-        <w:t xml:space="preserve"> </w:t>
-      </w:r>
-      <w:r>
-        <w:rPr>
-          <w:i/>
-          <w:iCs/>
-        </w:rPr>
-        <w:t xml:space="preserve">the Free Encyclopedia</w:t>
-      </w:r>
-      <w:r>
-        <w:t xml:space="preserve">.</w:t>
+        <w:t xml:space="preserve"> </w:t>
+      </w:r>
+      <w:r>
+        <w:t xml:space="preserve">the free encyclopedia.”</w:t>
+      </w:r>
+      <w:r>
+        <w:t xml:space="preserve"> </w:t>
+      </w:r>
+      <w:r>
+        <w:t xml:space="preserve">2026. Available:</w:t>
       </w:r>
       <w:r>
         <w:t xml:space="preserve"> </w:t>
@@ -19114,21 +19123,27 @@
           <w:rPr>
             <w:rStyle w:val="Hyperlink"/>
           </w:rPr>
-          <w:t xml:space="preserve">https://en.wikipedia.org/wiki/Pooled_variance</w:t>
+          <w:t xml:space="preserve">https://en.wikipedia.org/wiki/Analysis_of_variance</w:t>
         </w:r>
       </w:hyperlink>
-      <w:r>
-        <w:t xml:space="preserve">.</w:t>
-      </w:r>
     </w:p>
     <w:bookmarkEnd w:id="93"/>
-    <w:bookmarkStart w:id="95" w:name="ref-wikipedia_students_t_test"/>
+    <w:bookmarkStart w:id="95" w:name="ref-CaseBerg01"/>
     <w:p>
       <w:pPr>
         <w:pStyle w:val="Bibliography"/>
       </w:pPr>
       <w:r>
-        <w:t xml:space="preserve">Wikipedia contributors. 2026e.</w:t>
+        <w:t xml:space="preserve">[10]</w:t>
+      </w:r>
+      <w:r>
+        <w:t xml:space="preserve"> </w:t>
+      </w:r>
+      <w:r>
+        <w:t xml:space="preserve">	</w:t>
+      </w:r>
+      <w:r>
+        <w:t xml:space="preserve">G. Casella and R. Berger,</w:t>
       </w:r>
       <w:r>
         <w:t xml:space="preserve"> </w:t>
@@ -19138,45 +19153,10 @@
           <w:i/>
           <w:iCs/>
         </w:rPr>
-        <w:t xml:space="preserve">Student’s t-Test —</w:t>
-      </w:r>
-      <w:r>
-        <w:rPr>
-          <w:i/>
-          <w:iCs/>
-        </w:rPr>
-        <w:t xml:space="preserve"> </w:t>
-      </w:r>
-      <w:r>
-        <w:rPr>
-          <w:i/>
-          <w:iCs/>
-        </w:rPr>
-        <w:t xml:space="preserve">Wikipedia</w:t>
-      </w:r>
-      <w:r>
-        <w:rPr>
-          <w:i/>
-          <w:iCs/>
-        </w:rPr>
-        <w:t xml:space="preserve">,</w:t>
-      </w:r>
-      <w:r>
-        <w:rPr>
-          <w:i/>
-          <w:iCs/>
-        </w:rPr>
-        <w:t xml:space="preserve"> </w:t>
-      </w:r>
-      <w:r>
-        <w:rPr>
-          <w:i/>
-          <w:iCs/>
-        </w:rPr>
-        <w:t xml:space="preserve">the Free Encyclopedia</w:t>
-      </w:r>
-      <w:r>
-        <w:t xml:space="preserve">.</w:t>
+        <w:t xml:space="preserve">Statistical inference</w:t>
+      </w:r>
+      <w:r>
+        <w:t xml:space="preserve">, 2nd ed. Cengage Learning, 2002. Available:</w:t>
       </w:r>
       <w:r>
         <w:t xml:space="preserve"> </w:t>
@@ -19186,69 +19166,54 @@
           <w:rPr>
             <w:rStyle w:val="Hyperlink"/>
           </w:rPr>
-          <w:t xml:space="preserve">https://en.wikipedia.org/wiki/Student%27s_t-test</w:t>
+          <w:t xml:space="preserve">https://www.cengage.com/c/statistical-inference-2e-casella-berger/9780534243128/</w:t>
         </w:r>
       </w:hyperlink>
-      <w:r>
-        <w:t xml:space="preserve">.</w:t>
-      </w:r>
     </w:p>
     <w:bookmarkEnd w:id="95"/>
-    <w:bookmarkStart w:id="97" w:name="ref-wikipedia_welchs_t_test"/>
+    <w:bookmarkStart w:id="97" w:name="ref-wikipedia_f_test"/>
     <w:p>
       <w:pPr>
         <w:pStyle w:val="Bibliography"/>
       </w:pPr>
       <w:r>
-        <w:t xml:space="preserve">Wikipedia contributors. 2026f.</w:t>
-      </w:r>
-      <w:r>
-        <w:t xml:space="preserve"> </w:t>
-      </w:r>
-      <w:r>
-        <w:rPr>
-          <w:i/>
-          <w:iCs/>
-        </w:rPr>
-        <w:t xml:space="preserve">Welch’s t-Test —</w:t>
-      </w:r>
-      <w:r>
-        <w:rPr>
-          <w:i/>
-          <w:iCs/>
-        </w:rPr>
-        <w:t xml:space="preserve"> </w:t>
-      </w:r>
-      <w:r>
-        <w:rPr>
-          <w:i/>
-          <w:iCs/>
-        </w:rPr>
+        <w:t xml:space="preserve">[11]</w:t>
+      </w:r>
+      <w:r>
+        <w:t xml:space="preserve"> </w:t>
+      </w:r>
+      <w:r>
+        <w:t xml:space="preserve">	</w:t>
+      </w:r>
+      <w:r>
+        <w:t xml:space="preserve">Wikipedia contributors,</w:t>
+      </w:r>
+      <w:r>
+        <w:t xml:space="preserve"> </w:t>
+      </w:r>
+      <w:r>
+        <w:t xml:space="preserve">“F-test —</w:t>
+      </w:r>
+      <w:r>
+        <w:t xml:space="preserve"> </w:t>
+      </w:r>
+      <w:r>
         <w:t xml:space="preserve">Wikipedia</w:t>
       </w:r>
       <w:r>
-        <w:rPr>
-          <w:i/>
-          <w:iCs/>
-        </w:rPr>
         <w:t xml:space="preserve">,</w:t>
       </w:r>
       <w:r>
-        <w:rPr>
-          <w:i/>
-          <w:iCs/>
-        </w:rPr>
-        <w:t xml:space="preserve"> </w:t>
-      </w:r>
-      <w:r>
-        <w:rPr>
-          <w:i/>
-          <w:iCs/>
-        </w:rPr>
-        <w:t xml:space="preserve">the Free Encyclopedia</w:t>
-      </w:r>
-      <w:r>
-        <w:t xml:space="preserve">.</w:t>
+        <w:t xml:space="preserve"> </w:t>
+      </w:r>
+      <w:r>
+        <w:t xml:space="preserve">the free encyclopedia.”</w:t>
+      </w:r>
+      <w:r>
+        <w:t xml:space="preserve"> </w:t>
+      </w:r>
+      <w:r>
+        <w:t xml:space="preserve">2026. Available:</w:t>
       </w:r>
       <w:r>
         <w:t xml:space="preserve"> </w:t>
@@ -19258,12 +19223,9 @@
           <w:rPr>
             <w:rStyle w:val="Hyperlink"/>
           </w:rPr>
-          <w:t xml:space="preserve">https://en.wikipedia.org/wiki/Welch%27s_t-test</w:t>
+          <w:t xml:space="preserve">https://en.wikipedia.org/wiki/F-test</w:t>
         </w:r>
       </w:hyperlink>
-      <w:r>
-        <w:t xml:space="preserve">.</w:t>
-      </w:r>
     </w:p>
     <w:bookmarkEnd w:id="97"/>
     <w:bookmarkEnd w:id="98"/>

</xml_diff>

<commit_message>
Deploying to gh-pages from @ Morrison-Lab/sds@4e4d057bda5cd0ecfe3da534888d76a39d76313f 🚀
</commit_message>
<xml_diff>
--- a/basic-statistical-methods-handout.docx
+++ b/basic-statistical-methods-handout.docx
@@ -15,7 +15,7 @@
         <w:pStyle w:val="Date"/>
       </w:pPr>
       <w:r>
-        <w:t xml:space="preserve">Last modified: 2026-10-18 12:03:55 (PDT)</w:t>
+        <w:t xml:space="preserve">Last modified: 2026-10-18 13:22:01 (PDT)</w:t>
       </w:r>
     </w:p>
     <w:bookmarkStart w:id="13" w:name="introduction"/>
@@ -4436,6 +4436,12 @@
       <w:r>
         <w:t xml:space="preserve">uses the statistic</w:t>
       </w:r>
+      <w:r>
+        <w:t xml:space="preserve"> </w:t>
+      </w:r>
+      <w:r>
+        <w:t xml:space="preserve">[3]</w:t>
+      </w:r>
     </w:p>
     <w:p>
       <w:pPr>
@@ -7913,6 +7919,12 @@
       </w:r>
       <w:r>
         <w:t xml:space="preserve">uses the statistic</w:t>
+      </w:r>
+      <w:r>
+        <w:t xml:space="preserve"> </w:t>
+      </w:r>
+      <w:r>
+        <w:t xml:space="preserve">[5]</w:t>
       </w:r>
     </w:p>
     <w:p>
@@ -10397,6 +10409,12 @@
       <w:r>
         <w:t xml:space="preserve">is</w:t>
       </w:r>
+      <w:r>
+        <w:t xml:space="preserve"> </w:t>
+      </w:r>
+      <w:r>
+        <w:t xml:space="preserve">[6]</w:t>
+      </w:r>
     </w:p>
     <w:p>
       <w:pPr>
@@ -15352,6 +15370,18 @@
       <w:r>
         <w:t xml:space="preserve">uses the statistic</w:t>
       </w:r>
+      <w:r>
+        <w:t xml:space="preserve"> </w:t>
+      </w:r>
+      <w:r>
+        <w:t xml:space="preserve">[9]</w:t>
+      </w:r>
+      <w:r>
+        <w:t xml:space="preserve"> </w:t>
+      </w:r>
+      <w:r>
+        <w:t xml:space="preserve">[10]</w:t>
+      </w:r>
     </w:p>
     <w:p>
       <w:pPr>
@@ -18535,7 +18565,7 @@
         </w:numPr>
       </w:pPr>
       <w:r>
-        <w:t xml:space="preserve">Casella and Berger [10, Sec. 11.2], pp. 522–538</w:t>
+        <w:t xml:space="preserve">Casella and Berger [11, Sec. 11.2], pp. 522–538</w:t>
       </w:r>
       <w:r>
         <w:t xml:space="preserve"> </w:t>
@@ -18563,112 +18593,17 @@
       </w:r>
     </w:p>
     <w:bookmarkEnd w:id="76"/>
-    <w:bookmarkStart w:id="77" w:name="further-reading"/>
+    <w:bookmarkStart w:id="98" w:name="references"/>
     <w:p>
       <w:pPr>
         <w:pStyle w:val="Heading2"/>
       </w:pPr>
       <w:r>
-        <w:t xml:space="preserve">Further reading</w:t>
+        <w:t xml:space="preserve">References</w:t>
       </w:r>
     </w:p>
-    <w:p>
-      <w:pPr>
-        <w:numPr>
-          <w:ilvl w:val="0"/>
-          <w:numId w:val="1005"/>
-        </w:numPr>
-      </w:pPr>
-      <w:r>
-        <w:t xml:space="preserve">Wikipedia contributors [3]</w:t>
-      </w:r>
-      <w:r>
-        <w:t xml:space="preserve"> </w:t>
-      </w:r>
-      <w:r>
-        <w:t xml:space="preserve">— one-sample, paired and two-sample t-tests</w:t>
-      </w:r>
-    </w:p>
-    <w:p>
-      <w:pPr>
-        <w:numPr>
-          <w:ilvl w:val="0"/>
-          <w:numId w:val="1005"/>
-        </w:numPr>
-      </w:pPr>
-      <w:r>
-        <w:t xml:space="preserve">Wikipedia contributors [5]</w:t>
-      </w:r>
-      <w:r>
-        <w:t xml:space="preserve"> </w:t>
-      </w:r>
-      <w:r>
-        <w:t xml:space="preserve">— the t-test for groups with unequal variances</w:t>
-      </w:r>
-    </w:p>
-    <w:p>
-      <w:pPr>
-        <w:numPr>
-          <w:ilvl w:val="0"/>
-          <w:numId w:val="1005"/>
-        </w:numPr>
-      </w:pPr>
-      <w:r>
-        <w:t xml:space="preserve">Wikipedia contributors [9]</w:t>
-      </w:r>
-      <w:r>
-        <w:t xml:space="preserve"> </w:t>
-      </w:r>
-      <w:r>
-        <w:t xml:space="preserve">— ANOVA and its F-test</w:t>
-      </w:r>
-    </w:p>
-    <w:p>
-      <w:pPr>
-        <w:numPr>
-          <w:ilvl w:val="0"/>
-          <w:numId w:val="1005"/>
-        </w:numPr>
-      </w:pPr>
-      <w:r>
-        <w:t xml:space="preserve">Wikipedia contributors [11]</w:t>
-      </w:r>
-      <w:r>
-        <w:t xml:space="preserve"> </w:t>
-      </w:r>
-      <w:r>
-        <w:t xml:space="preserve">— F-tests and where they arise</w:t>
-      </w:r>
-    </w:p>
-    <w:p>
-      <w:pPr>
-        <w:numPr>
-          <w:ilvl w:val="0"/>
-          <w:numId w:val="1005"/>
-        </w:numPr>
-      </w:pPr>
-      <w:r>
-        <w:t xml:space="preserve">Wikipedia contributors [6]</w:t>
-      </w:r>
-      <w:r>
-        <w:t xml:space="preserve"> </w:t>
-      </w:r>
-      <w:r>
-        <w:t xml:space="preserve">— pooling the variances of several groups</w:t>
-      </w:r>
-    </w:p>
-    <w:bookmarkEnd w:id="77"/>
-    <w:bookmarkStart w:id="99" w:name="references"/>
-    <w:p>
-      <w:pPr>
-        <w:pStyle w:val="Heading2"/>
-      </w:pPr>
-      <w:r>
-        <w:t xml:space="preserve">References</w:t>
-      </w:r>
-    </w:p>
-    <w:bookmarkStart w:id="98" w:name="refs"/>
-    <w:bookmarkStart w:id="79" w:name="ref-vittinghoff2e"/>
+    <w:bookmarkStart w:id="97" w:name="refs"/>
+    <w:bookmarkStart w:id="78" w:name="ref-vittinghoff2e"/>
     <w:p>
       <w:pPr>
         <w:pStyle w:val="Bibliography"/>
@@ -18701,7 +18636,7 @@
       <w:r>
         <w:t xml:space="preserve"> </w:t>
       </w:r>
-      <w:hyperlink r:id="rId78">
+      <w:hyperlink r:id="rId77">
         <w:r>
           <w:rPr>
             <w:rStyle w:val="Hyperlink"/>
@@ -18713,8 +18648,8 @@
         <w:t xml:space="preserve">.</w:t>
       </w:r>
     </w:p>
-    <w:bookmarkEnd w:id="79"/>
-    <w:bookmarkStart w:id="81" w:name="ref-HulleyStephen1998RToE"/>
+    <w:bookmarkEnd w:id="78"/>
+    <w:bookmarkStart w:id="80" w:name="ref-HulleyStephen1998RToE"/>
     <w:p>
       <w:pPr>
         <w:pStyle w:val="Bibliography"/>
@@ -18766,7 +18701,7 @@
       <w:r>
         <w:t xml:space="preserve"> </w:t>
       </w:r>
-      <w:hyperlink r:id="rId80">
+      <w:hyperlink r:id="rId79">
         <w:r>
           <w:rPr>
             <w:rStyle w:val="Hyperlink"/>
@@ -18778,8 +18713,8 @@
         <w:t xml:space="preserve">.</w:t>
       </w:r>
     </w:p>
-    <w:bookmarkEnd w:id="81"/>
-    <w:bookmarkStart w:id="83" w:name="ref-wikipedia_students_t_test"/>
+    <w:bookmarkEnd w:id="80"/>
+    <w:bookmarkStart w:id="82" w:name="ref-wikipedia_students_t_test"/>
     <w:p>
       <w:pPr>
         <w:pStyle w:val="Bibliography"/>
@@ -18826,7 +18761,7 @@
       <w:r>
         <w:t xml:space="preserve"> </w:t>
       </w:r>
-      <w:hyperlink r:id="rId82">
+      <w:hyperlink r:id="rId81">
         <w:r>
           <w:rPr>
             <w:rStyle w:val="Hyperlink"/>
@@ -18835,8 +18770,8 @@
         </w:r>
       </w:hyperlink>
     </w:p>
-    <w:bookmarkEnd w:id="83"/>
-    <w:bookmarkStart w:id="84" w:name="ref-hoggtanis2015"/>
+    <w:bookmarkEnd w:id="82"/>
+    <w:bookmarkStart w:id="83" w:name="ref-hoggtanis2015"/>
     <w:p>
       <w:pPr>
         <w:pStyle w:val="Bibliography"/>
@@ -18867,8 +18802,8 @@
         <w:t xml:space="preserve">, Tenth edition. Boston: Pearson, 2019.</w:t>
       </w:r>
     </w:p>
-    <w:bookmarkEnd w:id="84"/>
-    <w:bookmarkStart w:id="86" w:name="ref-wikipedia_welchs_t_test"/>
+    <w:bookmarkEnd w:id="83"/>
+    <w:bookmarkStart w:id="85" w:name="ref-wikipedia_welchs_t_test"/>
     <w:p>
       <w:pPr>
         <w:pStyle w:val="Bibliography"/>
@@ -18915,7 +18850,7 @@
       <w:r>
         <w:t xml:space="preserve"> </w:t>
       </w:r>
-      <w:hyperlink r:id="rId85">
+      <w:hyperlink r:id="rId84">
         <w:r>
           <w:rPr>
             <w:rStyle w:val="Hyperlink"/>
@@ -18924,8 +18859,8 @@
         </w:r>
       </w:hyperlink>
     </w:p>
-    <w:bookmarkEnd w:id="86"/>
-    <w:bookmarkStart w:id="88" w:name="ref-wikipedia_pooled_variance"/>
+    <w:bookmarkEnd w:id="85"/>
+    <w:bookmarkStart w:id="87" w:name="ref-wikipedia_pooled_variance"/>
     <w:p>
       <w:pPr>
         <w:pStyle w:val="Bibliography"/>
@@ -18972,7 +18907,7 @@
       <w:r>
         <w:t xml:space="preserve"> </w:t>
       </w:r>
-      <w:hyperlink r:id="rId87">
+      <w:hyperlink r:id="rId86">
         <w:r>
           <w:rPr>
             <w:rStyle w:val="Hyperlink"/>
@@ -18981,8 +18916,8 @@
         </w:r>
       </w:hyperlink>
     </w:p>
-    <w:bookmarkEnd w:id="88"/>
-    <w:bookmarkStart w:id="89" w:name="ref-rice2007mathematical"/>
+    <w:bookmarkEnd w:id="87"/>
+    <w:bookmarkStart w:id="88" w:name="ref-rice2007mathematical"/>
     <w:p>
       <w:pPr>
         <w:pStyle w:val="Bibliography"/>
@@ -19013,8 +18948,8 @@
         <w:t xml:space="preserve">, 3rd ed. Belmont, CA: Cengage Learning, 2007.</w:t>
       </w:r>
     </w:p>
-    <w:bookmarkEnd w:id="89"/>
-    <w:bookmarkStart w:id="91" w:name="Xb77271a8c2834a333d91550be0fe1b0a3afc5b3"/>
+    <w:bookmarkEnd w:id="88"/>
+    <w:bookmarkStart w:id="90" w:name="Xb77271a8c2834a333d91550be0fe1b0a3afc5b3"/>
     <w:p>
       <w:pPr>
         <w:pStyle w:val="Bibliography"/>
@@ -19061,7 +18996,7 @@
       <w:r>
         <w:t xml:space="preserve"> </w:t>
       </w:r>
-      <w:hyperlink r:id="rId90">
+      <w:hyperlink r:id="rId89">
         <w:r>
           <w:rPr>
             <w:rStyle w:val="Hyperlink"/>
@@ -19070,8 +19005,8 @@
         </w:r>
       </w:hyperlink>
     </w:p>
-    <w:bookmarkEnd w:id="91"/>
-    <w:bookmarkStart w:id="93" w:name="ref-wikipedia_analysis_of_variance"/>
+    <w:bookmarkEnd w:id="90"/>
+    <w:bookmarkStart w:id="92" w:name="ref-wikipedia_analysis_of_variance"/>
     <w:p>
       <w:pPr>
         <w:pStyle w:val="Bibliography"/>
@@ -19118,7 +19053,7 @@
       <w:r>
         <w:t xml:space="preserve"> </w:t>
       </w:r>
-      <w:hyperlink r:id="rId92">
+      <w:hyperlink r:id="rId91">
         <w:r>
           <w:rPr>
             <w:rStyle w:val="Hyperlink"/>
@@ -19127,8 +19062,8 @@
         </w:r>
       </w:hyperlink>
     </w:p>
-    <w:bookmarkEnd w:id="93"/>
-    <w:bookmarkStart w:id="95" w:name="ref-CaseBerg01"/>
+    <w:bookmarkEnd w:id="92"/>
+    <w:bookmarkStart w:id="94" w:name="ref-wikipedia_f_test"/>
     <w:p>
       <w:pPr>
         <w:pStyle w:val="Bibliography"/>
@@ -19143,6 +19078,63 @@
         <w:t xml:space="preserve">	</w:t>
       </w:r>
       <w:r>
+        <w:t xml:space="preserve">Wikipedia contributors,</w:t>
+      </w:r>
+      <w:r>
+        <w:t xml:space="preserve"> </w:t>
+      </w:r>
+      <w:r>
+        <w:t xml:space="preserve">“F-test —</w:t>
+      </w:r>
+      <w:r>
+        <w:t xml:space="preserve"> </w:t>
+      </w:r>
+      <w:r>
+        <w:t xml:space="preserve">Wikipedia</w:t>
+      </w:r>
+      <w:r>
+        <w:t xml:space="preserve">,</w:t>
+      </w:r>
+      <w:r>
+        <w:t xml:space="preserve"> </w:t>
+      </w:r>
+      <w:r>
+        <w:t xml:space="preserve">the free encyclopedia.”</w:t>
+      </w:r>
+      <w:r>
+        <w:t xml:space="preserve"> </w:t>
+      </w:r>
+      <w:r>
+        <w:t xml:space="preserve">2026. Available:</w:t>
+      </w:r>
+      <w:r>
+        <w:t xml:space="preserve"> </w:t>
+      </w:r>
+      <w:hyperlink r:id="rId93">
+        <w:r>
+          <w:rPr>
+            <w:rStyle w:val="Hyperlink"/>
+          </w:rPr>
+          <w:t xml:space="preserve">https://en.wikipedia.org/wiki/F-test</w:t>
+        </w:r>
+      </w:hyperlink>
+    </w:p>
+    <w:bookmarkEnd w:id="94"/>
+    <w:bookmarkStart w:id="96" w:name="ref-CaseBerg01"/>
+    <w:p>
+      <w:pPr>
+        <w:pStyle w:val="Bibliography"/>
+      </w:pPr>
+      <w:r>
+        <w:t xml:space="preserve">[11]</w:t>
+      </w:r>
+      <w:r>
+        <w:t xml:space="preserve"> </w:t>
+      </w:r>
+      <w:r>
+        <w:t xml:space="preserve">	</w:t>
+      </w:r>
+      <w:r>
         <w:t xml:space="preserve">G. Casella and R. Berger,</w:t>
       </w:r>
       <w:r>
@@ -19161,7 +19153,7 @@
       <w:r>
         <w:t xml:space="preserve"> </w:t>
       </w:r>
-      <w:hyperlink r:id="rId94">
+      <w:hyperlink r:id="rId95">
         <w:r>
           <w:rPr>
             <w:rStyle w:val="Hyperlink"/>
@@ -19170,66 +19162,9 @@
         </w:r>
       </w:hyperlink>
     </w:p>
-    <w:bookmarkEnd w:id="95"/>
-    <w:bookmarkStart w:id="97" w:name="ref-wikipedia_f_test"/>
-    <w:p>
-      <w:pPr>
-        <w:pStyle w:val="Bibliography"/>
-      </w:pPr>
-      <w:r>
-        <w:t xml:space="preserve">[11]</w:t>
-      </w:r>
-      <w:r>
-        <w:t xml:space="preserve"> </w:t>
-      </w:r>
-      <w:r>
-        <w:t xml:space="preserve">	</w:t>
-      </w:r>
-      <w:r>
-        <w:t xml:space="preserve">Wikipedia contributors,</w:t>
-      </w:r>
-      <w:r>
-        <w:t xml:space="preserve"> </w:t>
-      </w:r>
-      <w:r>
-        <w:t xml:space="preserve">“F-test —</w:t>
-      </w:r>
-      <w:r>
-        <w:t xml:space="preserve"> </w:t>
-      </w:r>
-      <w:r>
-        <w:t xml:space="preserve">Wikipedia</w:t>
-      </w:r>
-      <w:r>
-        <w:t xml:space="preserve">,</w:t>
-      </w:r>
-      <w:r>
-        <w:t xml:space="preserve"> </w:t>
-      </w:r>
-      <w:r>
-        <w:t xml:space="preserve">the free encyclopedia.”</w:t>
-      </w:r>
-      <w:r>
-        <w:t xml:space="preserve"> </w:t>
-      </w:r>
-      <w:r>
-        <w:t xml:space="preserve">2026. Available:</w:t>
-      </w:r>
-      <w:r>
-        <w:t xml:space="preserve"> </w:t>
-      </w:r>
-      <w:hyperlink r:id="rId96">
-        <w:r>
-          <w:rPr>
-            <w:rStyle w:val="Hyperlink"/>
-          </w:rPr>
-          <w:t xml:space="preserve">https://en.wikipedia.org/wiki/F-test</w:t>
-        </w:r>
-      </w:hyperlink>
-    </w:p>
+    <w:bookmarkEnd w:id="96"/>
     <w:bookmarkEnd w:id="97"/>
     <w:bookmarkEnd w:id="98"/>
-    <w:bookmarkEnd w:id="99"/>
     <w:sectPr>
       <w:footnotePr>
         <w:numRestart w:val="eachSect"/>
@@ -19456,9 +19391,6 @@
     <w:abstractNumId w:val="991"/>
   </w:num>
   <w:num w:numId="1004">
-    <w:abstractNumId w:val="991"/>
-  </w:num>
-  <w:num w:numId="1005">
     <w:abstractNumId w:val="991"/>
   </w:num>
 </w:numbering>

</xml_diff>

<commit_message>
Deploying to gh-pages from @ Morrison-Lab/sds@6ec7d27fbfe3a32d1531fb7e721ff80d6345d64f 🚀
</commit_message>
<xml_diff>
--- a/basic-statistical-methods-handout.docx
+++ b/basic-statistical-methods-handout.docx
@@ -15,7 +15,7 @@
         <w:pStyle w:val="Date"/>
       </w:pPr>
       <w:r>
-        <w:t xml:space="preserve">Last modified: 2026-10-19 00:48:10 (PDT)</w:t>
+        <w:t xml:space="preserve">Last modified: 2026-10-19 01:04:06 (PDT)</w:t>
       </w:r>
     </w:p>
     <w:bookmarkStart w:id="13" w:name="introduction"/>
@@ -3880,7 +3880,7 @@
     </w:p>
     <w:bookmarkEnd w:id="24"/>
     <w:bookmarkEnd w:id="25"/>
-    <w:bookmarkStart w:id="62" w:name="sec-two-group-continuous"/>
+    <w:bookmarkStart w:id="63" w:name="sec-two-group-continuous"/>
     <w:p>
       <w:pPr>
         <w:pStyle w:val="Heading2"/>
@@ -4179,7 +4179,7 @@
       </w:r>
     </w:p>
     <w:bookmarkEnd w:id="31"/>
-    <w:bookmarkStart w:id="38" w:name="sec-one-sample-t-test"/>
+    <w:bookmarkStart w:id="39" w:name="sec-one-sample-t-test"/>
     <w:p>
       <w:pPr>
         <w:pStyle w:val="Heading3"/>
@@ -4188,7 +4188,7 @@
         <w:t xml:space="preserve">4.2 One-sample t-test</w:t>
       </w:r>
     </w:p>
-    <w:bookmarkStart w:id="33" w:name="def-one-sample-t-test"/>
+    <w:bookmarkStart w:id="34" w:name="def-one-sample-t-test"/>
     <w:p>
       <w:pPr>
         <w:pStyle w:val="FirstParagraph"/>
@@ -4434,14 +4434,19 @@
         <w:t xml:space="preserve"> </w:t>
       </w:r>
       <w:r>
-        <w:t xml:space="preserve">uses the statistic</w:t>
-      </w:r>
-      <w:r>
-        <w:t xml:space="preserve"> </w:t>
-      </w:r>
-      <w:r>
-        <w:t xml:space="preserve">[3]</w:t>
-      </w:r>
+        <w:t xml:space="preserve">uses the</w:t>
+      </w:r>
+      <w:r>
+        <w:t xml:space="preserve"> </w:t>
+      </w:r>
+      <w:hyperlink r:id="rId32">
+        <w:r>
+          <w:rPr>
+            <w:rStyle w:val="Hyperlink"/>
+          </w:rPr>
+          <w:t xml:space="preserve">statistic</w:t>
+        </w:r>
+      </w:hyperlink>
     </w:p>
     <w:p>
       <w:pPr>
@@ -4669,7 +4674,7 @@
       <w:r>
         <w:t xml:space="preserve">distribution (</w:t>
       </w:r>
-      <w:hyperlink r:id="rId32">
+      <w:hyperlink r:id="rId33">
         <w:r>
           <w:rPr>
             <w:rStyle w:val="Hyperlink"/>
@@ -4698,8 +4703,8 @@
         <w:t xml:space="preserve">.</w:t>
       </w:r>
     </w:p>
-    <w:bookmarkEnd w:id="33"/>
-    <w:bookmarkStart w:id="34" w:name="thm-one-sample-t-null"/>
+    <w:bookmarkEnd w:id="34"/>
+    <w:bookmarkStart w:id="35" w:name="thm-one-sample-t-null"/>
     <w:p>
       <w:pPr>
         <w:pStyle w:val="BodyText"/>
@@ -5015,7 +5020,7 @@
         <w:t xml:space="preserve">distribution.</w:t>
       </w:r>
     </w:p>
-    <w:bookmarkEnd w:id="34"/>
+    <w:bookmarkEnd w:id="35"/>
     <w:p>
       <w:pPr>
         <w:pStyle w:val="BodyText"/>
@@ -5417,7 +5422,7 @@
       <w:r>
         <w:t xml:space="preserve"> </w:t>
       </w:r>
-      <w:hyperlink r:id="rId32">
+      <w:hyperlink r:id="rId33">
         <w:r>
           <w:rPr>
             <w:rStyle w:val="Hyperlink"/>
@@ -6064,7 +6069,7 @@
         </m:oMath>
       </m:oMathPara>
     </w:p>
-    <w:bookmarkStart w:id="37" w:name="rem-t-statistic-nongaussian"/>
+    <w:bookmarkStart w:id="38" w:name="rem-t-statistic-nongaussian"/>
     <w:p>
       <w:pPr>
         <w:pStyle w:val="FirstParagraph"/>
@@ -6125,7 +6130,7 @@
       <w:r>
         <w:t xml:space="preserve"> </w:t>
       </w:r>
-      <w:hyperlink r:id="rId35">
+      <w:hyperlink r:id="rId36">
         <w:r>
           <w:rPr>
             <w:rStyle w:val="Hyperlink"/>
@@ -6180,7 +6185,7 @@
       <w:r>
         <w:t xml:space="preserve">(</w:t>
       </w:r>
-      <w:hyperlink r:id="rId36">
+      <w:hyperlink r:id="rId37">
         <w:r>
           <w:rPr>
             <w:rStyle w:val="Hyperlink"/>
@@ -6192,9 +6197,9 @@
         <w:t xml:space="preserve">).</w:t>
       </w:r>
     </w:p>
-    <w:bookmarkEnd w:id="37"/>
     <w:bookmarkEnd w:id="38"/>
-    <w:bookmarkStart w:id="41" w:name="sec-paired-t-test"/>
+    <w:bookmarkEnd w:id="39"/>
+    <w:bookmarkStart w:id="42" w:name="sec-paired-t-test"/>
     <w:p>
       <w:pPr>
         <w:pStyle w:val="Heading3"/>
@@ -6203,7 +6208,7 @@
         <w:t xml:space="preserve">4.3 Paired t-test</w:t>
       </w:r>
     </w:p>
-    <w:bookmarkStart w:id="39" w:name="def-paired-t-test"/>
+    <w:bookmarkStart w:id="40" w:name="def-paired-t-test"/>
     <w:p>
       <w:pPr>
         <w:pStyle w:val="FirstParagraph"/>
@@ -6746,8 +6751,8 @@
         <w:t xml:space="preserve">.</w:t>
       </w:r>
     </w:p>
-    <w:bookmarkEnd w:id="39"/>
-    <w:bookmarkStart w:id="40" w:name="exm-hers-paired"/>
+    <w:bookmarkEnd w:id="40"/>
+    <w:bookmarkStart w:id="41" w:name="exm-hers-paired"/>
     <w:p>
       <w:pPr>
         <w:pStyle w:val="BodyText"/>
@@ -7588,9 +7593,9 @@
         <w:t xml:space="preserve">and the p-value is far below 0.05.</w:t>
       </w:r>
     </w:p>
-    <w:bookmarkEnd w:id="40"/>
     <w:bookmarkEnd w:id="41"/>
-    <w:bookmarkStart w:id="57" w:name="sec-two-sample-t-test"/>
+    <w:bookmarkEnd w:id="42"/>
+    <w:bookmarkStart w:id="58" w:name="sec-two-sample-t-test"/>
     <w:p>
       <w:pPr>
         <w:pStyle w:val="Heading3"/>
@@ -7599,7 +7604,7 @@
         <w:t xml:space="preserve">4.4 Two-sample t-tests</w:t>
       </w:r>
     </w:p>
-    <w:bookmarkStart w:id="42" w:name="def-two-sample-t-test"/>
+    <w:bookmarkStart w:id="43" w:name="def-two-sample-t-test"/>
     <w:p>
       <w:pPr>
         <w:pStyle w:val="FirstParagraph"/>
@@ -7918,14 +7923,19 @@
         <w:t xml:space="preserve"> </w:t>
       </w:r>
       <w:r>
-        <w:t xml:space="preserve">uses the statistic</w:t>
-      </w:r>
-      <w:r>
-        <w:t xml:space="preserve"> </w:t>
-      </w:r>
-      <w:r>
-        <w:t xml:space="preserve">[5]</w:t>
-      </w:r>
+        <w:t xml:space="preserve">uses the</w:t>
+      </w:r>
+      <w:r>
+        <w:t xml:space="preserve"> </w:t>
+      </w:r>
+      <w:hyperlink r:id="rId32">
+        <w:r>
+          <w:rPr>
+            <w:rStyle w:val="Hyperlink"/>
+          </w:rPr>
+          <w:t xml:space="preserve">statistic</w:t>
+        </w:r>
+      </w:hyperlink>
     </w:p>
     <w:p>
       <w:pPr>
@@ -8580,7 +8590,7 @@
       <w:r>
         <w:t xml:space="preserve">distribution (</w:t>
       </w:r>
-      <w:hyperlink r:id="rId32">
+      <w:hyperlink r:id="rId33">
         <w:r>
           <w:rPr>
             <w:rStyle w:val="Hyperlink"/>
@@ -8609,8 +8619,8 @@
         <w:t xml:space="preserve">.</w:t>
       </w:r>
     </w:p>
-    <w:bookmarkEnd w:id="42"/>
-    <w:bookmarkStart w:id="44" w:name="rem-welch-test-properties"/>
+    <w:bookmarkEnd w:id="43"/>
+    <w:bookmarkStart w:id="45" w:name="rem-welch-test-properties"/>
     <w:p>
       <w:pPr>
         <w:pStyle w:val="BodyText"/>
@@ -8716,7 +8726,7 @@
       <w:r>
         <w:t xml:space="preserve"> </w:t>
       </w:r>
-      <w:hyperlink r:id="rId43">
+      <w:hyperlink r:id="rId44">
         <w:r>
           <w:rPr>
             <w:rStyle w:val="Hyperlink"/>
@@ -8746,8 +8756,8 @@
         <w:t xml:space="preserve">.</w:t>
       </w:r>
     </w:p>
-    <w:bookmarkEnd w:id="44"/>
-    <w:bookmarkStart w:id="49" w:name="exm-hers-ttest"/>
+    <w:bookmarkEnd w:id="45"/>
+    <w:bookmarkStart w:id="50" w:name="exm-hers-ttest"/>
     <w:p>
       <w:pPr>
         <w:pStyle w:val="BodyText"/>
@@ -8993,7 +9003,7 @@
       <w:tr>
         <w:tc>
           <w:tcPr/>
-          <w:bookmarkStart w:id="48" w:name="fig-hers-boxplot"/>
+          <w:bookmarkStart w:id="49" w:name="fig-hers-boxplot"/>
           <w:p>
             <w:pPr>
               <w:pStyle w:val="SourceCode"/>
@@ -9240,18 +9250,18 @@
                 <wp:inline>
                   <wp:extent cx="4620126" cy="3696101"/>
                   <wp:effectExtent b="0" l="0" r="0" t="0"/>
-                  <wp:docPr descr="" title="" id="46" name="Picture"/>
+                  <wp:docPr descr="" title="" id="47" name="Picture"/>
                   <a:graphic>
                     <a:graphicData uri="http://schemas.openxmlformats.org/drawingml/2006/picture">
                       <pic:pic>
                         <pic:nvPicPr>
-                          <pic:cNvPr descr="basic-statistical-methods_files/figure-docx/unnamed-chunk-4-1.png" id="47" name="Picture"/>
+                          <pic:cNvPr descr="basic-statistical-methods_files/figure-docx/unnamed-chunk-4-1.png" id="48" name="Picture"/>
                           <pic:cNvPicPr>
                             <a:picLocks noChangeArrowheads="1" noChangeAspect="1"/>
                           </pic:cNvPicPr>
                         </pic:nvPicPr>
                         <pic:blipFill>
-                          <a:blip r:embed="rId45"/>
+                          <a:blip r:embed="rId46"/>
                           <a:stretch>
                             <a:fillRect/>
                           </a:stretch>
@@ -9291,7 +9301,7 @@
               <w:t xml:space="preserve">Figure 1: Baseline fasting glucose by treatment group in HERS</w:t>
             </w:r>
           </w:p>
-          <w:bookmarkEnd w:id="48"/>
+          <w:bookmarkEnd w:id="49"/>
         </w:tc>
       </w:tr>
     </w:tbl>
@@ -10269,8 +10279,8 @@
         <w:t xml:space="preserve">so the groups’ baseline sample means differ only by chance.</w:t>
       </w:r>
     </w:p>
-    <w:bookmarkEnd w:id="49"/>
-    <w:bookmarkStart w:id="50" w:name="def-pooled-variance"/>
+    <w:bookmarkEnd w:id="50"/>
+    <w:bookmarkStart w:id="51" w:name="def-pooled-variance"/>
     <w:p>
       <w:pPr>
         <w:pStyle w:val="BodyText"/>
@@ -10408,12 +10418,6 @@
       </w:r>
       <w:r>
         <w:t xml:space="preserve">is</w:t>
-      </w:r>
-      <w:r>
-        <w:t xml:space="preserve"> </w:t>
-      </w:r>
-      <w:r>
-        <w:t xml:space="preserve">[6]</w:t>
       </w:r>
     </w:p>
     <w:p>
@@ -10641,8 +10645,8 @@
         <w:t xml:space="preserve">.</w:t>
       </w:r>
     </w:p>
-    <w:bookmarkEnd w:id="50"/>
-    <w:bookmarkStart w:id="51" w:name="exm-pooled-variance"/>
+    <w:bookmarkEnd w:id="51"/>
+    <w:bookmarkStart w:id="52" w:name="exm-pooled-variance"/>
     <w:p>
       <w:pPr>
         <w:pStyle w:val="BodyText"/>
@@ -11058,8 +11062,8 @@
         <w:t xml:space="preserve">, whose sample is larger.</w:t>
       </w:r>
     </w:p>
-    <w:bookmarkEnd w:id="51"/>
-    <w:bookmarkStart w:id="52" w:name="rem-pooled-variance-estimates"/>
+    <w:bookmarkEnd w:id="52"/>
+    <w:bookmarkStart w:id="53" w:name="rem-pooled-variance-estimates"/>
     <w:p>
       <w:pPr>
         <w:pStyle w:val="BodyText"/>
@@ -11104,8 +11108,8 @@
         <w:t xml:space="preserve">the pooled variance estimates it.</w:t>
       </w:r>
     </w:p>
-    <w:bookmarkEnd w:id="52"/>
-    <w:bookmarkStart w:id="53" w:name="def-pooled-t-test"/>
+    <w:bookmarkEnd w:id="53"/>
+    <w:bookmarkStart w:id="54" w:name="def-pooled-t-test"/>
     <w:p>
       <w:pPr>
         <w:pStyle w:val="BodyText"/>
@@ -11617,8 +11621,8 @@
         <w:t xml:space="preserve">.</w:t>
       </w:r>
     </w:p>
-    <w:bookmarkEnd w:id="53"/>
-    <w:bookmarkStart w:id="54" w:name="thm-pooled-t-null"/>
+    <w:bookmarkEnd w:id="54"/>
+    <w:bookmarkStart w:id="55" w:name="thm-pooled-t-null"/>
     <w:p>
       <w:pPr>
         <w:pStyle w:val="BodyText"/>
@@ -11777,8 +11781,8 @@
         <w:t xml:space="preserve">.</w:t>
       </w:r>
     </w:p>
-    <w:bookmarkEnd w:id="54"/>
-    <w:bookmarkStart w:id="55" w:name="rem-pooled-t-equal-variances"/>
+    <w:bookmarkEnd w:id="55"/>
+    <w:bookmarkStart w:id="56" w:name="rem-pooled-t-equal-variances"/>
     <w:p>
       <w:pPr>
         <w:pStyle w:val="BodyText"/>
@@ -11831,8 +11835,8 @@
         <w:t xml:space="preserve">so these notes use Welch’s test by default.</w:t>
       </w:r>
     </w:p>
-    <w:bookmarkEnd w:id="55"/>
-    <w:bookmarkStart w:id="56" w:name="exm-hers-pooled-ttest"/>
+    <w:bookmarkEnd w:id="56"/>
+    <w:bookmarkStart w:id="57" w:name="exm-hers-pooled-ttest"/>
     <w:p>
       <w:pPr>
         <w:pStyle w:val="BodyText"/>
@@ -12035,7 +12039,7 @@
         <w:t xml:space="preserve">#&gt;   111.854   112.449</w:t>
       </w:r>
     </w:p>
-    <w:bookmarkEnd w:id="56"/>
+    <w:bookmarkEnd w:id="57"/>
     <w:p>
       <w:pPr>
         <w:pStyle w:val="Compact"/>
@@ -12090,8 +12094,8 @@
         <w:t xml:space="preserve">covers normal-theory methods for paired samples.</w:t>
       </w:r>
     </w:p>
-    <w:bookmarkEnd w:id="57"/>
-    <w:bookmarkStart w:id="61" w:name="sec-CI-diff-means"/>
+    <w:bookmarkEnd w:id="58"/>
+    <w:bookmarkStart w:id="62" w:name="sec-CI-diff-means"/>
     <w:p>
       <w:pPr>
         <w:pStyle w:val="Heading3"/>
@@ -12100,7 +12104,7 @@
         <w:t xml:space="preserve">4.5 Confidence intervals for the difference in means</w:t>
       </w:r>
     </w:p>
-    <w:bookmarkStart w:id="59" w:name="def-ci-diff-means"/>
+    <w:bookmarkStart w:id="60" w:name="def-ci-diff-means"/>
     <w:p>
       <w:pPr>
         <w:pStyle w:val="FirstParagraph"/>
@@ -12615,7 +12619,7 @@
       <w:r>
         <w:t xml:space="preserve"> </w:t>
       </w:r>
-      <w:hyperlink r:id="rId58">
+      <w:hyperlink r:id="rId59">
         <w:r>
           <w:rPr>
             <w:rStyle w:val="Hyperlink"/>
@@ -12627,8 +12631,8 @@
         <w:t xml:space="preserve">.</w:t>
       </w:r>
     </w:p>
-    <w:bookmarkEnd w:id="59"/>
-    <w:bookmarkStart w:id="60" w:name="exm-hers-diff-means-ci"/>
+    <w:bookmarkEnd w:id="60"/>
+    <w:bookmarkStart w:id="61" w:name="exm-hers-diff-means-ci"/>
     <w:p>
       <w:pPr>
         <w:pStyle w:val="BodyText"/>
@@ -12945,7 +12949,7 @@
         <w:t xml:space="preserve">It contains 0, consistent with the large p-value there.</w:t>
       </w:r>
     </w:p>
-    <w:bookmarkEnd w:id="60"/>
+    <w:bookmarkEnd w:id="61"/>
     <w:p>
       <w:pPr>
         <w:pStyle w:val="BodyText"/>
@@ -12960,9 +12964,9 @@
         <w:t xml:space="preserve">covers confidence intervals for the difference of two means.</w:t>
       </w:r>
     </w:p>
-    <w:bookmarkEnd w:id="61"/>
     <w:bookmarkEnd w:id="62"/>
-    <w:bookmarkStart w:id="76" w:name="sec-anova"/>
+    <w:bookmarkEnd w:id="63"/>
+    <w:bookmarkStart w:id="77" w:name="sec-anova"/>
     <w:p>
       <w:pPr>
         <w:pStyle w:val="Heading2"/>
@@ -12971,7 +12975,7 @@
         <w:t xml:space="preserve">5 One-way analysis of variance</w:t>
       </w:r>
     </w:p>
-    <w:bookmarkStart w:id="63" w:name="def-ss-between"/>
+    <w:bookmarkStart w:id="64" w:name="def-ss-between"/>
     <w:p>
       <w:pPr>
         <w:pStyle w:val="FirstParagraph"/>
@@ -13476,8 +13480,8 @@
         <w:t xml:space="preserve">.</w:t>
       </w:r>
     </w:p>
-    <w:bookmarkEnd w:id="63"/>
-    <w:bookmarkStart w:id="64" w:name="exm-ss-between"/>
+    <w:bookmarkEnd w:id="64"/>
+    <w:bookmarkStart w:id="65" w:name="exm-ss-between"/>
     <w:p>
       <w:pPr>
         <w:pStyle w:val="BodyText"/>
@@ -13923,8 +13927,8 @@
         </m:oMath>
       </m:oMathPara>
     </w:p>
-    <w:bookmarkEnd w:id="64"/>
-    <w:bookmarkStart w:id="65" w:name="def-ss-within"/>
+    <w:bookmarkEnd w:id="65"/>
+    <w:bookmarkStart w:id="66" w:name="def-ss-within"/>
     <w:p>
       <w:pPr>
         <w:pStyle w:val="FirstParagraph"/>
@@ -14181,8 +14185,8 @@
         <w:t xml:space="preserve">.</w:t>
       </w:r>
     </w:p>
-    <w:bookmarkEnd w:id="65"/>
-    <w:bookmarkStart w:id="66" w:name="exm-ss-within"/>
+    <w:bookmarkEnd w:id="66"/>
+    <w:bookmarkStart w:id="67" w:name="exm-ss-within"/>
     <w:p>
       <w:pPr>
         <w:pStyle w:val="BodyText"/>
@@ -14596,8 +14600,8 @@
         </m:oMath>
       </m:oMathPara>
     </w:p>
-    <w:bookmarkEnd w:id="66"/>
-    <w:bookmarkStart w:id="67" w:name="def-mean-squares"/>
+    <w:bookmarkEnd w:id="67"/>
+    <w:bookmarkStart w:id="68" w:name="def-mean-squares"/>
     <w:p>
       <w:pPr>
         <w:pStyle w:val="FirstParagraph"/>
@@ -14906,8 +14910,8 @@
         <w:t xml:space="preserve">estimates it.</w:t>
       </w:r>
     </w:p>
-    <w:bookmarkEnd w:id="67"/>
-    <w:bookmarkStart w:id="68" w:name="exm-mean-squares"/>
+    <w:bookmarkEnd w:id="68"/>
+    <w:bookmarkStart w:id="69" w:name="exm-mean-squares"/>
     <w:p>
       <w:pPr>
         <w:pStyle w:val="BodyText"/>
@@ -15139,8 +15143,8 @@
         </m:oMath>
       </m:oMathPara>
     </w:p>
-    <w:bookmarkEnd w:id="68"/>
-    <w:bookmarkStart w:id="70" w:name="def-one-way-anova"/>
+    <w:bookmarkEnd w:id="69"/>
+    <w:bookmarkStart w:id="71" w:name="def-one-way-anova"/>
     <w:p>
       <w:pPr>
         <w:pStyle w:val="FirstParagraph"/>
@@ -15368,19 +15372,24 @@
         <w:t xml:space="preserve"> </w:t>
       </w:r>
       <w:r>
-        <w:t xml:space="preserve">uses the statistic</w:t>
-      </w:r>
+        <w:t xml:space="preserve">uses the</w:t>
+      </w:r>
+      <w:r>
+        <w:t xml:space="preserve"> </w:t>
+      </w:r>
+      <w:hyperlink r:id="rId32">
+        <w:r>
+          <w:rPr>
+            <w:rStyle w:val="Hyperlink"/>
+          </w:rPr>
+          <w:t xml:space="preserve">statistic</w:t>
+        </w:r>
+      </w:hyperlink>
       <w:r>
         <w:t xml:space="preserve"> </w:t>
       </w:r>
       <w:r>
         <w:t xml:space="preserve">[9]</w:t>
-      </w:r>
-      <w:r>
-        <w:t xml:space="preserve"> </w:t>
-      </w:r>
-      <w:r>
-        <w:t xml:space="preserve">[10]</w:t>
       </w:r>
     </w:p>
     <w:p>
@@ -15614,7 +15623,7 @@
       <w:r>
         <w:t xml:space="preserve">distribution (</w:t>
       </w:r>
-      <w:hyperlink r:id="rId69">
+      <w:hyperlink r:id="rId70">
         <w:r>
           <w:rPr>
             <w:rStyle w:val="Hyperlink"/>
@@ -15637,14 +15646,14 @@
         <w:t xml:space="preserve"> </w:t>
       </w:r>
       <w:r>
-        <w:t xml:space="preserve">Wikipedia contributors [9]</w:t>
+        <w:t xml:space="preserve">Wikipedia contributors [10]</w:t>
       </w:r>
       <w:r>
         <w:t xml:space="preserve">.</w:t>
       </w:r>
     </w:p>
-    <w:bookmarkEnd w:id="70"/>
-    <w:bookmarkStart w:id="71" w:name="rem-f-statistic-size"/>
+    <w:bookmarkEnd w:id="71"/>
+    <w:bookmarkStart w:id="72" w:name="rem-f-statistic-size"/>
     <w:p>
       <w:pPr>
         <w:pStyle w:val="BodyText"/>
@@ -15763,8 +15772,8 @@
         </m:oMath>
       </m:oMathPara>
     </w:p>
-    <w:bookmarkEnd w:id="71"/>
-    <w:bookmarkStart w:id="72" w:name="thm-anova-null"/>
+    <w:bookmarkEnd w:id="72"/>
+    <w:bookmarkStart w:id="73" w:name="thm-anova-null"/>
     <w:p>
       <w:pPr>
         <w:pStyle w:val="FirstParagraph"/>
@@ -16072,8 +16081,8 @@
         <w:t xml:space="preserve">.</w:t>
       </w:r>
     </w:p>
-    <w:bookmarkEnd w:id="72"/>
-    <w:bookmarkStart w:id="73" w:name="exm-hers-anova"/>
+    <w:bookmarkEnd w:id="73"/>
+    <w:bookmarkStart w:id="74" w:name="exm-hers-anova"/>
     <w:p>
       <w:pPr>
         <w:pStyle w:val="BodyText"/>
@@ -17581,8 +17590,8 @@
         <w:t xml:space="preserve">population mean fasting glucose differs among the three race/ethnicity groups.</w:t>
       </w:r>
     </w:p>
-    <w:bookmarkEnd w:id="73"/>
-    <w:bookmarkStart w:id="74" w:name="rem-hers-anova-variances"/>
+    <w:bookmarkEnd w:id="74"/>
+    <w:bookmarkStart w:id="75" w:name="rem-hers-anova-variances"/>
     <w:p>
       <w:pPr>
         <w:pStyle w:val="BodyText"/>
@@ -17749,7 +17758,7 @@
         <w:t xml:space="preserve">#&gt; F = 12.49, num df = 2.0, denom df = 185.7, p-value = 8.17e-06</w:t>
       </w:r>
     </w:p>
-    <w:bookmarkEnd w:id="74"/>
+    <w:bookmarkEnd w:id="75"/>
     <w:p>
       <w:pPr>
         <w:pStyle w:val="FirstParagraph"/>
@@ -17781,7 +17790,7 @@
       <w:r>
         <w:t xml:space="preserve">(</w:t>
       </w:r>
-      <w:hyperlink r:id="rId75">
+      <w:hyperlink r:id="rId76">
         <w:r>
           <w:rPr>
             <w:rStyle w:val="Hyperlink"/>
@@ -18592,8 +18601,8 @@
         <w:t xml:space="preserve">covers the one-way layout.</w:t>
       </w:r>
     </w:p>
-    <w:bookmarkEnd w:id="76"/>
-    <w:bookmarkStart w:id="98" w:name="references"/>
+    <w:bookmarkEnd w:id="77"/>
+    <w:bookmarkStart w:id="99" w:name="references"/>
     <w:p>
       <w:pPr>
         <w:pStyle w:val="Heading2"/>
@@ -18602,8 +18611,8 @@
         <w:t xml:space="preserve">References</w:t>
       </w:r>
     </w:p>
-    <w:bookmarkStart w:id="97" w:name="refs"/>
-    <w:bookmarkStart w:id="78" w:name="ref-vittinghoff2e"/>
+    <w:bookmarkStart w:id="98" w:name="refs"/>
+    <w:bookmarkStart w:id="79" w:name="ref-vittinghoff2e"/>
     <w:p>
       <w:pPr>
         <w:pStyle w:val="Bibliography"/>
@@ -18636,7 +18645,7 @@
       <w:r>
         <w:t xml:space="preserve"> </w:t>
       </w:r>
-      <w:hyperlink r:id="rId77">
+      <w:hyperlink r:id="rId78">
         <w:r>
           <w:rPr>
             <w:rStyle w:val="Hyperlink"/>
@@ -18648,8 +18657,8 @@
         <w:t xml:space="preserve">.</w:t>
       </w:r>
     </w:p>
-    <w:bookmarkEnd w:id="78"/>
-    <w:bookmarkStart w:id="80" w:name="ref-HulleyStephen1998RToE"/>
+    <w:bookmarkEnd w:id="79"/>
+    <w:bookmarkStart w:id="81" w:name="ref-HulleyStephen1998RToE"/>
     <w:p>
       <w:pPr>
         <w:pStyle w:val="Bibliography"/>
@@ -18701,7 +18710,7 @@
       <w:r>
         <w:t xml:space="preserve"> </w:t>
       </w:r>
-      <w:hyperlink r:id="rId79">
+      <w:hyperlink r:id="rId80">
         <w:r>
           <w:rPr>
             <w:rStyle w:val="Hyperlink"/>
@@ -18713,8 +18722,8 @@
         <w:t xml:space="preserve">.</w:t>
       </w:r>
     </w:p>
-    <w:bookmarkEnd w:id="80"/>
-    <w:bookmarkStart w:id="82" w:name="ref-wikipedia_students_t_test"/>
+    <w:bookmarkEnd w:id="81"/>
+    <w:bookmarkStart w:id="83" w:name="ref-wikipedia_students_t_test"/>
     <w:p>
       <w:pPr>
         <w:pStyle w:val="Bibliography"/>
@@ -18761,7 +18770,7 @@
       <w:r>
         <w:t xml:space="preserve"> </w:t>
       </w:r>
-      <w:hyperlink r:id="rId81">
+      <w:hyperlink r:id="rId82">
         <w:r>
           <w:rPr>
             <w:rStyle w:val="Hyperlink"/>
@@ -18770,8 +18779,8 @@
         </w:r>
       </w:hyperlink>
     </w:p>
-    <w:bookmarkEnd w:id="82"/>
-    <w:bookmarkStart w:id="83" w:name="ref-hoggtanis2015"/>
+    <w:bookmarkEnd w:id="83"/>
+    <w:bookmarkStart w:id="84" w:name="ref-hoggtanis2015"/>
     <w:p>
       <w:pPr>
         <w:pStyle w:val="Bibliography"/>
@@ -18802,8 +18811,8 @@
         <w:t xml:space="preserve">, Tenth edition. Boston: Pearson, 2019.</w:t>
       </w:r>
     </w:p>
-    <w:bookmarkEnd w:id="83"/>
-    <w:bookmarkStart w:id="85" w:name="ref-wikipedia_welchs_t_test"/>
+    <w:bookmarkEnd w:id="84"/>
+    <w:bookmarkStart w:id="86" w:name="ref-wikipedia_welchs_t_test"/>
     <w:p>
       <w:pPr>
         <w:pStyle w:val="Bibliography"/>
@@ -18850,7 +18859,7 @@
       <w:r>
         <w:t xml:space="preserve"> </w:t>
       </w:r>
-      <w:hyperlink r:id="rId84">
+      <w:hyperlink r:id="rId85">
         <w:r>
           <w:rPr>
             <w:rStyle w:val="Hyperlink"/>
@@ -18859,8 +18868,8 @@
         </w:r>
       </w:hyperlink>
     </w:p>
-    <w:bookmarkEnd w:id="85"/>
-    <w:bookmarkStart w:id="87" w:name="ref-wikipedia_pooled_variance"/>
+    <w:bookmarkEnd w:id="86"/>
+    <w:bookmarkStart w:id="88" w:name="ref-wikipedia_pooled_variance"/>
     <w:p>
       <w:pPr>
         <w:pStyle w:val="Bibliography"/>
@@ -18907,7 +18916,7 @@
       <w:r>
         <w:t xml:space="preserve"> </w:t>
       </w:r>
-      <w:hyperlink r:id="rId86">
+      <w:hyperlink r:id="rId87">
         <w:r>
           <w:rPr>
             <w:rStyle w:val="Hyperlink"/>
@@ -18916,8 +18925,8 @@
         </w:r>
       </w:hyperlink>
     </w:p>
-    <w:bookmarkEnd w:id="87"/>
-    <w:bookmarkStart w:id="88" w:name="ref-rice2007mathematical"/>
+    <w:bookmarkEnd w:id="88"/>
+    <w:bookmarkStart w:id="89" w:name="ref-rice2007mathematical"/>
     <w:p>
       <w:pPr>
         <w:pStyle w:val="Bibliography"/>
@@ -18948,8 +18957,8 @@
         <w:t xml:space="preserve">, 3rd ed. Belmont, CA: Cengage Learning, 2007.</w:t>
       </w:r>
     </w:p>
-    <w:bookmarkEnd w:id="88"/>
-    <w:bookmarkStart w:id="90" w:name="Xb77271a8c2834a333d91550be0fe1b0a3afc5b3"/>
+    <w:bookmarkEnd w:id="89"/>
+    <w:bookmarkStart w:id="91" w:name="Xb77271a8c2834a333d91550be0fe1b0a3afc5b3"/>
     <w:p>
       <w:pPr>
         <w:pStyle w:val="Bibliography"/>
@@ -18996,7 +19005,7 @@
       <w:r>
         <w:t xml:space="preserve"> </w:t>
       </w:r>
-      <w:hyperlink r:id="rId89">
+      <w:hyperlink r:id="rId90">
         <w:r>
           <w:rPr>
             <w:rStyle w:val="Hyperlink"/>
@@ -19005,8 +19014,8 @@
         </w:r>
       </w:hyperlink>
     </w:p>
-    <w:bookmarkEnd w:id="90"/>
-    <w:bookmarkStart w:id="92" w:name="ref-wikipedia_analysis_of_variance"/>
+    <w:bookmarkEnd w:id="91"/>
+    <w:bookmarkStart w:id="93" w:name="ref-wikipedia_f_test"/>
     <w:p>
       <w:pPr>
         <w:pStyle w:val="Bibliography"/>
@@ -19027,6 +19036,63 @@
         <w:t xml:space="preserve"> </w:t>
       </w:r>
       <w:r>
+        <w:t xml:space="preserve">“F-test —</w:t>
+      </w:r>
+      <w:r>
+        <w:t xml:space="preserve"> </w:t>
+      </w:r>
+      <w:r>
+        <w:t xml:space="preserve">Wikipedia</w:t>
+      </w:r>
+      <w:r>
+        <w:t xml:space="preserve">,</w:t>
+      </w:r>
+      <w:r>
+        <w:t xml:space="preserve"> </w:t>
+      </w:r>
+      <w:r>
+        <w:t xml:space="preserve">the free encyclopedia.”</w:t>
+      </w:r>
+      <w:r>
+        <w:t xml:space="preserve"> </w:t>
+      </w:r>
+      <w:r>
+        <w:t xml:space="preserve">2026. Available:</w:t>
+      </w:r>
+      <w:r>
+        <w:t xml:space="preserve"> </w:t>
+      </w:r>
+      <w:hyperlink r:id="rId92">
+        <w:r>
+          <w:rPr>
+            <w:rStyle w:val="Hyperlink"/>
+          </w:rPr>
+          <w:t xml:space="preserve">https://en.wikipedia.org/wiki/F-test</w:t>
+        </w:r>
+      </w:hyperlink>
+    </w:p>
+    <w:bookmarkEnd w:id="93"/>
+    <w:bookmarkStart w:id="95" w:name="ref-wikipedia_analysis_of_variance"/>
+    <w:p>
+      <w:pPr>
+        <w:pStyle w:val="Bibliography"/>
+      </w:pPr>
+      <w:r>
+        <w:t xml:space="preserve">[10]</w:t>
+      </w:r>
+      <w:r>
+        <w:t xml:space="preserve"> </w:t>
+      </w:r>
+      <w:r>
+        <w:t xml:space="preserve">	</w:t>
+      </w:r>
+      <w:r>
+        <w:t xml:space="preserve">Wikipedia contributors,</w:t>
+      </w:r>
+      <w:r>
+        <w:t xml:space="preserve"> </w:t>
+      </w:r>
+      <w:r>
         <w:t xml:space="preserve">“Analysis of variance —</w:t>
       </w:r>
       <w:r>
@@ -19053,7 +19119,7 @@
       <w:r>
         <w:t xml:space="preserve"> </w:t>
       </w:r>
-      <w:hyperlink r:id="rId91">
+      <w:hyperlink r:id="rId94">
         <w:r>
           <w:rPr>
             <w:rStyle w:val="Hyperlink"/>
@@ -19062,70 +19128,13 @@
         </w:r>
       </w:hyperlink>
     </w:p>
-    <w:bookmarkEnd w:id="92"/>
-    <w:bookmarkStart w:id="94" w:name="ref-wikipedia_f_test"/>
+    <w:bookmarkEnd w:id="95"/>
+    <w:bookmarkStart w:id="97" w:name="ref-CaseBerg01"/>
     <w:p>
       <w:pPr>
         <w:pStyle w:val="Bibliography"/>
       </w:pPr>
       <w:r>
-        <w:t xml:space="preserve">[10]</w:t>
-      </w:r>
-      <w:r>
-        <w:t xml:space="preserve"> </w:t>
-      </w:r>
-      <w:r>
-        <w:t xml:space="preserve">	</w:t>
-      </w:r>
-      <w:r>
-        <w:t xml:space="preserve">Wikipedia contributors,</w:t>
-      </w:r>
-      <w:r>
-        <w:t xml:space="preserve"> </w:t>
-      </w:r>
-      <w:r>
-        <w:t xml:space="preserve">“F-test —</w:t>
-      </w:r>
-      <w:r>
-        <w:t xml:space="preserve"> </w:t>
-      </w:r>
-      <w:r>
-        <w:t xml:space="preserve">Wikipedia</w:t>
-      </w:r>
-      <w:r>
-        <w:t xml:space="preserve">,</w:t>
-      </w:r>
-      <w:r>
-        <w:t xml:space="preserve"> </w:t>
-      </w:r>
-      <w:r>
-        <w:t xml:space="preserve">the free encyclopedia.”</w:t>
-      </w:r>
-      <w:r>
-        <w:t xml:space="preserve"> </w:t>
-      </w:r>
-      <w:r>
-        <w:t xml:space="preserve">2026. Available:</w:t>
-      </w:r>
-      <w:r>
-        <w:t xml:space="preserve"> </w:t>
-      </w:r>
-      <w:hyperlink r:id="rId93">
-        <w:r>
-          <w:rPr>
-            <w:rStyle w:val="Hyperlink"/>
-          </w:rPr>
-          <w:t xml:space="preserve">https://en.wikipedia.org/wiki/F-test</w:t>
-        </w:r>
-      </w:hyperlink>
-    </w:p>
-    <w:bookmarkEnd w:id="94"/>
-    <w:bookmarkStart w:id="96" w:name="ref-CaseBerg01"/>
-    <w:p>
-      <w:pPr>
-        <w:pStyle w:val="Bibliography"/>
-      </w:pPr>
-      <w:r>
         <w:t xml:space="preserve">[11]</w:t>
       </w:r>
       <w:r>
@@ -19153,7 +19162,7 @@
       <w:r>
         <w:t xml:space="preserve"> </w:t>
       </w:r>
-      <w:hyperlink r:id="rId95">
+      <w:hyperlink r:id="rId96">
         <w:r>
           <w:rPr>
             <w:rStyle w:val="Hyperlink"/>
@@ -19162,9 +19171,9 @@
         </w:r>
       </w:hyperlink>
     </w:p>
-    <w:bookmarkEnd w:id="96"/>
     <w:bookmarkEnd w:id="97"/>
     <w:bookmarkEnd w:id="98"/>
+    <w:bookmarkEnd w:id="99"/>
     <w:sectPr>
       <w:footnotePr>
         <w:numRestart w:val="eachSect"/>

</xml_diff>

<commit_message>
Deploying to gh-pages from @ Morrison-Lab/sds@ab32cee4dacfb0d2ec7fa4f141fe77c72170750b 🚀
</commit_message>
<xml_diff>
--- a/basic-statistical-methods-handout.docx
+++ b/basic-statistical-methods-handout.docx
@@ -15,7 +15,7 @@
         <w:pStyle w:val="Date"/>
       </w:pPr>
       <w:r>
-        <w:t xml:space="preserve">Last modified: 2026-10-22 14:07:34 (PDT)</w:t>
+        <w:t xml:space="preserve">Last modified: 2026-10-22 15:19:15 (PDT)</w:t>
       </w:r>
     </w:p>
     <w:bookmarkStart w:id="13" w:name="introduction"/>
@@ -8137,7 +8137,10 @@
             </m:accPr>
             <m:e>
               <m:r>
-                <m:t>ν</m:t>
+                <m:rPr>
+                  <m:sty m:val="p"/>
+                </m:rPr>
+                <m:t>df</m:t>
               </m:r>
             </m:e>
           </m:acc>
@@ -8577,7 +8580,10 @@
               </m:accPr>
               <m:e>
                 <m:r>
-                  <m:t>ν</m:t>
+                  <m:rPr>
+                    <m:sty m:val="p"/>
+                  </m:rPr>
+                  <m:t>df</m:t>
                 </m:r>
               </m:e>
             </m:acc>
@@ -8661,7 +8667,10 @@
               </m:accPr>
               <m:e>
                 <m:r>
-                  <m:t>ν</m:t>
+                  <m:rPr>
+                    <m:sty m:val="p"/>
+                  </m:rPr>
+                  <m:t>df</m:t>
                 </m:r>
               </m:e>
             </m:acc>
@@ -12340,7 +12349,10 @@
                 </m:accPr>
                 <m:e>
                   <m:r>
-                    <m:t>ν</m:t>
+                    <m:rPr>
+                      <m:sty m:val="p"/>
+                    </m:rPr>
+                    <m:t>df</m:t>
                   </m:r>
                 </m:e>
               </m:acc>
@@ -12499,7 +12511,10 @@
               </m:accPr>
               <m:e>
                 <m:r>
-                  <m:t>ν</m:t>
+                  <m:rPr>
+                    <m:sty m:val="p"/>
+                  </m:rPr>
+                  <m:t>df</m:t>
                 </m:r>
               </m:e>
             </m:acc>
@@ -12597,7 +12612,10 @@
               </m:accPr>
               <m:e>
                 <m:r>
-                  <m:t>ν</m:t>
+                  <m:rPr>
+                    <m:sty m:val="p"/>
+                  </m:rPr>
+                  <m:t>df</m:t>
                 </m:r>
               </m:e>
             </m:acc>

</xml_diff>